<commit_message>
Revise English bank ER ARDL report
</commit_message>
<xml_diff>
--- a/Bank_ER_ARDL_Analysis_Report_EN.docx
+++ b/Bank_ER_ARDL_Analysis_Report_EN.docx
@@ -14,7 +14,7 @@
           <w:color w:val="000000"/>
           <w:sz w:val="44"/>
         </w:rPr>
-        <w:t>Bank Efficiency Ratio ARDL Model Analysis Report</w:t>
+        <w:t>Bank Efficiency Ratio ARDL Model Development Report</w:t>
       </w:r>
     </w:p>
     <w:p>
@@ -76,7 +76,7 @@
           <w:color w:val="000000"/>
           <w:sz w:val="21"/>
         </w:rPr>
-        <w:t>The ER series covers 60 quarters. Reconstructing the quarterly macroeconomic transformations, TARP dummy, estimation sample, and lag structure reproduces the final ARDL coefficients, significance levels, in sample diagnostics, and one step out of time RMSE. The model retains one lag of ER and one lag of the quarterly change in the unemployment rate.</w:t>
+        <w:t>The ER series covers 60 quarters. The model development process applies quarterly macroeconomic transformations, a TARP dummy, a defined estimation sample, and a consistent lag structure. The final ARDL specification retains one lag of ER and one lag of the quarterly change in the unemployment rate.</w:t>
       </w:r>
     </w:p>
     <w:p>
@@ -91,7 +91,7 @@
           <w:color w:val="000000"/>
           <w:sz w:val="21"/>
         </w:rPr>
-        <w:t>The macro pool contains 22 raw macroeconomic variables. The subset with the source history needed to reproduce the original sample produces three close candidates. Output gap is marginally preferred when each step selects the lowest p value or the largest BIC improvement. Unemployment enters first when variables are evaluated in source column order and the first variable below the 5 percent threshold is added. Unemployment is the preferred final variable because it is easier to interpret and its validation RMSE of 0.02693 is lower than 0.02833 for gap and 0.02810 for GDP.</w:t>
+        <w:t>The macro pool contains 22 variables. Statistical screening identifies output gap, unemployment, and GDP as the closest candidates. Output gap has a marginal in sample advantage, but unemployment is the preferred final variable because it is easier to interpret and its validation RMSE of 0.02693 is lower than 0.02833 for gap and 0.02810 for GDP.</w:t>
       </w:r>
     </w:p>
     <w:tbl>
@@ -804,7 +804,7 @@
           <w:color w:val="000000"/>
           <w:sz w:val="21"/>
         </w:rPr>
-        <w:t>The ER series was transcribed from the supplied screenshots and covers 2011Q1 to 2025Q4. Values are expressed as decimals, so 0.55 corresponds to 55 percent. The screenshot column is labeled EF. Based on its use, the confirmed interpretation, and the exact reproduction of the model, this report treats the series as ER.</w:t>
+        <w:t>The quarterly ER series covers 2011Q1 to 2025Q4. Values are expressed as decimals, so 0.55 corresponds to 55 percent. The series is used in levels because the model captures its persistence through the one quarter lag of ER.</w:t>
       </w:r>
     </w:p>
     <w:p>
@@ -1132,101 +1132,6 @@
           </w:p>
         </w:tc>
       </w:tr>
-      <w:tr>
-        <w:tc>
-          <w:tcPr>
-            <w:tcW w:type="dxa" w:w="2448"/>
-            <w:vAlign w:val="center"/>
-            <w:tcMar>
-              <w:top w:w="90" w:type="dxa"/>
-              <w:start w:w="100" w:type="dxa"/>
-              <w:bottom w:w="90" w:type="dxa"/>
-              <w:end w:w="100" w:type="dxa"/>
-            </w:tcMar>
-            <w:shd w:fill="FFFFFF"/>
-          </w:tcPr>
-          <w:p>
-            <w:pPr>
-              <w:keepNext w:val="0"/>
-              <w:widowControl/>
-              <w:spacing w:before="0" w:after="0" w:line="264" w:lineRule="auto"/>
-              <w:jc w:val="left"/>
-            </w:pPr>
-            <w:r/>
-            <w:r>
-              <w:rPr>
-                <w:rFonts w:ascii="Arial Unicode MS" w:hAnsi="Arial Unicode MS" w:eastAsia="Arial Unicode MS"/>
-                <w:b w:val="0"/>
-                <w:color w:val="000000"/>
-                <w:sz w:val="18"/>
-              </w:rPr>
-              <w:t>Term spread</w:t>
-            </w:r>
-          </w:p>
-        </w:tc>
-        <w:tc>
-          <w:tcPr>
-            <w:tcW w:type="dxa" w:w="4824"/>
-            <w:vAlign w:val="center"/>
-            <w:tcMar>
-              <w:top w:w="90" w:type="dxa"/>
-              <w:start w:w="100" w:type="dxa"/>
-              <w:bottom w:w="90" w:type="dxa"/>
-              <w:end w:w="100" w:type="dxa"/>
-            </w:tcMar>
-            <w:shd w:fill="FFFFFF"/>
-          </w:tcPr>
-          <w:p>
-            <w:pPr>
-              <w:keepNext w:val="0"/>
-              <w:widowControl/>
-              <w:spacing w:before="0" w:after="0" w:line="264" w:lineRule="auto"/>
-              <w:jc w:val="left"/>
-            </w:pPr>
-            <w:r/>
-            <w:r>
-              <w:rPr>
-                <w:rFonts w:ascii="Arial Unicode MS" w:hAnsi="Arial Unicode MS" w:eastAsia="Arial Unicode MS"/>
-                <w:b w:val="0"/>
-                <w:color w:val="000000"/>
-                <w:sz w:val="18"/>
-              </w:rPr>
-              <w:t>t10y - t2y</w:t>
-            </w:r>
-          </w:p>
-        </w:tc>
-        <w:tc>
-          <w:tcPr>
-            <w:tcW w:type="dxa" w:w="2808"/>
-            <w:vAlign w:val="center"/>
-            <w:tcMar>
-              <w:top w:w="90" w:type="dxa"/>
-              <w:start w:w="100" w:type="dxa"/>
-              <w:bottom w:w="90" w:type="dxa"/>
-              <w:end w:w="100" w:type="dxa"/>
-            </w:tcMar>
-            <w:shd w:fill="FFFFFF"/>
-          </w:tcPr>
-          <w:p>
-            <w:pPr>
-              <w:keepNext w:val="0"/>
-              <w:widowControl/>
-              <w:spacing w:before="0" w:after="0" w:line="264" w:lineRule="auto"/>
-              <w:jc w:val="center"/>
-            </w:pPr>
-            <w:r/>
-            <w:r>
-              <w:rPr>
-                <w:rFonts w:ascii="Arial Unicode MS" w:hAnsi="Arial Unicode MS" w:eastAsia="Arial Unicode MS"/>
-                <w:b w:val="0"/>
-                <w:color w:val="000000"/>
-                <w:sz w:val="18"/>
-              </w:rPr>
-              <w:t>Quarterly change in the spread</w:t>
-            </w:r>
-          </w:p>
-        </w:tc>
-      </w:tr>
     </w:tbl>
     <w:p>
       <w:pPr>
@@ -1264,7 +1169,7 @@
           <w:color w:val="000000"/>
           <w:sz w:val="21"/>
         </w:rPr>
-        <w:t>The macro pool contains 22 raw macroeconomic variables. Fifteen come from the MoreVars base pool and seven come from the expanded source. SNV_Pay_Avg is bank specific and is excluded from the macro count. The t10y minus t2y spread is a derived feature and is not counted as an additional raw variable.</w:t>
+        <w:t>The macro pool contains 22 variables. Fifteen are core macroeconomic indicators and seven are additional scenario variables. Every candidate is transformed according to its economic type before the one quarter lag is applied.</w:t>
       </w:r>
     </w:p>
     <w:tbl>
@@ -1413,7 +1318,7 @@
                 <w:color w:val="000000"/>
                 <w:sz w:val="17"/>
               </w:rPr>
-              <w:t>MoreVars base macro variables</w:t>
+              <w:t>Core macro variables</w:t>
             </w:r>
           </w:p>
         </w:tc>
@@ -1508,7 +1413,7 @@
                 <w:color w:val="000000"/>
                 <w:sz w:val="17"/>
               </w:rPr>
-              <w:t>Expanded macro variables</w:t>
+              <w:t>Additional macro variables</w:t>
             </w:r>
           </w:p>
         </w:tc>
@@ -1575,196 +1480,6 @@
           </w:p>
         </w:tc>
       </w:tr>
-      <w:tr>
-        <w:tc>
-          <w:tcPr>
-            <w:tcW w:type="dxa" w:w="2592"/>
-            <w:vAlign w:val="center"/>
-            <w:tcMar>
-              <w:top w:w="90" w:type="dxa"/>
-              <w:start w:w="100" w:type="dxa"/>
-              <w:bottom w:w="90" w:type="dxa"/>
-              <w:end w:w="100" w:type="dxa"/>
-            </w:tcMar>
-            <w:shd w:fill="FFFFFF"/>
-          </w:tcPr>
-          <w:p>
-            <w:pPr>
-              <w:keepNext w:val="0"/>
-              <w:widowControl/>
-              <w:spacing w:before="0" w:after="0" w:line="264" w:lineRule="auto"/>
-              <w:jc w:val="left"/>
-            </w:pPr>
-            <w:r/>
-            <w:r>
-              <w:rPr>
-                <w:rFonts w:ascii="Arial Unicode MS" w:hAnsi="Arial Unicode MS" w:eastAsia="Arial Unicode MS"/>
-                <w:b w:val="0"/>
-                <w:color w:val="000000"/>
-                <w:sz w:val="17"/>
-              </w:rPr>
-              <w:t>Excluded from macro pool</w:t>
-            </w:r>
-          </w:p>
-        </w:tc>
-        <w:tc>
-          <w:tcPr>
-            <w:tcW w:type="dxa" w:w="936"/>
-            <w:vAlign w:val="center"/>
-            <w:tcMar>
-              <w:top w:w="90" w:type="dxa"/>
-              <w:start w:w="100" w:type="dxa"/>
-              <w:bottom w:w="90" w:type="dxa"/>
-              <w:end w:w="100" w:type="dxa"/>
-            </w:tcMar>
-            <w:shd w:fill="FFFFFF"/>
-          </w:tcPr>
-          <w:p>
-            <w:pPr>
-              <w:keepNext w:val="0"/>
-              <w:widowControl/>
-              <w:spacing w:before="0" w:after="0" w:line="264" w:lineRule="auto"/>
-              <w:jc w:val="center"/>
-            </w:pPr>
-            <w:r/>
-            <w:r>
-              <w:rPr>
-                <w:rFonts w:ascii="Arial Unicode MS" w:hAnsi="Arial Unicode MS" w:eastAsia="Arial Unicode MS"/>
-                <w:b w:val="0"/>
-                <w:color w:val="000000"/>
-                <w:sz w:val="17"/>
-              </w:rPr>
-              <w:t>1</w:t>
-            </w:r>
-          </w:p>
-        </w:tc>
-        <w:tc>
-          <w:tcPr>
-            <w:tcW w:type="dxa" w:w="6552"/>
-            <w:vAlign w:val="center"/>
-            <w:tcMar>
-              <w:top w:w="90" w:type="dxa"/>
-              <w:start w:w="100" w:type="dxa"/>
-              <w:bottom w:w="90" w:type="dxa"/>
-              <w:end w:w="100" w:type="dxa"/>
-            </w:tcMar>
-            <w:shd w:fill="FFFFFF"/>
-          </w:tcPr>
-          <w:p>
-            <w:pPr>
-              <w:keepNext w:val="0"/>
-              <w:widowControl/>
-              <w:spacing w:before="0" w:after="0" w:line="264" w:lineRule="auto"/>
-              <w:jc w:val="left"/>
-            </w:pPr>
-            <w:r/>
-            <w:r>
-              <w:rPr>
-                <w:rFonts w:ascii="Arial Unicode MS" w:hAnsi="Arial Unicode MS" w:eastAsia="Arial Unicode MS"/>
-                <w:b w:val="0"/>
-                <w:color w:val="000000"/>
-                <w:sz w:val="17"/>
-              </w:rPr>
-              <w:t>SNV_Pay_Avg, a bank specific series</w:t>
-            </w:r>
-          </w:p>
-        </w:tc>
-      </w:tr>
-      <w:tr>
-        <w:tc>
-          <w:tcPr>
-            <w:tcW w:type="dxa" w:w="2592"/>
-            <w:vAlign w:val="center"/>
-            <w:tcMar>
-              <w:top w:w="90" w:type="dxa"/>
-              <w:start w:w="100" w:type="dxa"/>
-              <w:bottom w:w="90" w:type="dxa"/>
-              <w:end w:w="100" w:type="dxa"/>
-            </w:tcMar>
-            <w:shd w:fill="EAF2F8"/>
-          </w:tcPr>
-          <w:p>
-            <w:pPr>
-              <w:keepNext w:val="0"/>
-              <w:widowControl/>
-              <w:spacing w:before="0" w:after="0" w:line="264" w:lineRule="auto"/>
-              <w:jc w:val="left"/>
-            </w:pPr>
-            <w:r/>
-            <w:r>
-              <w:rPr>
-                <w:rFonts w:ascii="Arial Unicode MS" w:hAnsi="Arial Unicode MS" w:eastAsia="Arial Unicode MS"/>
-                <w:b w:val="0"/>
-                <w:color w:val="000000"/>
-                <w:sz w:val="17"/>
-              </w:rPr>
-              <w:t>Derived candidate feature</w:t>
-            </w:r>
-          </w:p>
-        </w:tc>
-        <w:tc>
-          <w:tcPr>
-            <w:tcW w:type="dxa" w:w="936"/>
-            <w:vAlign w:val="center"/>
-            <w:tcMar>
-              <w:top w:w="90" w:type="dxa"/>
-              <w:start w:w="100" w:type="dxa"/>
-              <w:bottom w:w="90" w:type="dxa"/>
-              <w:end w:w="100" w:type="dxa"/>
-            </w:tcMar>
-            <w:shd w:fill="EAF2F8"/>
-          </w:tcPr>
-          <w:p>
-            <w:pPr>
-              <w:keepNext w:val="0"/>
-              <w:widowControl/>
-              <w:spacing w:before="0" w:after="0" w:line="264" w:lineRule="auto"/>
-              <w:jc w:val="center"/>
-            </w:pPr>
-            <w:r/>
-            <w:r>
-              <w:rPr>
-                <w:rFonts w:ascii="Arial Unicode MS" w:hAnsi="Arial Unicode MS" w:eastAsia="Arial Unicode MS"/>
-                <w:b w:val="0"/>
-                <w:color w:val="000000"/>
-                <w:sz w:val="17"/>
-              </w:rPr>
-              <w:t>1</w:t>
-            </w:r>
-          </w:p>
-        </w:tc>
-        <w:tc>
-          <w:tcPr>
-            <w:tcW w:type="dxa" w:w="6552"/>
-            <w:vAlign w:val="center"/>
-            <w:tcMar>
-              <w:top w:w="90" w:type="dxa"/>
-              <w:start w:w="100" w:type="dxa"/>
-              <w:bottom w:w="90" w:type="dxa"/>
-              <w:end w:w="100" w:type="dxa"/>
-            </w:tcMar>
-            <w:shd w:fill="EAF2F8"/>
-          </w:tcPr>
-          <w:p>
-            <w:pPr>
-              <w:keepNext w:val="0"/>
-              <w:widowControl/>
-              <w:spacing w:before="0" w:after="0" w:line="264" w:lineRule="auto"/>
-              <w:jc w:val="left"/>
-            </w:pPr>
-            <w:r/>
-            <w:r>
-              <w:rPr>
-                <w:rFonts w:ascii="Arial Unicode MS" w:hAnsi="Arial Unicode MS" w:eastAsia="Arial Unicode MS"/>
-                <w:b w:val="0"/>
-                <w:color w:val="000000"/>
-                <w:sz w:val="17"/>
-              </w:rPr>
-              <w:t>spread = t10y - t2y</w:t>
-            </w:r>
-          </w:p>
-        </w:tc>
-      </w:tr>
     </w:tbl>
     <w:p>
       <w:pPr>
@@ -1785,7 +1500,7 @@
           <w:color w:val="000000"/>
           <w:sz w:val="21"/>
         </w:rPr>
-        <w:t>The seven expanded macro series begin in 2011Q1 in the current file. After calculating a quarterly change and one additional lag, the common usable sample begins in 2011Q3 and contains 48 observations. The exact 49 observation reproduction uses the 15 base macro variables and the spread. Screening all 22 variables is therefore reported as a separate sensitivity check.</w:t>
+        <w:t>The seven additional series begin in 2011Q1. After calculating a quarterly change and applying one lag, the common sample for all 22 candidates begins in 2011Q3 and contains 48 observations. The final unemployment model uses 49 observations because the unemployment series supports the 2011Q2 model observation.</w:t>
       </w:r>
     </w:p>
     <w:p>
@@ -1870,6 +1585,11 @@
       </w:r>
     </w:p>
     <w:p>
+      <w:r>
+        <w:br w:type="page"/>
+      </w:r>
+    </w:p>
+    <w:p>
       <w:pPr>
         <w:pStyle w:val="Heading1"/>
         <w:keepNext/>
@@ -1883,7 +1603,7 @@
           <w:color w:val="000000"/>
           <w:sz w:val="28"/>
         </w:rPr>
-        <w:t>Final ARDL Model Reproduction</w:t>
+        <w:t>Final ARDL Model</w:t>
       </w:r>
     </w:p>
     <w:p>
@@ -2669,7 +2389,7 @@
           <w:color w:val="000000"/>
           <w:sz w:val="28"/>
         </w:rPr>
-        <w:t>Forward Selection Review</w:t>
+        <w:t>Variable Screening and Model Selection</w:t>
       </w:r>
     </w:p>
     <w:p>
@@ -2684,7 +2404,7 @@
           <w:color w:val="000000"/>
           <w:sz w:val="21"/>
         </w:rPr>
-        <w:t>The exact reproduction keeps the constant, TARP dummy, and ER lag 1 as fixed terms. Candidate variables use the specified quarterly transformation and one lag. It screens the 15 base macro variables and the spread because those series contain the history needed for the original sample. The three closest candidates are shown below. Each is only slightly inside the 5 percent significance threshold, and their in sample fit is very similar.</w:t>
+        <w:t>The constant, TARP dummy, and ER lag 1 remain fixed throughout variable screening. Each of the 22 macroeconomic candidates is transformed according to its economic type and entered with one lag. The table shows the three leading candidates with full coverage of the final estimation period. Each is close to the 5 percent significance threshold, and their in sample fit is very similar.</w:t>
       </w:r>
     </w:p>
     <w:tbl>
@@ -3487,7 +3207,7 @@
           <w:color w:val="000000"/>
           <w:sz w:val="23"/>
         </w:rPr>
-        <w:t>Effect of the Selection Rule</w:t>
+        <w:t>Selection Decision</w:t>
       </w:r>
     </w:p>
     <w:p>
@@ -3502,7 +3222,7 @@
           <w:color w:val="000000"/>
           <w:sz w:val="21"/>
         </w:rPr>
-        <w:t>A standard best candidate forward selection rule chooses the variable with the lowest incremental p value at each step, so it selects d_gap(-1) first. A BIC rule also selects gap. When candidates are evaluated in source column order and the first variable with a p value below 0.05 is added, d_unemp(-1) appears before GDP and gap and enters first. After unemployment is included, the lowest conditional p value among the remaining candidates is 0.2135, so selection stops.</w:t>
+        <w:t>A standard best candidate rule selects d_gap(-1) because it has the lowest entry p value, and a BIC rule reaches the same result. The differences among gap, unemployment, and GDP are small. Unemployment is selected for the final specification because it has the lowest validation RMSE and the clearest interpretation for scenario analysis. After unemployment is included, the lowest conditional p value among the remaining candidates is 0.2135, so no additional macro variable enters at the 5 percent threshold.</w:t>
       </w:r>
     </w:p>
     <w:p>
@@ -3517,7 +3237,7 @@
           <w:color w:val="000000"/>
           <w:sz w:val="21"/>
         </w:rPr>
-        <w:t>The final model should therefore not be described as the unique automatic output of forward selection. Forward selection identifies a small group of comparable candidates. The final variable is then chosen using economic interpretation and validation performance.</w:t>
+        <w:t>The selection process therefore has two stages. Statistical screening identifies a small group of comparable candidates, and the final choice uses validation performance and economic interpretation.</w:t>
       </w:r>
     </w:p>
     <w:p>
@@ -3532,7 +3252,7 @@
           <w:color w:val="000000"/>
           <w:sz w:val="21"/>
         </w:rPr>
-        <w:t>As a sensitivity check, screening all 22 raw macro variables on a common sample reduces the estimation count to 48. On that sample, d_gap(-1) has a p value of 0.0435, dlog_gdp(-1) has a p value of 0.0456, and d_unemp(-1) has a p value of 0.0509. This screen cannot exactly reproduce the reported 49 observations or the unemployment p value of 0.0468 because the expanded series lack the 2010Q4 level needed to initialize the lag for 2011Q2.</w:t>
+        <w:t>A common sample sensitivity screen across all 22 candidates uses 48 observations. On that sample, d_gap(-1) has a p value of 0.0435, dlog_gdp(-1) has a p value of 0.0456, and d_unemp(-1) has a p value of 0.0509. The same three variables remain the leading candidates. The common sample result is used as a sensitivity check because it omits 2011Q2, which is available for the final unemployment model.</w:t>
       </w:r>
     </w:p>
     <w:p>
@@ -6597,7 +6317,7 @@
           <w:color w:val="000000"/>
           <w:sz w:val="21"/>
         </w:rPr>
-        <w:t>The final unemployment ARDL model balances statistical significance, economic interpretation, and validation error. Its results can be reproduced exactly, the specification is parsimonious, and unemployment is more useful than gap or GDP for communication and scenario analysis. Future model files should record candidate order, the entry threshold, and the use of validation RMSE so that the selection remains traceable.</w:t>
+        <w:t>The final unemployment ARDL model balances statistical significance, economic interpretation, and validation error. The specification is parsimonious, and unemployment is more useful than gap or GDP for communication and scenario analysis. Ongoing model governance should retain the candidate set, entry threshold, and validation results so that future updates remain consistent.</w:t>
       </w:r>
     </w:p>
     <w:p>
@@ -6629,7 +6349,7 @@
           <w:color w:val="000000"/>
           <w:sz w:val="21"/>
         </w:rPr>
-        <w:t>ER series  Two Excel screenshots supplied by the user covering 2011Q1 through 2025Q4.</w:t>
+        <w:t>ER series  Quarterly bank efficiency ratio observations from 2011Q1 through 2025Q4.</w:t>
       </w:r>
     </w:p>
     <w:p>
@@ -6644,7 +6364,7 @@
           <w:color w:val="000000"/>
           <w:sz w:val="21"/>
         </w:rPr>
-        <w:t>Macroeconomic variables  MoreVars quarterly data from the August 2026 Scenario Consistent Baseline vintage.</w:t>
+        <w:t>Macroeconomic variables  Quarterly macroeconomic data from the August 2026 Scenario Consistent Baseline vintage.</w:t>
       </w:r>
     </w:p>
     <w:p>
@@ -6659,22 +6379,7 @@
           <w:color w:val="000000"/>
           <w:sz w:val="21"/>
         </w:rPr>
-        <w:t>S4 forecast path  The unemployment scenario for 2026Q1 through 2028Q1 supplied in the PNFP Comp analysis.</w:t>
-      </w:r>
-    </w:p>
-    <w:p>
-      <w:pPr>
-        <w:keepNext w:val="0"/>
-        <w:widowControl/>
-        <w:spacing w:before="0" w:after="40" w:line="300" w:lineRule="auto"/>
-      </w:pPr>
-      <w:r>
-        <w:rPr>
-          <w:rFonts w:ascii="Arial Unicode MS" w:hAnsi="Arial Unicode MS" w:eastAsia="Arial Unicode MS"/>
-          <w:color w:val="000000"/>
-          <w:sz w:val="21"/>
-        </w:rPr>
-        <w:t>Original model specification  Quarterly Bank Efficiency Ratio ARDL Report screenshot supplied by the user.</w:t>
+        <w:t>S4 forecast path  Quarterly unemployment rates from 2026Q1 through 2028Q1.</w:t>
       </w:r>
     </w:p>
     <w:sectPr>

</xml_diff>

<commit_message>
Add recursive out-of-time forecast analysis
</commit_message>
<xml_diff>
--- a/Bank_ER_ARDL_Analysis_Report_EN.docx
+++ b/Bank_ER_ARDL_Analysis_Report_EN.docx
@@ -1504,6 +1504,11 @@
       </w:r>
     </w:p>
     <w:p>
+      <w:r>
+        <w:br w:type="page"/>
+      </w:r>
+    </w:p>
+    <w:p>
       <w:pPr>
         <w:pStyle w:val="Heading2"/>
         <w:keepNext/>
@@ -1581,7 +1586,7 @@
           <w:color w:val="000000"/>
           <w:sz w:val="21"/>
         </w:rPr>
-        <w:t>The nine quarters from 2023Q4 through 2025Q4 form the one step validation period.</w:t>
+        <w:t>The nine quarters from 2023Q4 through 2025Q4 form the validation period.</w:t>
       </w:r>
     </w:p>
     <w:p>
@@ -3241,6 +3246,11 @@
       </w:r>
     </w:p>
     <w:p>
+      <w:r>
+        <w:br w:type="page"/>
+      </w:r>
+    </w:p>
+    <w:p>
       <w:pPr>
         <w:keepNext w:val="0"/>
         <w:widowControl/>
@@ -3369,7 +3379,7 @@
           <w:color w:val="000000"/>
           <w:sz w:val="21"/>
         </w:rPr>
-        <w:t>The chart and table use coefficients fixed over the estimation sample, together with the observed lagged ER and macroeconomic data for each quarter. The RMSE across the nine quarters is 0.02693. The largest absolute error occurs in 2024Q2, when the model overpredicts ER by about 0.0536.</w:t>
+        <w:t>Both validation forecasts use coefficients fixed over the estimation sample and the same quarterly macroeconomic inputs. The one step forecast uses the observed lagged ER in every quarter and has an RMSE of 0.02693. The recursive forecast uses the actual 2023Q3 ER only as its starting value; beginning in 2024Q1, each forecast uses the preceding forecasted ER as its lag. Its nine quarter RMSE is 0.03114. The higher recursive error reflects the persistence of earlier ER forecast errors through the autoregressive term.</w:t>
       </w:r>
     </w:p>
     <w:p>
@@ -3382,7 +3392,7 @@
         <w:drawing>
           <wp:inline xmlns:a="http://schemas.openxmlformats.org/drawingml/2006/main" xmlns:pic="http://schemas.openxmlformats.org/drawingml/2006/picture">
             <wp:extent cx="5989320" cy="2844927"/>
-            <wp:docPr id="2" name="Picture 2" title="Validation actuals and forecasts" descr="Actual ER and one step forecasts from the final unemployment ARDL model from 2023Q4 to 2025Q4."/>
+            <wp:docPr id="2" name="Picture 2" title="Validation actuals with one step and recursive forecasts" descr="Actual ER, one step forecasts, and fully recursive forecasts from the final unemployment ARDL model from 2023Q4 to 2025Q4."/>
             <wp:cNvGraphicFramePr>
               <a:graphicFrameLocks noChangeAspect="1"/>
             </wp:cNvGraphicFramePr>
@@ -3427,7 +3437,7 @@
           <w:color w:val="666666"/>
           <w:sz w:val="18"/>
         </w:rPr>
-        <w:t>Figure 2  Actual values and one step forecasts from 2023Q4 to 2025Q4</w:t>
+        <w:t>Figure 2  Actual values with one step and recursive forecasts from 2023Q4 to 2025Q4</w:t>
       </w:r>
     </w:p>
     <w:tbl>
@@ -3446,10 +3456,12 @@
         </w:tblBorders>
       </w:tblPr>
       <w:tblGrid>
-        <w:gridCol w:w="2498"/>
-        <w:gridCol w:w="2498"/>
-        <w:gridCol w:w="2498"/>
-        <w:gridCol w:w="2498"/>
+        <w:gridCol w:w="1666"/>
+        <w:gridCol w:w="1666"/>
+        <w:gridCol w:w="1666"/>
+        <w:gridCol w:w="1666"/>
+        <w:gridCol w:w="1666"/>
+        <w:gridCol w:w="1666"/>
       </w:tblGrid>
       <w:tr>
         <w:trPr>
@@ -3457,7 +3469,7 @@
         </w:trPr>
         <w:tc>
           <w:tcPr>
-            <w:tcW w:type="dxa" w:w="2015"/>
+            <w:tcW w:type="dxa" w:w="1512"/>
             <w:vAlign w:val="center"/>
             <w:tcMar>
               <w:top w:w="90" w:type="dxa"/>
@@ -3480,7 +3492,7 @@
                 <w:rFonts w:ascii="Arial Unicode MS" w:hAnsi="Arial Unicode MS" w:eastAsia="Arial Unicode MS"/>
                 <w:b/>
                 <w:color w:val="FFFFFF"/>
-                <w:sz w:val="18"/>
+                <w:sz w:val="16"/>
               </w:rPr>
               <w:t>Quarter</w:t>
             </w:r>
@@ -3488,7 +3500,7 @@
         </w:tc>
         <w:tc>
           <w:tcPr>
-            <w:tcW w:type="dxa" w:w="2232"/>
+            <w:tcW w:type="dxa" w:w="1512"/>
             <w:vAlign w:val="center"/>
             <w:tcMar>
               <w:top w:w="90" w:type="dxa"/>
@@ -3511,7 +3523,7 @@
                 <w:rFonts w:ascii="Arial Unicode MS" w:hAnsi="Arial Unicode MS" w:eastAsia="Arial Unicode MS"/>
                 <w:b/>
                 <w:color w:val="FFFFFF"/>
-                <w:sz w:val="18"/>
+                <w:sz w:val="16"/>
               </w:rPr>
               <w:t>Actual ER</w:t>
             </w:r>
@@ -3519,7 +3531,7 @@
         </w:tc>
         <w:tc>
           <w:tcPr>
-            <w:tcW w:type="dxa" w:w="2592"/>
+            <w:tcW w:type="dxa" w:w="1728"/>
             <w:vAlign w:val="center"/>
             <w:tcMar>
               <w:top w:w="90" w:type="dxa"/>
@@ -3542,15 +3554,15 @@
                 <w:rFonts w:ascii="Arial Unicode MS" w:hAnsi="Arial Unicode MS" w:eastAsia="Arial Unicode MS"/>
                 <w:b/>
                 <w:color w:val="FFFFFF"/>
-                <w:sz w:val="18"/>
+                <w:sz w:val="16"/>
               </w:rPr>
-              <w:t>One step forecast</w:t>
+              <w:t>One step</w:t>
             </w:r>
           </w:p>
         </w:tc>
         <w:tc>
           <w:tcPr>
-            <w:tcW w:type="dxa" w:w="2376"/>
+            <w:tcW w:type="dxa" w:w="1728"/>
             <w:vAlign w:val="center"/>
             <w:tcMar>
               <w:top w:w="90" w:type="dxa"/>
@@ -3573,9 +3585,71 @@
                 <w:rFonts w:ascii="Arial Unicode MS" w:hAnsi="Arial Unicode MS" w:eastAsia="Arial Unicode MS"/>
                 <w:b/>
                 <w:color w:val="FFFFFF"/>
-                <w:sz w:val="18"/>
+                <w:sz w:val="16"/>
               </w:rPr>
-              <w:t>Forecast error</w:t>
+              <w:t>One step error</w:t>
+            </w:r>
+          </w:p>
+        </w:tc>
+        <w:tc>
+          <w:tcPr>
+            <w:tcW w:type="dxa" w:w="1728"/>
+            <w:vAlign w:val="center"/>
+            <w:tcMar>
+              <w:top w:w="90" w:type="dxa"/>
+              <w:start w:w="100" w:type="dxa"/>
+              <w:bottom w:w="90" w:type="dxa"/>
+              <w:end w:w="100" w:type="dxa"/>
+            </w:tcMar>
+            <w:shd w:fill="1F4E78"/>
+          </w:tcPr>
+          <w:p>
+            <w:pPr>
+              <w:keepNext w:val="0"/>
+              <w:widowControl/>
+              <w:spacing w:before="0" w:after="0" w:line="264" w:lineRule="auto"/>
+              <w:jc w:val="center"/>
+            </w:pPr>
+            <w:r/>
+            <w:r>
+              <w:rPr>
+                <w:rFonts w:ascii="Arial Unicode MS" w:hAnsi="Arial Unicode MS" w:eastAsia="Arial Unicode MS"/>
+                <w:b/>
+                <w:color w:val="FFFFFF"/>
+                <w:sz w:val="16"/>
+              </w:rPr>
+              <w:t>Recursive</w:t>
+            </w:r>
+          </w:p>
+        </w:tc>
+        <w:tc>
+          <w:tcPr>
+            <w:tcW w:type="dxa" w:w="1728"/>
+            <w:vAlign w:val="center"/>
+            <w:tcMar>
+              <w:top w:w="90" w:type="dxa"/>
+              <w:start w:w="100" w:type="dxa"/>
+              <w:bottom w:w="90" w:type="dxa"/>
+              <w:end w:w="100" w:type="dxa"/>
+            </w:tcMar>
+            <w:shd w:fill="1F4E78"/>
+          </w:tcPr>
+          <w:p>
+            <w:pPr>
+              <w:keepNext w:val="0"/>
+              <w:widowControl/>
+              <w:spacing w:before="0" w:after="0" w:line="264" w:lineRule="auto"/>
+              <w:jc w:val="center"/>
+            </w:pPr>
+            <w:r/>
+            <w:r>
+              <w:rPr>
+                <w:rFonts w:ascii="Arial Unicode MS" w:hAnsi="Arial Unicode MS" w:eastAsia="Arial Unicode MS"/>
+                <w:b/>
+                <w:color w:val="FFFFFF"/>
+                <w:sz w:val="16"/>
+              </w:rPr>
+              <w:t>Recursive error</w:t>
             </w:r>
           </w:p>
         </w:tc>
@@ -3583,7 +3657,7 @@
       <w:tr>
         <w:tc>
           <w:tcPr>
-            <w:tcW w:type="dxa" w:w="2015"/>
+            <w:tcW w:type="dxa" w:w="1512"/>
             <w:vAlign w:val="center"/>
             <w:tcMar>
               <w:top w:w="90" w:type="dxa"/>
@@ -3606,7 +3680,7 @@
                 <w:rFonts w:ascii="Arial Unicode MS" w:hAnsi="Arial Unicode MS" w:eastAsia="Arial Unicode MS"/>
                 <w:b w:val="0"/>
                 <w:color w:val="000000"/>
-                <w:sz w:val="18"/>
+                <w:sz w:val="16"/>
               </w:rPr>
               <w:t>2023Q4</w:t>
             </w:r>
@@ -3614,7 +3688,7 @@
         </w:tc>
         <w:tc>
           <w:tcPr>
-            <w:tcW w:type="dxa" w:w="2232"/>
+            <w:tcW w:type="dxa" w:w="1512"/>
             <w:vAlign w:val="center"/>
             <w:tcMar>
               <w:top w:w="90" w:type="dxa"/>
@@ -3637,7 +3711,7 @@
                 <w:rFonts w:ascii="Arial Unicode MS" w:hAnsi="Arial Unicode MS" w:eastAsia="Arial Unicode MS"/>
                 <w:b w:val="0"/>
                 <w:color w:val="000000"/>
-                <w:sz w:val="18"/>
+                <w:sz w:val="16"/>
               </w:rPr>
               <w:t>0.617</w:t>
             </w:r>
@@ -3645,7 +3719,7 @@
         </w:tc>
         <w:tc>
           <w:tcPr>
-            <w:tcW w:type="dxa" w:w="2592"/>
+            <w:tcW w:type="dxa" w:w="1728"/>
             <w:vAlign w:val="center"/>
             <w:tcMar>
               <w:top w:w="90" w:type="dxa"/>
@@ -3668,7 +3742,7 @@
                 <w:rFonts w:ascii="Arial Unicode MS" w:hAnsi="Arial Unicode MS" w:eastAsia="Arial Unicode MS"/>
                 <w:b w:val="0"/>
                 <w:color w:val="000000"/>
-                <w:sz w:val="18"/>
+                <w:sz w:val="16"/>
               </w:rPr>
               <w:t>0.5757</w:t>
             </w:r>
@@ -3676,7 +3750,7 @@
         </w:tc>
         <w:tc>
           <w:tcPr>
-            <w:tcW w:type="dxa" w:w="2376"/>
+            <w:tcW w:type="dxa" w:w="1728"/>
             <w:vAlign w:val="center"/>
             <w:tcMar>
               <w:top w:w="90" w:type="dxa"/>
@@ -3699,7 +3773,69 @@
                 <w:rFonts w:ascii="Arial Unicode MS" w:hAnsi="Arial Unicode MS" w:eastAsia="Arial Unicode MS"/>
                 <w:b w:val="0"/>
                 <w:color w:val="000000"/>
-                <w:sz w:val="18"/>
+                <w:sz w:val="16"/>
+              </w:rPr>
+              <w:t>+0.0413</w:t>
+            </w:r>
+          </w:p>
+        </w:tc>
+        <w:tc>
+          <w:tcPr>
+            <w:tcW w:type="dxa" w:w="1728"/>
+            <w:vAlign w:val="center"/>
+            <w:tcMar>
+              <w:top w:w="90" w:type="dxa"/>
+              <w:start w:w="100" w:type="dxa"/>
+              <w:bottom w:w="90" w:type="dxa"/>
+              <w:end w:w="100" w:type="dxa"/>
+            </w:tcMar>
+            <w:shd w:fill="FFFFFF"/>
+          </w:tcPr>
+          <w:p>
+            <w:pPr>
+              <w:keepNext w:val="0"/>
+              <w:widowControl/>
+              <w:spacing w:before="0" w:after="0" w:line="264" w:lineRule="auto"/>
+              <w:jc w:val="center"/>
+            </w:pPr>
+            <w:r/>
+            <w:r>
+              <w:rPr>
+                <w:rFonts w:ascii="Arial Unicode MS" w:hAnsi="Arial Unicode MS" w:eastAsia="Arial Unicode MS"/>
+                <w:b w:val="0"/>
+                <w:color w:val="000000"/>
+                <w:sz w:val="16"/>
+              </w:rPr>
+              <w:t>0.5757</w:t>
+            </w:r>
+          </w:p>
+        </w:tc>
+        <w:tc>
+          <w:tcPr>
+            <w:tcW w:type="dxa" w:w="1728"/>
+            <w:vAlign w:val="center"/>
+            <w:tcMar>
+              <w:top w:w="90" w:type="dxa"/>
+              <w:start w:w="100" w:type="dxa"/>
+              <w:bottom w:w="90" w:type="dxa"/>
+              <w:end w:w="100" w:type="dxa"/>
+            </w:tcMar>
+            <w:shd w:fill="FFFFFF"/>
+          </w:tcPr>
+          <w:p>
+            <w:pPr>
+              <w:keepNext w:val="0"/>
+              <w:widowControl/>
+              <w:spacing w:before="0" w:after="0" w:line="264" w:lineRule="auto"/>
+              <w:jc w:val="center"/>
+            </w:pPr>
+            <w:r/>
+            <w:r>
+              <w:rPr>
+                <w:rFonts w:ascii="Arial Unicode MS" w:hAnsi="Arial Unicode MS" w:eastAsia="Arial Unicode MS"/>
+                <w:b w:val="0"/>
+                <w:color w:val="000000"/>
+                <w:sz w:val="16"/>
               </w:rPr>
               <w:t>+0.0413</w:t>
             </w:r>
@@ -3709,7 +3845,7 @@
       <w:tr>
         <w:tc>
           <w:tcPr>
-            <w:tcW w:type="dxa" w:w="2015"/>
+            <w:tcW w:type="dxa" w:w="1512"/>
             <w:vAlign w:val="center"/>
             <w:tcMar>
               <w:top w:w="90" w:type="dxa"/>
@@ -3732,7 +3868,7 @@
                 <w:rFonts w:ascii="Arial Unicode MS" w:hAnsi="Arial Unicode MS" w:eastAsia="Arial Unicode MS"/>
                 <w:b w:val="0"/>
                 <w:color w:val="000000"/>
-                <w:sz w:val="18"/>
+                <w:sz w:val="16"/>
               </w:rPr>
               <w:t>2024Q1</w:t>
             </w:r>
@@ -3740,7 +3876,7 @@
         </w:tc>
         <w:tc>
           <w:tcPr>
-            <w:tcW w:type="dxa" w:w="2232"/>
+            <w:tcW w:type="dxa" w:w="1512"/>
             <w:vAlign w:val="center"/>
             <w:tcMar>
               <w:top w:w="90" w:type="dxa"/>
@@ -3763,7 +3899,7 @@
                 <w:rFonts w:ascii="Arial Unicode MS" w:hAnsi="Arial Unicode MS" w:eastAsia="Arial Unicode MS"/>
                 <w:b w:val="0"/>
                 <w:color w:val="000000"/>
-                <w:sz w:val="18"/>
+                <w:sz w:val="16"/>
               </w:rPr>
               <w:t>0.593</w:t>
             </w:r>
@@ -3771,7 +3907,7 @@
         </w:tc>
         <w:tc>
           <w:tcPr>
-            <w:tcW w:type="dxa" w:w="2592"/>
+            <w:tcW w:type="dxa" w:w="1728"/>
             <w:vAlign w:val="center"/>
             <w:tcMar>
               <w:top w:w="90" w:type="dxa"/>
@@ -3794,7 +3930,7 @@
                 <w:rFonts w:ascii="Arial Unicode MS" w:hAnsi="Arial Unicode MS" w:eastAsia="Arial Unicode MS"/>
                 <w:b w:val="0"/>
                 <w:color w:val="000000"/>
-                <w:sz w:val="18"/>
+                <w:sz w:val="16"/>
               </w:rPr>
               <w:t>0.6026</w:t>
             </w:r>
@@ -3802,7 +3938,7 @@
         </w:tc>
         <w:tc>
           <w:tcPr>
-            <w:tcW w:type="dxa" w:w="2376"/>
+            <w:tcW w:type="dxa" w:w="1728"/>
             <w:vAlign w:val="center"/>
             <w:tcMar>
               <w:top w:w="90" w:type="dxa"/>
@@ -3825,9 +3961,71 @@
                 <w:rFonts w:ascii="Arial Unicode MS" w:hAnsi="Arial Unicode MS" w:eastAsia="Arial Unicode MS"/>
                 <w:b w:val="0"/>
                 <w:color w:val="000000"/>
-                <w:sz w:val="18"/>
+                <w:sz w:val="16"/>
               </w:rPr>
               <w:t>-0.0096</w:t>
+            </w:r>
+          </w:p>
+        </w:tc>
+        <w:tc>
+          <w:tcPr>
+            <w:tcW w:type="dxa" w:w="1728"/>
+            <w:vAlign w:val="center"/>
+            <w:tcMar>
+              <w:top w:w="90" w:type="dxa"/>
+              <w:start w:w="100" w:type="dxa"/>
+              <w:bottom w:w="90" w:type="dxa"/>
+              <w:end w:w="100" w:type="dxa"/>
+            </w:tcMar>
+            <w:shd w:fill="EAF2F8"/>
+          </w:tcPr>
+          <w:p>
+            <w:pPr>
+              <w:keepNext w:val="0"/>
+              <w:widowControl/>
+              <w:spacing w:before="0" w:after="0" w:line="264" w:lineRule="auto"/>
+              <w:jc w:val="center"/>
+            </w:pPr>
+            <w:r/>
+            <w:r>
+              <w:rPr>
+                <w:rFonts w:ascii="Arial Unicode MS" w:hAnsi="Arial Unicode MS" w:eastAsia="Arial Unicode MS"/>
+                <w:b w:val="0"/>
+                <w:color w:val="000000"/>
+                <w:sz w:val="16"/>
+              </w:rPr>
+              <w:t>0.5731</w:t>
+            </w:r>
+          </w:p>
+        </w:tc>
+        <w:tc>
+          <w:tcPr>
+            <w:tcW w:type="dxa" w:w="1728"/>
+            <w:vAlign w:val="center"/>
+            <w:tcMar>
+              <w:top w:w="90" w:type="dxa"/>
+              <w:start w:w="100" w:type="dxa"/>
+              <w:bottom w:w="90" w:type="dxa"/>
+              <w:end w:w="100" w:type="dxa"/>
+            </w:tcMar>
+            <w:shd w:fill="EAF2F8"/>
+          </w:tcPr>
+          <w:p>
+            <w:pPr>
+              <w:keepNext w:val="0"/>
+              <w:widowControl/>
+              <w:spacing w:before="0" w:after="0" w:line="264" w:lineRule="auto"/>
+              <w:jc w:val="center"/>
+            </w:pPr>
+            <w:r/>
+            <w:r>
+              <w:rPr>
+                <w:rFonts w:ascii="Arial Unicode MS" w:hAnsi="Arial Unicode MS" w:eastAsia="Arial Unicode MS"/>
+                <w:b w:val="0"/>
+                <w:color w:val="000000"/>
+                <w:sz w:val="16"/>
+              </w:rPr>
+              <w:t>+0.0199</w:t>
             </w:r>
           </w:p>
         </w:tc>
@@ -3835,7 +4033,7 @@
       <w:tr>
         <w:tc>
           <w:tcPr>
-            <w:tcW w:type="dxa" w:w="2015"/>
+            <w:tcW w:type="dxa" w:w="1512"/>
             <w:vAlign w:val="center"/>
             <w:tcMar>
               <w:top w:w="90" w:type="dxa"/>
@@ -3858,7 +4056,7 @@
                 <w:rFonts w:ascii="Arial Unicode MS" w:hAnsi="Arial Unicode MS" w:eastAsia="Arial Unicode MS"/>
                 <w:b w:val="0"/>
                 <w:color w:val="000000"/>
-                <w:sz w:val="18"/>
+                <w:sz w:val="16"/>
               </w:rPr>
               <w:t>2024Q2</w:t>
             </w:r>
@@ -3866,7 +4064,7 @@
         </w:tc>
         <w:tc>
           <w:tcPr>
-            <w:tcW w:type="dxa" w:w="2232"/>
+            <w:tcW w:type="dxa" w:w="1512"/>
             <w:vAlign w:val="center"/>
             <w:tcMar>
               <w:top w:w="90" w:type="dxa"/>
@@ -3889,7 +4087,7 @@
                 <w:rFonts w:ascii="Arial Unicode MS" w:hAnsi="Arial Unicode MS" w:eastAsia="Arial Unicode MS"/>
                 <w:b w:val="0"/>
                 <w:color w:val="000000"/>
-                <w:sz w:val="18"/>
+                <w:sz w:val="16"/>
               </w:rPr>
               <w:t>0.531</w:t>
             </w:r>
@@ -3897,7 +4095,7 @@
         </w:tc>
         <w:tc>
           <w:tcPr>
-            <w:tcW w:type="dxa" w:w="2592"/>
+            <w:tcW w:type="dxa" w:w="1728"/>
             <w:vAlign w:val="center"/>
             <w:tcMar>
               <w:top w:w="90" w:type="dxa"/>
@@ -3920,7 +4118,7 @@
                 <w:rFonts w:ascii="Arial Unicode MS" w:hAnsi="Arial Unicode MS" w:eastAsia="Arial Unicode MS"/>
                 <w:b w:val="0"/>
                 <w:color w:val="000000"/>
-                <w:sz w:val="18"/>
+                <w:sz w:val="16"/>
               </w:rPr>
               <w:t>0.5846</w:t>
             </w:r>
@@ -3928,7 +4126,7 @@
         </w:tc>
         <w:tc>
           <w:tcPr>
-            <w:tcW w:type="dxa" w:w="2376"/>
+            <w:tcW w:type="dxa" w:w="1728"/>
             <w:vAlign w:val="center"/>
             <w:tcMar>
               <w:top w:w="90" w:type="dxa"/>
@@ -3951,9 +4149,71 @@
                 <w:rFonts w:ascii="Arial Unicode MS" w:hAnsi="Arial Unicode MS" w:eastAsia="Arial Unicode MS"/>
                 <w:b w:val="0"/>
                 <w:color w:val="000000"/>
-                <w:sz w:val="18"/>
+                <w:sz w:val="16"/>
               </w:rPr>
               <w:t>-0.0536</w:t>
+            </w:r>
+          </w:p>
+        </w:tc>
+        <w:tc>
+          <w:tcPr>
+            <w:tcW w:type="dxa" w:w="1728"/>
+            <w:vAlign w:val="center"/>
+            <w:tcMar>
+              <w:top w:w="90" w:type="dxa"/>
+              <w:start w:w="100" w:type="dxa"/>
+              <w:bottom w:w="90" w:type="dxa"/>
+              <w:end w:w="100" w:type="dxa"/>
+            </w:tcMar>
+            <w:shd w:fill="FFFFFF"/>
+          </w:tcPr>
+          <w:p>
+            <w:pPr>
+              <w:keepNext w:val="0"/>
+              <w:widowControl/>
+              <w:spacing w:before="0" w:after="0" w:line="264" w:lineRule="auto"/>
+              <w:jc w:val="center"/>
+            </w:pPr>
+            <w:r/>
+            <w:r>
+              <w:rPr>
+                <w:rFonts w:ascii="Arial Unicode MS" w:hAnsi="Arial Unicode MS" w:eastAsia="Arial Unicode MS"/>
+                <w:b w:val="0"/>
+                <w:color w:val="000000"/>
+                <w:sz w:val="16"/>
+              </w:rPr>
+              <w:t>0.5703</w:t>
+            </w:r>
+          </w:p>
+        </w:tc>
+        <w:tc>
+          <w:tcPr>
+            <w:tcW w:type="dxa" w:w="1728"/>
+            <w:vAlign w:val="center"/>
+            <w:tcMar>
+              <w:top w:w="90" w:type="dxa"/>
+              <w:start w:w="100" w:type="dxa"/>
+              <w:bottom w:w="90" w:type="dxa"/>
+              <w:end w:w="100" w:type="dxa"/>
+            </w:tcMar>
+            <w:shd w:fill="FFFFFF"/>
+          </w:tcPr>
+          <w:p>
+            <w:pPr>
+              <w:keepNext w:val="0"/>
+              <w:widowControl/>
+              <w:spacing w:before="0" w:after="0" w:line="264" w:lineRule="auto"/>
+              <w:jc w:val="center"/>
+            </w:pPr>
+            <w:r/>
+            <w:r>
+              <w:rPr>
+                <w:rFonts w:ascii="Arial Unicode MS" w:hAnsi="Arial Unicode MS" w:eastAsia="Arial Unicode MS"/>
+                <w:b w:val="0"/>
+                <w:color w:val="000000"/>
+                <w:sz w:val="16"/>
+              </w:rPr>
+              <w:t>-0.0393</w:t>
             </w:r>
           </w:p>
         </w:tc>
@@ -3961,7 +4221,7 @@
       <w:tr>
         <w:tc>
           <w:tcPr>
-            <w:tcW w:type="dxa" w:w="2015"/>
+            <w:tcW w:type="dxa" w:w="1512"/>
             <w:vAlign w:val="center"/>
             <w:tcMar>
               <w:top w:w="90" w:type="dxa"/>
@@ -3984,7 +4244,7 @@
                 <w:rFonts w:ascii="Arial Unicode MS" w:hAnsi="Arial Unicode MS" w:eastAsia="Arial Unicode MS"/>
                 <w:b w:val="0"/>
                 <w:color w:val="000000"/>
-                <w:sz w:val="18"/>
+                <w:sz w:val="16"/>
               </w:rPr>
               <w:t>2024Q3</w:t>
             </w:r>
@@ -3992,7 +4252,7 @@
         </w:tc>
         <w:tc>
           <w:tcPr>
-            <w:tcW w:type="dxa" w:w="2232"/>
+            <w:tcW w:type="dxa" w:w="1512"/>
             <w:vAlign w:val="center"/>
             <w:tcMar>
               <w:top w:w="90" w:type="dxa"/>
@@ -4015,7 +4275,7 @@
                 <w:rFonts w:ascii="Arial Unicode MS" w:hAnsi="Arial Unicode MS" w:eastAsia="Arial Unicode MS"/>
                 <w:b w:val="0"/>
                 <w:color w:val="000000"/>
-                <w:sz w:val="18"/>
+                <w:sz w:val="16"/>
               </w:rPr>
               <w:t>0.549</w:t>
             </w:r>
@@ -4023,7 +4283,7 @@
         </w:tc>
         <w:tc>
           <w:tcPr>
-            <w:tcW w:type="dxa" w:w="2592"/>
+            <w:tcW w:type="dxa" w:w="1728"/>
             <w:vAlign w:val="center"/>
             <w:tcMar>
               <w:top w:w="90" w:type="dxa"/>
@@ -4046,7 +4306,7 @@
                 <w:rFonts w:ascii="Arial Unicode MS" w:hAnsi="Arial Unicode MS" w:eastAsia="Arial Unicode MS"/>
                 <w:b w:val="0"/>
                 <w:color w:val="000000"/>
-                <w:sz w:val="18"/>
+                <w:sz w:val="16"/>
               </w:rPr>
               <w:t>0.5410</w:t>
             </w:r>
@@ -4054,7 +4314,7 @@
         </w:tc>
         <w:tc>
           <w:tcPr>
-            <w:tcW w:type="dxa" w:w="2376"/>
+            <w:tcW w:type="dxa" w:w="1728"/>
             <w:vAlign w:val="center"/>
             <w:tcMar>
               <w:top w:w="90" w:type="dxa"/>
@@ -4077,9 +4337,71 @@
                 <w:rFonts w:ascii="Arial Unicode MS" w:hAnsi="Arial Unicode MS" w:eastAsia="Arial Unicode MS"/>
                 <w:b w:val="0"/>
                 <w:color w:val="000000"/>
-                <w:sz w:val="18"/>
+                <w:sz w:val="16"/>
               </w:rPr>
               <w:t>+0.0080</w:t>
+            </w:r>
+          </w:p>
+        </w:tc>
+        <w:tc>
+          <w:tcPr>
+            <w:tcW w:type="dxa" w:w="1728"/>
+            <w:vAlign w:val="center"/>
+            <w:tcMar>
+              <w:top w:w="90" w:type="dxa"/>
+              <w:start w:w="100" w:type="dxa"/>
+              <w:bottom w:w="90" w:type="dxa"/>
+              <w:end w:w="100" w:type="dxa"/>
+            </w:tcMar>
+            <w:shd w:fill="EAF2F8"/>
+          </w:tcPr>
+          <w:p>
+            <w:pPr>
+              <w:keepNext w:val="0"/>
+              <w:widowControl/>
+              <w:spacing w:before="0" w:after="0" w:line="264" w:lineRule="auto"/>
+              <w:jc w:val="center"/>
+            </w:pPr>
+            <w:r/>
+            <w:r>
+              <w:rPr>
+                <w:rFonts w:ascii="Arial Unicode MS" w:hAnsi="Arial Unicode MS" w:eastAsia="Arial Unicode MS"/>
+                <w:b w:val="0"/>
+                <w:color w:val="000000"/>
+                <w:sz w:val="16"/>
+              </w:rPr>
+              <w:t>0.5690</w:t>
+            </w:r>
+          </w:p>
+        </w:tc>
+        <w:tc>
+          <w:tcPr>
+            <w:tcW w:type="dxa" w:w="1728"/>
+            <w:vAlign w:val="center"/>
+            <w:tcMar>
+              <w:top w:w="90" w:type="dxa"/>
+              <w:start w:w="100" w:type="dxa"/>
+              <w:bottom w:w="90" w:type="dxa"/>
+              <w:end w:w="100" w:type="dxa"/>
+            </w:tcMar>
+            <w:shd w:fill="EAF2F8"/>
+          </w:tcPr>
+          <w:p>
+            <w:pPr>
+              <w:keepNext w:val="0"/>
+              <w:widowControl/>
+              <w:spacing w:before="0" w:after="0" w:line="264" w:lineRule="auto"/>
+              <w:jc w:val="center"/>
+            </w:pPr>
+            <w:r/>
+            <w:r>
+              <w:rPr>
+                <w:rFonts w:ascii="Arial Unicode MS" w:hAnsi="Arial Unicode MS" w:eastAsia="Arial Unicode MS"/>
+                <w:b w:val="0"/>
+                <w:color w:val="000000"/>
+                <w:sz w:val="16"/>
+              </w:rPr>
+              <w:t>-0.0200</w:t>
             </w:r>
           </w:p>
         </w:tc>
@@ -4087,7 +4409,7 @@
       <w:tr>
         <w:tc>
           <w:tcPr>
-            <w:tcW w:type="dxa" w:w="2015"/>
+            <w:tcW w:type="dxa" w:w="1512"/>
             <w:vAlign w:val="center"/>
             <w:tcMar>
               <w:top w:w="90" w:type="dxa"/>
@@ -4110,7 +4432,7 @@
                 <w:rFonts w:ascii="Arial Unicode MS" w:hAnsi="Arial Unicode MS" w:eastAsia="Arial Unicode MS"/>
                 <w:b w:val="0"/>
                 <w:color w:val="000000"/>
-                <w:sz w:val="18"/>
+                <w:sz w:val="16"/>
               </w:rPr>
               <w:t>2024Q4</w:t>
             </w:r>
@@ -4118,7 +4440,7 @@
         </w:tc>
         <w:tc>
           <w:tcPr>
-            <w:tcW w:type="dxa" w:w="2232"/>
+            <w:tcW w:type="dxa" w:w="1512"/>
             <w:vAlign w:val="center"/>
             <w:tcMar>
               <w:top w:w="90" w:type="dxa"/>
@@ -4141,7 +4463,7 @@
                 <w:rFonts w:ascii="Arial Unicode MS" w:hAnsi="Arial Unicode MS" w:eastAsia="Arial Unicode MS"/>
                 <w:b w:val="0"/>
                 <w:color w:val="000000"/>
-                <w:sz w:val="18"/>
+                <w:sz w:val="16"/>
               </w:rPr>
               <w:t>0.527</w:t>
             </w:r>
@@ -4149,7 +4471,7 @@
         </w:tc>
         <w:tc>
           <w:tcPr>
-            <w:tcW w:type="dxa" w:w="2592"/>
+            <w:tcW w:type="dxa" w:w="1728"/>
             <w:vAlign w:val="center"/>
             <w:tcMar>
               <w:top w:w="90" w:type="dxa"/>
@@ -4172,7 +4494,7 @@
                 <w:rFonts w:ascii="Arial Unicode MS" w:hAnsi="Arial Unicode MS" w:eastAsia="Arial Unicode MS"/>
                 <w:b w:val="0"/>
                 <w:color w:val="000000"/>
-                <w:sz w:val="18"/>
+                <w:sz w:val="16"/>
               </w:rPr>
               <w:t>0.5542</w:t>
             </w:r>
@@ -4180,7 +4502,7 @@
         </w:tc>
         <w:tc>
           <w:tcPr>
-            <w:tcW w:type="dxa" w:w="2376"/>
+            <w:tcW w:type="dxa" w:w="1728"/>
             <w:vAlign w:val="center"/>
             <w:tcMar>
               <w:top w:w="90" w:type="dxa"/>
@@ -4203,9 +4525,71 @@
                 <w:rFonts w:ascii="Arial Unicode MS" w:hAnsi="Arial Unicode MS" w:eastAsia="Arial Unicode MS"/>
                 <w:b w:val="0"/>
                 <w:color w:val="000000"/>
-                <w:sz w:val="18"/>
+                <w:sz w:val="16"/>
               </w:rPr>
               <w:t>-0.0272</w:t>
+            </w:r>
+          </w:p>
+        </w:tc>
+        <w:tc>
+          <w:tcPr>
+            <w:tcW w:type="dxa" w:w="1728"/>
+            <w:vAlign w:val="center"/>
+            <w:tcMar>
+              <w:top w:w="90" w:type="dxa"/>
+              <w:start w:w="100" w:type="dxa"/>
+              <w:bottom w:w="90" w:type="dxa"/>
+              <w:end w:w="100" w:type="dxa"/>
+            </w:tcMar>
+            <w:shd w:fill="FFFFFF"/>
+          </w:tcPr>
+          <w:p>
+            <w:pPr>
+              <w:keepNext w:val="0"/>
+              <w:widowControl/>
+              <w:spacing w:before="0" w:after="0" w:line="264" w:lineRule="auto"/>
+              <w:jc w:val="center"/>
+            </w:pPr>
+            <w:r/>
+            <w:r>
+              <w:rPr>
+                <w:rFonts w:ascii="Arial Unicode MS" w:hAnsi="Arial Unicode MS" w:eastAsia="Arial Unicode MS"/>
+                <w:b w:val="0"/>
+                <w:color w:val="000000"/>
+                <w:sz w:val="16"/>
+              </w:rPr>
+              <w:t>0.5685</w:t>
+            </w:r>
+          </w:p>
+        </w:tc>
+        <w:tc>
+          <w:tcPr>
+            <w:tcW w:type="dxa" w:w="1728"/>
+            <w:vAlign w:val="center"/>
+            <w:tcMar>
+              <w:top w:w="90" w:type="dxa"/>
+              <w:start w:w="100" w:type="dxa"/>
+              <w:bottom w:w="90" w:type="dxa"/>
+              <w:end w:w="100" w:type="dxa"/>
+            </w:tcMar>
+            <w:shd w:fill="FFFFFF"/>
+          </w:tcPr>
+          <w:p>
+            <w:pPr>
+              <w:keepNext w:val="0"/>
+              <w:widowControl/>
+              <w:spacing w:before="0" w:after="0" w:line="264" w:lineRule="auto"/>
+              <w:jc w:val="center"/>
+            </w:pPr>
+            <w:r/>
+            <w:r>
+              <w:rPr>
+                <w:rFonts w:ascii="Arial Unicode MS" w:hAnsi="Arial Unicode MS" w:eastAsia="Arial Unicode MS"/>
+                <w:b w:val="0"/>
+                <w:color w:val="000000"/>
+                <w:sz w:val="16"/>
+              </w:rPr>
+              <w:t>-0.0415</w:t>
             </w:r>
           </w:p>
         </w:tc>
@@ -4213,7 +4597,7 @@
       <w:tr>
         <w:tc>
           <w:tcPr>
-            <w:tcW w:type="dxa" w:w="2015"/>
+            <w:tcW w:type="dxa" w:w="1512"/>
             <w:vAlign w:val="center"/>
             <w:tcMar>
               <w:top w:w="90" w:type="dxa"/>
@@ -4236,7 +4620,7 @@
                 <w:rFonts w:ascii="Arial Unicode MS" w:hAnsi="Arial Unicode MS" w:eastAsia="Arial Unicode MS"/>
                 <w:b w:val="0"/>
                 <w:color w:val="000000"/>
-                <w:sz w:val="18"/>
+                <w:sz w:val="16"/>
               </w:rPr>
               <w:t>2025Q1</w:t>
             </w:r>
@@ -4244,7 +4628,7 @@
         </w:tc>
         <w:tc>
           <w:tcPr>
-            <w:tcW w:type="dxa" w:w="2232"/>
+            <w:tcW w:type="dxa" w:w="1512"/>
             <w:vAlign w:val="center"/>
             <w:tcMar>
               <w:top w:w="90" w:type="dxa"/>
@@ -4267,7 +4651,7 @@
                 <w:rFonts w:ascii="Arial Unicode MS" w:hAnsi="Arial Unicode MS" w:eastAsia="Arial Unicode MS"/>
                 <w:b w:val="0"/>
                 <w:color w:val="000000"/>
-                <w:sz w:val="18"/>
+                <w:sz w:val="16"/>
               </w:rPr>
               <w:t>0.534</w:t>
             </w:r>
@@ -4275,7 +4659,7 @@
         </w:tc>
         <w:tc>
           <w:tcPr>
-            <w:tcW w:type="dxa" w:w="2592"/>
+            <w:tcW w:type="dxa" w:w="1728"/>
             <w:vAlign w:val="center"/>
             <w:tcMar>
               <w:top w:w="90" w:type="dxa"/>
@@ -4298,7 +4682,7 @@
                 <w:rFonts w:ascii="Arial Unicode MS" w:hAnsi="Arial Unicode MS" w:eastAsia="Arial Unicode MS"/>
                 <w:b w:val="0"/>
                 <w:color w:val="000000"/>
-                <w:sz w:val="18"/>
+                <w:sz w:val="16"/>
               </w:rPr>
               <w:t>0.5370</w:t>
             </w:r>
@@ -4306,7 +4690,7 @@
         </w:tc>
         <w:tc>
           <w:tcPr>
-            <w:tcW w:type="dxa" w:w="2376"/>
+            <w:tcW w:type="dxa" w:w="1728"/>
             <w:vAlign w:val="center"/>
             <w:tcMar>
               <w:top w:w="90" w:type="dxa"/>
@@ -4329,9 +4713,71 @@
                 <w:rFonts w:ascii="Arial Unicode MS" w:hAnsi="Arial Unicode MS" w:eastAsia="Arial Unicode MS"/>
                 <w:b w:val="0"/>
                 <w:color w:val="000000"/>
-                <w:sz w:val="18"/>
+                <w:sz w:val="16"/>
               </w:rPr>
               <w:t>-0.0030</w:t>
+            </w:r>
+          </w:p>
+        </w:tc>
+        <w:tc>
+          <w:tcPr>
+            <w:tcW w:type="dxa" w:w="1728"/>
+            <w:vAlign w:val="center"/>
+            <w:tcMar>
+              <w:top w:w="90" w:type="dxa"/>
+              <w:start w:w="100" w:type="dxa"/>
+              <w:bottom w:w="90" w:type="dxa"/>
+              <w:end w:w="100" w:type="dxa"/>
+            </w:tcMar>
+            <w:shd w:fill="EAF2F8"/>
+          </w:tcPr>
+          <w:p>
+            <w:pPr>
+              <w:keepNext w:val="0"/>
+              <w:widowControl/>
+              <w:spacing w:before="0" w:after="0" w:line="264" w:lineRule="auto"/>
+              <w:jc w:val="center"/>
+            </w:pPr>
+            <w:r/>
+            <w:r>
+              <w:rPr>
+                <w:rFonts w:ascii="Arial Unicode MS" w:hAnsi="Arial Unicode MS" w:eastAsia="Arial Unicode MS"/>
+                <w:b w:val="0"/>
+                <w:color w:val="000000"/>
+                <w:sz w:val="16"/>
+              </w:rPr>
+              <w:t>0.5667</w:t>
+            </w:r>
+          </w:p>
+        </w:tc>
+        <w:tc>
+          <w:tcPr>
+            <w:tcW w:type="dxa" w:w="1728"/>
+            <w:vAlign w:val="center"/>
+            <w:tcMar>
+              <w:top w:w="90" w:type="dxa"/>
+              <w:start w:w="100" w:type="dxa"/>
+              <w:bottom w:w="90" w:type="dxa"/>
+              <w:end w:w="100" w:type="dxa"/>
+            </w:tcMar>
+            <w:shd w:fill="EAF2F8"/>
+          </w:tcPr>
+          <w:p>
+            <w:pPr>
+              <w:keepNext w:val="0"/>
+              <w:widowControl/>
+              <w:spacing w:before="0" w:after="0" w:line="264" w:lineRule="auto"/>
+              <w:jc w:val="center"/>
+            </w:pPr>
+            <w:r/>
+            <w:r>
+              <w:rPr>
+                <w:rFonts w:ascii="Arial Unicode MS" w:hAnsi="Arial Unicode MS" w:eastAsia="Arial Unicode MS"/>
+                <w:b w:val="0"/>
+                <w:color w:val="000000"/>
+                <w:sz w:val="16"/>
+              </w:rPr>
+              <w:t>-0.0327</w:t>
             </w:r>
           </w:p>
         </w:tc>
@@ -4339,7 +4785,7 @@
       <w:tr>
         <w:tc>
           <w:tcPr>
-            <w:tcW w:type="dxa" w:w="2015"/>
+            <w:tcW w:type="dxa" w:w="1512"/>
             <w:vAlign w:val="center"/>
             <w:tcMar>
               <w:top w:w="90" w:type="dxa"/>
@@ -4362,7 +4808,7 @@
                 <w:rFonts w:ascii="Arial Unicode MS" w:hAnsi="Arial Unicode MS" w:eastAsia="Arial Unicode MS"/>
                 <w:b w:val="0"/>
                 <w:color w:val="000000"/>
-                <w:sz w:val="18"/>
+                <w:sz w:val="16"/>
               </w:rPr>
               <w:t>2025Q2</w:t>
             </w:r>
@@ -4370,7 +4816,7 @@
         </w:tc>
         <w:tc>
           <w:tcPr>
-            <w:tcW w:type="dxa" w:w="2232"/>
+            <w:tcW w:type="dxa" w:w="1512"/>
             <w:vAlign w:val="center"/>
             <w:tcMar>
               <w:top w:w="90" w:type="dxa"/>
@@ -4393,7 +4839,7 @@
                 <w:rFonts w:ascii="Arial Unicode MS" w:hAnsi="Arial Unicode MS" w:eastAsia="Arial Unicode MS"/>
                 <w:b w:val="0"/>
                 <w:color w:val="000000"/>
-                <w:sz w:val="18"/>
+                <w:sz w:val="16"/>
               </w:rPr>
               <w:t>0.526</w:t>
             </w:r>
@@ -4401,7 +4847,7 @@
         </w:tc>
         <w:tc>
           <w:tcPr>
-            <w:tcW w:type="dxa" w:w="2592"/>
+            <w:tcW w:type="dxa" w:w="1728"/>
             <w:vAlign w:val="center"/>
             <w:tcMar>
               <w:top w:w="90" w:type="dxa"/>
@@ -4424,7 +4870,7 @@
                 <w:rFonts w:ascii="Arial Unicode MS" w:hAnsi="Arial Unicode MS" w:eastAsia="Arial Unicode MS"/>
                 <w:b w:val="0"/>
                 <w:color w:val="000000"/>
-                <w:sz w:val="18"/>
+                <w:sz w:val="16"/>
               </w:rPr>
               <w:t>0.5422</w:t>
             </w:r>
@@ -4432,7 +4878,7 @@
         </w:tc>
         <w:tc>
           <w:tcPr>
-            <w:tcW w:type="dxa" w:w="2376"/>
+            <w:tcW w:type="dxa" w:w="1728"/>
             <w:vAlign w:val="center"/>
             <w:tcMar>
               <w:top w:w="90" w:type="dxa"/>
@@ -4455,9 +4901,71 @@
                 <w:rFonts w:ascii="Arial Unicode MS" w:hAnsi="Arial Unicode MS" w:eastAsia="Arial Unicode MS"/>
                 <w:b w:val="0"/>
                 <w:color w:val="000000"/>
-                <w:sz w:val="18"/>
+                <w:sz w:val="16"/>
               </w:rPr>
               <w:t>-0.0162</w:t>
+            </w:r>
+          </w:p>
+        </w:tc>
+        <w:tc>
+          <w:tcPr>
+            <w:tcW w:type="dxa" w:w="1728"/>
+            <w:vAlign w:val="center"/>
+            <w:tcMar>
+              <w:top w:w="90" w:type="dxa"/>
+              <w:start w:w="100" w:type="dxa"/>
+              <w:bottom w:w="90" w:type="dxa"/>
+              <w:end w:w="100" w:type="dxa"/>
+            </w:tcMar>
+            <w:shd w:fill="FFFFFF"/>
+          </w:tcPr>
+          <w:p>
+            <w:pPr>
+              <w:keepNext w:val="0"/>
+              <w:widowControl/>
+              <w:spacing w:before="0" w:after="0" w:line="264" w:lineRule="auto"/>
+              <w:jc w:val="center"/>
+            </w:pPr>
+            <w:r/>
+            <w:r>
+              <w:rPr>
+                <w:rFonts w:ascii="Arial Unicode MS" w:hAnsi="Arial Unicode MS" w:eastAsia="Arial Unicode MS"/>
+                <w:b w:val="0"/>
+                <w:color w:val="000000"/>
+                <w:sz w:val="16"/>
+              </w:rPr>
+              <w:t>0.5655</w:t>
+            </w:r>
+          </w:p>
+        </w:tc>
+        <w:tc>
+          <w:tcPr>
+            <w:tcW w:type="dxa" w:w="1728"/>
+            <w:vAlign w:val="center"/>
+            <w:tcMar>
+              <w:top w:w="90" w:type="dxa"/>
+              <w:start w:w="100" w:type="dxa"/>
+              <w:bottom w:w="90" w:type="dxa"/>
+              <w:end w:w="100" w:type="dxa"/>
+            </w:tcMar>
+            <w:shd w:fill="FFFFFF"/>
+          </w:tcPr>
+          <w:p>
+            <w:pPr>
+              <w:keepNext w:val="0"/>
+              <w:widowControl/>
+              <w:spacing w:before="0" w:after="0" w:line="264" w:lineRule="auto"/>
+              <w:jc w:val="center"/>
+            </w:pPr>
+            <w:r/>
+            <w:r>
+              <w:rPr>
+                <w:rFonts w:ascii="Arial Unicode MS" w:hAnsi="Arial Unicode MS" w:eastAsia="Arial Unicode MS"/>
+                <w:b w:val="0"/>
+                <w:color w:val="000000"/>
+                <w:sz w:val="16"/>
+              </w:rPr>
+              <w:t>-0.0395</w:t>
             </w:r>
           </w:p>
         </w:tc>
@@ -4465,7 +4973,7 @@
       <w:tr>
         <w:tc>
           <w:tcPr>
-            <w:tcW w:type="dxa" w:w="2015"/>
+            <w:tcW w:type="dxa" w:w="1512"/>
             <w:vAlign w:val="center"/>
             <w:tcMar>
               <w:top w:w="90" w:type="dxa"/>
@@ -4488,7 +4996,7 @@
                 <w:rFonts w:ascii="Arial Unicode MS" w:hAnsi="Arial Unicode MS" w:eastAsia="Arial Unicode MS"/>
                 <w:b w:val="0"/>
                 <w:color w:val="000000"/>
-                <w:sz w:val="18"/>
+                <w:sz w:val="16"/>
               </w:rPr>
               <w:t>2025Q3</w:t>
             </w:r>
@@ -4496,7 +5004,7 @@
         </w:tc>
         <w:tc>
           <w:tcPr>
-            <w:tcW w:type="dxa" w:w="2232"/>
+            <w:tcW w:type="dxa" w:w="1512"/>
             <w:vAlign w:val="center"/>
             <w:tcMar>
               <w:top w:w="90" w:type="dxa"/>
@@ -4519,7 +5027,7 @@
                 <w:rFonts w:ascii="Arial Unicode MS" w:hAnsi="Arial Unicode MS" w:eastAsia="Arial Unicode MS"/>
                 <w:b w:val="0"/>
                 <w:color w:val="000000"/>
-                <w:sz w:val="18"/>
+                <w:sz w:val="16"/>
               </w:rPr>
               <w:t>0.561</w:t>
             </w:r>
@@ -4527,7 +5035,7 @@
         </w:tc>
         <w:tc>
           <w:tcPr>
-            <w:tcW w:type="dxa" w:w="2592"/>
+            <w:tcW w:type="dxa" w:w="1728"/>
             <w:vAlign w:val="center"/>
             <w:tcMar>
               <w:top w:w="90" w:type="dxa"/>
@@ -4550,7 +5058,7 @@
                 <w:rFonts w:ascii="Arial Unicode MS" w:hAnsi="Arial Unicode MS" w:eastAsia="Arial Unicode MS"/>
                 <w:b w:val="0"/>
                 <w:color w:val="000000"/>
-                <w:sz w:val="18"/>
+                <w:sz w:val="16"/>
               </w:rPr>
               <w:t>0.5370</w:t>
             </w:r>
@@ -4558,7 +5066,7 @@
         </w:tc>
         <w:tc>
           <w:tcPr>
-            <w:tcW w:type="dxa" w:w="2376"/>
+            <w:tcW w:type="dxa" w:w="1728"/>
             <w:vAlign w:val="center"/>
             <w:tcMar>
               <w:top w:w="90" w:type="dxa"/>
@@ -4581,9 +5089,71 @@
                 <w:rFonts w:ascii="Arial Unicode MS" w:hAnsi="Arial Unicode MS" w:eastAsia="Arial Unicode MS"/>
                 <w:b w:val="0"/>
                 <w:color w:val="000000"/>
-                <w:sz w:val="18"/>
+                <w:sz w:val="16"/>
               </w:rPr>
               <w:t>+0.0241</w:t>
+            </w:r>
+          </w:p>
+        </w:tc>
+        <w:tc>
+          <w:tcPr>
+            <w:tcW w:type="dxa" w:w="1728"/>
+            <w:vAlign w:val="center"/>
+            <w:tcMar>
+              <w:top w:w="90" w:type="dxa"/>
+              <w:start w:w="100" w:type="dxa"/>
+              <w:bottom w:w="90" w:type="dxa"/>
+              <w:end w:w="100" w:type="dxa"/>
+            </w:tcMar>
+            <w:shd w:fill="EAF2F8"/>
+          </w:tcPr>
+          <w:p>
+            <w:pPr>
+              <w:keepNext w:val="0"/>
+              <w:widowControl/>
+              <w:spacing w:before="0" w:after="0" w:line="264" w:lineRule="auto"/>
+              <w:jc w:val="center"/>
+            </w:pPr>
+            <w:r/>
+            <w:r>
+              <w:rPr>
+                <w:rFonts w:ascii="Arial Unicode MS" w:hAnsi="Arial Unicode MS" w:eastAsia="Arial Unicode MS"/>
+                <w:b w:val="0"/>
+                <w:color w:val="000000"/>
+                <w:sz w:val="16"/>
+              </w:rPr>
+              <w:t>0.5652</w:t>
+            </w:r>
+          </w:p>
+        </w:tc>
+        <w:tc>
+          <w:tcPr>
+            <w:tcW w:type="dxa" w:w="1728"/>
+            <w:vAlign w:val="center"/>
+            <w:tcMar>
+              <w:top w:w="90" w:type="dxa"/>
+              <w:start w:w="100" w:type="dxa"/>
+              <w:bottom w:w="90" w:type="dxa"/>
+              <w:end w:w="100" w:type="dxa"/>
+            </w:tcMar>
+            <w:shd w:fill="EAF2F8"/>
+          </w:tcPr>
+          <w:p>
+            <w:pPr>
+              <w:keepNext w:val="0"/>
+              <w:widowControl/>
+              <w:spacing w:before="0" w:after="0" w:line="264" w:lineRule="auto"/>
+              <w:jc w:val="center"/>
+            </w:pPr>
+            <w:r/>
+            <w:r>
+              <w:rPr>
+                <w:rFonts w:ascii="Arial Unicode MS" w:hAnsi="Arial Unicode MS" w:eastAsia="Arial Unicode MS"/>
+                <w:b w:val="0"/>
+                <w:color w:val="000000"/>
+                <w:sz w:val="16"/>
+              </w:rPr>
+              <w:t>-0.0042</w:t>
             </w:r>
           </w:p>
         </w:tc>
@@ -4591,7 +5161,7 @@
       <w:tr>
         <w:tc>
           <w:tcPr>
-            <w:tcW w:type="dxa" w:w="2015"/>
+            <w:tcW w:type="dxa" w:w="1512"/>
             <w:vAlign w:val="center"/>
             <w:tcMar>
               <w:top w:w="90" w:type="dxa"/>
@@ -4614,7 +5184,7 @@
                 <w:rFonts w:ascii="Arial Unicode MS" w:hAnsi="Arial Unicode MS" w:eastAsia="Arial Unicode MS"/>
                 <w:b w:val="0"/>
                 <w:color w:val="000000"/>
-                <w:sz w:val="18"/>
+                <w:sz w:val="16"/>
               </w:rPr>
               <w:t>2025Q4</w:t>
             </w:r>
@@ -4622,7 +5192,7 @@
         </w:tc>
         <w:tc>
           <w:tcPr>
-            <w:tcW w:type="dxa" w:w="2232"/>
+            <w:tcW w:type="dxa" w:w="1512"/>
             <w:vAlign w:val="center"/>
             <w:tcMar>
               <w:top w:w="90" w:type="dxa"/>
@@ -4645,7 +5215,7 @@
                 <w:rFonts w:ascii="Arial Unicode MS" w:hAnsi="Arial Unicode MS" w:eastAsia="Arial Unicode MS"/>
                 <w:b w:val="0"/>
                 <w:color w:val="000000"/>
-                <w:sz w:val="18"/>
+                <w:sz w:val="16"/>
               </w:rPr>
               <w:t>0.548</w:t>
             </w:r>
@@ -4653,7 +5223,7 @@
         </w:tc>
         <w:tc>
           <w:tcPr>
-            <w:tcW w:type="dxa" w:w="2592"/>
+            <w:tcW w:type="dxa" w:w="1728"/>
             <w:vAlign w:val="center"/>
             <w:tcMar>
               <w:top w:w="90" w:type="dxa"/>
@@ -4676,7 +5246,7 @@
                 <w:rFonts w:ascii="Arial Unicode MS" w:hAnsi="Arial Unicode MS" w:eastAsia="Arial Unicode MS"/>
                 <w:b w:val="0"/>
                 <w:color w:val="000000"/>
-                <w:sz w:val="18"/>
+                <w:sz w:val="16"/>
               </w:rPr>
               <w:t>0.5624</w:t>
             </w:r>
@@ -4684,7 +5254,7 @@
         </w:tc>
         <w:tc>
           <w:tcPr>
-            <w:tcW w:type="dxa" w:w="2376"/>
+            <w:tcW w:type="dxa" w:w="1728"/>
             <w:vAlign w:val="center"/>
             <w:tcMar>
               <w:top w:w="90" w:type="dxa"/>
@@ -4707,9 +5277,71 @@
                 <w:rFonts w:ascii="Arial Unicode MS" w:hAnsi="Arial Unicode MS" w:eastAsia="Arial Unicode MS"/>
                 <w:b w:val="0"/>
                 <w:color w:val="000000"/>
-                <w:sz w:val="18"/>
+                <w:sz w:val="16"/>
               </w:rPr>
               <w:t>-0.0144</w:t>
+            </w:r>
+          </w:p>
+        </w:tc>
+        <w:tc>
+          <w:tcPr>
+            <w:tcW w:type="dxa" w:w="1728"/>
+            <w:vAlign w:val="center"/>
+            <w:tcMar>
+              <w:top w:w="90" w:type="dxa"/>
+              <w:start w:w="100" w:type="dxa"/>
+              <w:bottom w:w="90" w:type="dxa"/>
+              <w:end w:w="100" w:type="dxa"/>
+            </w:tcMar>
+            <w:shd w:fill="FFFFFF"/>
+          </w:tcPr>
+          <w:p>
+            <w:pPr>
+              <w:keepNext w:val="0"/>
+              <w:widowControl/>
+              <w:spacing w:before="0" w:after="0" w:line="264" w:lineRule="auto"/>
+              <w:jc w:val="center"/>
+            </w:pPr>
+            <w:r/>
+            <w:r>
+              <w:rPr>
+                <w:rFonts w:ascii="Arial Unicode MS" w:hAnsi="Arial Unicode MS" w:eastAsia="Arial Unicode MS"/>
+                <w:b w:val="0"/>
+                <w:color w:val="000000"/>
+                <w:sz w:val="16"/>
+              </w:rPr>
+              <w:t>0.5653</w:t>
+            </w:r>
+          </w:p>
+        </w:tc>
+        <w:tc>
+          <w:tcPr>
+            <w:tcW w:type="dxa" w:w="1728"/>
+            <w:vAlign w:val="center"/>
+            <w:tcMar>
+              <w:top w:w="90" w:type="dxa"/>
+              <w:start w:w="100" w:type="dxa"/>
+              <w:bottom w:w="90" w:type="dxa"/>
+              <w:end w:w="100" w:type="dxa"/>
+            </w:tcMar>
+            <w:shd w:fill="FFFFFF"/>
+          </w:tcPr>
+          <w:p>
+            <w:pPr>
+              <w:keepNext w:val="0"/>
+              <w:widowControl/>
+              <w:spacing w:before="0" w:after="0" w:line="264" w:lineRule="auto"/>
+              <w:jc w:val="center"/>
+            </w:pPr>
+            <w:r/>
+            <w:r>
+              <w:rPr>
+                <w:rFonts w:ascii="Arial Unicode MS" w:hAnsi="Arial Unicode MS" w:eastAsia="Arial Unicode MS"/>
+                <w:b w:val="0"/>
+                <w:color w:val="000000"/>
+                <w:sz w:val="16"/>
+              </w:rPr>
+              <w:t>-0.0173</w:t>
             </w:r>
           </w:p>
         </w:tc>
@@ -4721,11 +5353,6 @@
         <w:widowControl/>
         <w:spacing w:before="0" w:after="60" w:line="240" w:lineRule="auto"/>
       </w:pPr>
-    </w:p>
-    <w:p>
-      <w:r>
-        <w:br w:type="page"/>
-      </w:r>
     </w:p>
     <w:p>
       <w:pPr>

</xml_diff>

<commit_message>
Add baseline and S4 forecast comparison
</commit_message>
<xml_diff>
--- a/Bank_ER_ARDL_Analysis_Report_EN.docx
+++ b/Bank_ER_ARDL_Analysis_Report_EN.docx
@@ -5368,7 +5368,7 @@
           <w:color w:val="000000"/>
           <w:sz w:val="28"/>
         </w:rPr>
-        <w:t>Nine Quarter Forecast Under the S4 Unemployment Scenario</w:t>
+        <w:t>Nine Quarter Baseline and S4 Forecasts</w:t>
       </w:r>
     </w:p>
     <w:p>
@@ -5383,7 +5383,7 @@
           <w:color w:val="000000"/>
           <w:sz w:val="21"/>
         </w:rPr>
-        <w:t>The S4 unemployment path covers nine quarters from 2026Q1 through 2028Q1. The forecast uses the final unemployment ARDL model and starts from the actual 2025Q4 ER of 0.548. From the second forecast quarter onward, the calculation recursively uses the previous quarter's ER forecast. The TARP dummy equals 0 throughout the forecast period.</w:t>
+        <w:t>The Baseline and S4 unemployment paths both cover nine quarters from 2026Q1 through 2028Q1. Each forecast uses the final unemployment ARDL model and starts from the actual 2025Q4 ER of 0.548. From the second forecast quarter onward, the calculation recursively uses the previous quarter's ER forecast. The TARP dummy equals 0 throughout the forecast period.</w:t>
       </w:r>
     </w:p>
     <w:p>
@@ -5398,7 +5398,7 @@
           <w:color w:val="000000"/>
           <w:sz w:val="21"/>
         </w:rPr>
-        <w:t>Because the model uses one lag of Delta Unemp, the 2026Q1 ER forecast uses the actual change in unemployment from 2025Q3 to 2025Q4, which is +0.1167 percentage points. The 2.1154 percentage point increase from 2025Q4 to the S4 value for 2026Q1 enters the model in 2026Q2. For the same reason, the S4 unemployment level for 2028Q1 first affects ER in 2028Q2 and does not affect the final forecast shown here.</w:t>
+        <w:t>Because the model uses one lag of Delta Unemp, both 2026Q1 ER forecasts use the actual change in unemployment from 2025Q3 to 2025Q4, which is +0.1167 percentage points. The paths begin to affect the comparison in 2026Q2: the model uses a -0.1167 point change for Baseline and a +2.1154 point change for S4. For the same reason, the unemployment levels for 2028Q1 first affect ER in 2028Q2 and do not affect the final forecasts shown here.</w:t>
       </w:r>
     </w:p>
     <w:p>
@@ -5411,7 +5411,7 @@
         <w:drawing>
           <wp:inline xmlns:a="http://schemas.openxmlformats.org/drawingml/2006/main" xmlns:pic="http://schemas.openxmlformats.org/drawingml/2006/picture">
             <wp:extent cx="5897880" cy="2801493"/>
-            <wp:docPr id="3" name="Picture 3" title="S4 unemployment path" descr="The S4 quarterly unemployment rate rises from 6.565 percent in 2026Q1 to 9.456 percent in 2027Q4 and declines slightly in 2028Q1."/>
+            <wp:docPr id="3" name="Picture 3" title="Baseline and S4 unemployment paths" descr="The Baseline unemployment rate remains near 4.2 to 4.7 percent, while S4 rises from 6.565 percent in 2026Q1 to 9.456 percent in 2027Q4 before declining slightly in 2028Q1."/>
             <wp:cNvGraphicFramePr>
               <a:graphicFrameLocks noChangeAspect="1"/>
             </wp:cNvGraphicFramePr>
@@ -5419,7 +5419,7 @@
               <a:graphicData uri="http://schemas.openxmlformats.org/drawingml/2006/picture">
                 <pic:pic>
                   <pic:nvPicPr>
-                    <pic:cNvPr id="0" name="s4_unemployment_en.png"/>
+                    <pic:cNvPr id="0" name="baseline_s4_unemployment_en.png"/>
                     <pic:cNvPicPr/>
                   </pic:nvPicPr>
                   <pic:blipFill>
@@ -5456,7 +5456,7 @@
           <w:color w:val="666666"/>
           <w:sz w:val="18"/>
         </w:rPr>
-        <w:t>Figure 3  S4 unemployment rate path from 2026Q1 to 2028Q1</w:t>
+        <w:t>Figure 3  Baseline and S4 unemployment rate paths from 2026Q1 to 2028Q1</w:t>
       </w:r>
     </w:p>
     <w:p>
@@ -5480,10 +5480,11 @@
         </w:tblBorders>
       </w:tblPr>
       <w:tblGrid>
-        <w:gridCol w:w="2498"/>
-        <w:gridCol w:w="2498"/>
-        <w:gridCol w:w="2498"/>
-        <w:gridCol w:w="2498"/>
+        <w:gridCol w:w="1999"/>
+        <w:gridCol w:w="1999"/>
+        <w:gridCol w:w="1999"/>
+        <w:gridCol w:w="1999"/>
+        <w:gridCol w:w="1999"/>
       </w:tblGrid>
       <w:tr>
         <w:trPr>
@@ -5491,7 +5492,7 @@
         </w:trPr>
         <w:tc>
           <w:tcPr>
-            <w:tcW w:type="dxa" w:w="1655"/>
+            <w:tcW w:type="dxa" w:w="1368"/>
             <w:vAlign w:val="center"/>
             <w:tcMar>
               <w:top w:w="90" w:type="dxa"/>
@@ -5514,7 +5515,7 @@
                 <w:rFonts w:ascii="Arial Unicode MS" w:hAnsi="Arial Unicode MS" w:eastAsia="Arial Unicode MS"/>
                 <w:b/>
                 <w:color w:val="FFFFFF"/>
-                <w:sz w:val="17"/>
+                <w:sz w:val="16"/>
               </w:rPr>
               <w:t>Quarter</w:t>
             </w:r>
@@ -5545,15 +5546,15 @@
                 <w:rFonts w:ascii="Arial Unicode MS" w:hAnsi="Arial Unicode MS" w:eastAsia="Arial Unicode MS"/>
                 <w:b/>
                 <w:color w:val="FFFFFF"/>
-                <w:sz w:val="17"/>
+                <w:sz w:val="16"/>
               </w:rPr>
-              <w:t>S4 unemployment rate</w:t>
+              <w:t>Baseline unemployment</w:t>
             </w:r>
           </w:p>
         </w:tc>
         <w:tc>
           <w:tcPr>
-            <w:tcW w:type="dxa" w:w="3096"/>
+            <w:tcW w:type="dxa" w:w="2088"/>
             <w:vAlign w:val="center"/>
             <w:tcMar>
               <w:top w:w="90" w:type="dxa"/>
@@ -5576,15 +5577,15 @@
                 <w:rFonts w:ascii="Arial Unicode MS" w:hAnsi="Arial Unicode MS" w:eastAsia="Arial Unicode MS"/>
                 <w:b/>
                 <w:color w:val="FFFFFF"/>
-                <w:sz w:val="17"/>
+                <w:sz w:val="16"/>
               </w:rPr>
-              <w:t>Lagged Delta Unemp used</w:t>
+              <w:t>S4 unemployment</w:t>
             </w:r>
           </w:p>
         </w:tc>
         <w:tc>
           <w:tcPr>
-            <w:tcW w:type="dxa" w:w="2664"/>
+            <w:tcW w:type="dxa" w:w="2304"/>
             <w:vAlign w:val="center"/>
             <w:tcMar>
               <w:top w:w="90" w:type="dxa"/>
@@ -5607,9 +5608,40 @@
                 <w:rFonts w:ascii="Arial Unicode MS" w:hAnsi="Arial Unicode MS" w:eastAsia="Arial Unicode MS"/>
                 <w:b/>
                 <w:color w:val="FFFFFF"/>
-                <w:sz w:val="17"/>
+                <w:sz w:val="16"/>
               </w:rPr>
-              <w:t>Recursive ER forecast</w:t>
+              <w:t>Baseline ER forecast</w:t>
+            </w:r>
+          </w:p>
+        </w:tc>
+        <w:tc>
+          <w:tcPr>
+            <w:tcW w:type="dxa" w:w="1944"/>
+            <w:vAlign w:val="center"/>
+            <w:tcMar>
+              <w:top w:w="90" w:type="dxa"/>
+              <w:start w:w="100" w:type="dxa"/>
+              <w:bottom w:w="90" w:type="dxa"/>
+              <w:end w:w="100" w:type="dxa"/>
+            </w:tcMar>
+            <w:shd w:fill="1F4E78"/>
+          </w:tcPr>
+          <w:p>
+            <w:pPr>
+              <w:keepNext w:val="0"/>
+              <w:widowControl/>
+              <w:spacing w:before="0" w:after="0" w:line="264" w:lineRule="auto"/>
+              <w:jc w:val="center"/>
+            </w:pPr>
+            <w:r/>
+            <w:r>
+              <w:rPr>
+                <w:rFonts w:ascii="Arial Unicode MS" w:hAnsi="Arial Unicode MS" w:eastAsia="Arial Unicode MS"/>
+                <w:b/>
+                <w:color w:val="FFFFFF"/>
+                <w:sz w:val="16"/>
+              </w:rPr>
+              <w:t>S4 ER forecast</w:t>
             </w:r>
           </w:p>
         </w:tc>
@@ -5617,7 +5649,7 @@
       <w:tr>
         <w:tc>
           <w:tcPr>
-            <w:tcW w:type="dxa" w:w="1655"/>
+            <w:tcW w:type="dxa" w:w="1368"/>
             <w:vAlign w:val="center"/>
             <w:tcMar>
               <w:top w:w="90" w:type="dxa"/>
@@ -5640,7 +5672,7 @@
                 <w:rFonts w:ascii="Arial Unicode MS" w:hAnsi="Arial Unicode MS" w:eastAsia="Arial Unicode MS"/>
                 <w:b w:val="0"/>
                 <w:color w:val="000000"/>
-                <w:sz w:val="17"/>
+                <w:sz w:val="16"/>
               </w:rPr>
               <w:t>2026Q1</w:t>
             </w:r>
@@ -5671,15 +5703,15 @@
                 <w:rFonts w:ascii="Arial Unicode MS" w:hAnsi="Arial Unicode MS" w:eastAsia="Arial Unicode MS"/>
                 <w:b w:val="0"/>
                 <w:color w:val="000000"/>
-                <w:sz w:val="17"/>
+                <w:sz w:val="16"/>
               </w:rPr>
-              <w:t>6.565%</w:t>
+              <w:t>4.333%</w:t>
             </w:r>
           </w:p>
         </w:tc>
         <w:tc>
           <w:tcPr>
-            <w:tcW w:type="dxa" w:w="3096"/>
+            <w:tcW w:type="dxa" w:w="2088"/>
             <w:vAlign w:val="center"/>
             <w:tcMar>
               <w:top w:w="90" w:type="dxa"/>
@@ -5702,15 +5734,15 @@
                 <w:rFonts w:ascii="Arial Unicode MS" w:hAnsi="Arial Unicode MS" w:eastAsia="Arial Unicode MS"/>
                 <w:b w:val="0"/>
                 <w:color w:val="000000"/>
-                <w:sz w:val="17"/>
+                <w:sz w:val="16"/>
               </w:rPr>
-              <w:t>+0.1167</w:t>
+              <w:t>6.565%</w:t>
             </w:r>
           </w:p>
         </w:tc>
         <w:tc>
           <w:tcPr>
-            <w:tcW w:type="dxa" w:w="2664"/>
+            <w:tcW w:type="dxa" w:w="2304"/>
             <w:vAlign w:val="center"/>
             <w:tcMar>
               <w:top w:w="90" w:type="dxa"/>
@@ -5733,7 +5765,38 @@
                 <w:rFonts w:ascii="Arial Unicode MS" w:hAnsi="Arial Unicode MS" w:eastAsia="Arial Unicode MS"/>
                 <w:b w:val="0"/>
                 <w:color w:val="000000"/>
-                <w:sz w:val="17"/>
+                <w:sz w:val="16"/>
+              </w:rPr>
+              <w:t>0.5530</w:t>
+            </w:r>
+          </w:p>
+        </w:tc>
+        <w:tc>
+          <w:tcPr>
+            <w:tcW w:type="dxa" w:w="1944"/>
+            <w:vAlign w:val="center"/>
+            <w:tcMar>
+              <w:top w:w="90" w:type="dxa"/>
+              <w:start w:w="100" w:type="dxa"/>
+              <w:bottom w:w="90" w:type="dxa"/>
+              <w:end w:w="100" w:type="dxa"/>
+            </w:tcMar>
+            <w:shd w:fill="FFFFFF"/>
+          </w:tcPr>
+          <w:p>
+            <w:pPr>
+              <w:keepNext w:val="0"/>
+              <w:widowControl/>
+              <w:spacing w:before="0" w:after="0" w:line="264" w:lineRule="auto"/>
+              <w:jc w:val="center"/>
+            </w:pPr>
+            <w:r/>
+            <w:r>
+              <w:rPr>
+                <w:rFonts w:ascii="Arial Unicode MS" w:hAnsi="Arial Unicode MS" w:eastAsia="Arial Unicode MS"/>
+                <w:b w:val="0"/>
+                <w:color w:val="000000"/>
+                <w:sz w:val="16"/>
               </w:rPr>
               <w:t>0.5530</w:t>
             </w:r>
@@ -5743,7 +5806,7 @@
       <w:tr>
         <w:tc>
           <w:tcPr>
-            <w:tcW w:type="dxa" w:w="1655"/>
+            <w:tcW w:type="dxa" w:w="1368"/>
             <w:vAlign w:val="center"/>
             <w:tcMar>
               <w:top w:w="90" w:type="dxa"/>
@@ -5766,7 +5829,7 @@
                 <w:rFonts w:ascii="Arial Unicode MS" w:hAnsi="Arial Unicode MS" w:eastAsia="Arial Unicode MS"/>
                 <w:b w:val="0"/>
                 <w:color w:val="000000"/>
-                <w:sz w:val="17"/>
+                <w:sz w:val="16"/>
               </w:rPr>
               <w:t>2026Q2</w:t>
             </w:r>
@@ -5797,15 +5860,15 @@
                 <w:rFonts w:ascii="Arial Unicode MS" w:hAnsi="Arial Unicode MS" w:eastAsia="Arial Unicode MS"/>
                 <w:b w:val="0"/>
                 <w:color w:val="000000"/>
-                <w:sz w:val="17"/>
+                <w:sz w:val="16"/>
               </w:rPr>
-              <w:t>7.900%</w:t>
+              <w:t>4.267%</w:t>
             </w:r>
           </w:p>
         </w:tc>
         <w:tc>
           <w:tcPr>
-            <w:tcW w:type="dxa" w:w="3096"/>
+            <w:tcW w:type="dxa" w:w="2088"/>
             <w:vAlign w:val="center"/>
             <w:tcMar>
               <w:top w:w="90" w:type="dxa"/>
@@ -5828,15 +5891,15 @@
                 <w:rFonts w:ascii="Arial Unicode MS" w:hAnsi="Arial Unicode MS" w:eastAsia="Arial Unicode MS"/>
                 <w:b w:val="0"/>
                 <w:color w:val="000000"/>
-                <w:sz w:val="17"/>
+                <w:sz w:val="16"/>
               </w:rPr>
-              <w:t>+2.1154</w:t>
+              <w:t>7.900%</w:t>
             </w:r>
           </w:p>
         </w:tc>
         <w:tc>
           <w:tcPr>
-            <w:tcW w:type="dxa" w:w="2664"/>
+            <w:tcW w:type="dxa" w:w="2304"/>
             <w:vAlign w:val="center"/>
             <w:tcMar>
               <w:top w:w="90" w:type="dxa"/>
@@ -5859,7 +5922,38 @@
                 <w:rFonts w:ascii="Arial Unicode MS" w:hAnsi="Arial Unicode MS" w:eastAsia="Arial Unicode MS"/>
                 <w:b w:val="0"/>
                 <w:color w:val="000000"/>
-                <w:sz w:val="17"/>
+                <w:sz w:val="16"/>
+              </w:rPr>
+              <w:t>0.5550</w:t>
+            </w:r>
+          </w:p>
+        </w:tc>
+        <w:tc>
+          <w:tcPr>
+            <w:tcW w:type="dxa" w:w="1944"/>
+            <w:vAlign w:val="center"/>
+            <w:tcMar>
+              <w:top w:w="90" w:type="dxa"/>
+              <w:start w:w="100" w:type="dxa"/>
+              <w:bottom w:w="90" w:type="dxa"/>
+              <w:end w:w="100" w:type="dxa"/>
+            </w:tcMar>
+            <w:shd w:fill="EAF2F8"/>
+          </w:tcPr>
+          <w:p>
+            <w:pPr>
+              <w:keepNext w:val="0"/>
+              <w:widowControl/>
+              <w:spacing w:before="0" w:after="0" w:line="264" w:lineRule="auto"/>
+              <w:jc w:val="center"/>
+            </w:pPr>
+            <w:r/>
+            <w:r>
+              <w:rPr>
+                <w:rFonts w:ascii="Arial Unicode MS" w:hAnsi="Arial Unicode MS" w:eastAsia="Arial Unicode MS"/>
+                <w:b w:val="0"/>
+                <w:color w:val="000000"/>
+                <w:sz w:val="16"/>
               </w:rPr>
               <w:t>0.5695</w:t>
             </w:r>
@@ -5869,7 +5963,7 @@
       <w:tr>
         <w:tc>
           <w:tcPr>
-            <w:tcW w:type="dxa" w:w="1655"/>
+            <w:tcW w:type="dxa" w:w="1368"/>
             <w:vAlign w:val="center"/>
             <w:tcMar>
               <w:top w:w="90" w:type="dxa"/>
@@ -5892,7 +5986,7 @@
                 <w:rFonts w:ascii="Arial Unicode MS" w:hAnsi="Arial Unicode MS" w:eastAsia="Arial Unicode MS"/>
                 <w:b w:val="0"/>
                 <w:color w:val="000000"/>
-                <w:sz w:val="17"/>
+                <w:sz w:val="16"/>
               </w:rPr>
               <w:t>2026Q3</w:t>
             </w:r>
@@ -5923,15 +6017,15 @@
                 <w:rFonts w:ascii="Arial Unicode MS" w:hAnsi="Arial Unicode MS" w:eastAsia="Arial Unicode MS"/>
                 <w:b w:val="0"/>
                 <w:color w:val="000000"/>
-                <w:sz w:val="17"/>
+                <w:sz w:val="16"/>
               </w:rPr>
-              <w:t>8.566%</w:t>
+              <w:t>4.170%</w:t>
             </w:r>
           </w:p>
         </w:tc>
         <w:tc>
           <w:tcPr>
-            <w:tcW w:type="dxa" w:w="3096"/>
+            <w:tcW w:type="dxa" w:w="2088"/>
             <w:vAlign w:val="center"/>
             <w:tcMar>
               <w:top w:w="90" w:type="dxa"/>
@@ -5954,15 +6048,15 @@
                 <w:rFonts w:ascii="Arial Unicode MS" w:hAnsi="Arial Unicode MS" w:eastAsia="Arial Unicode MS"/>
                 <w:b w:val="0"/>
                 <w:color w:val="000000"/>
-                <w:sz w:val="17"/>
+                <w:sz w:val="16"/>
               </w:rPr>
-              <w:t>+1.3345</w:t>
+              <w:t>8.566%</w:t>
             </w:r>
           </w:p>
         </w:tc>
         <w:tc>
           <w:tcPr>
-            <w:tcW w:type="dxa" w:w="2664"/>
+            <w:tcW w:type="dxa" w:w="2304"/>
             <w:vAlign w:val="center"/>
             <w:tcMar>
               <w:top w:w="90" w:type="dxa"/>
@@ -5985,7 +6079,38 @@
                 <w:rFonts w:ascii="Arial Unicode MS" w:hAnsi="Arial Unicode MS" w:eastAsia="Arial Unicode MS"/>
                 <w:b w:val="0"/>
                 <w:color w:val="000000"/>
-                <w:sz w:val="17"/>
+                <w:sz w:val="16"/>
+              </w:rPr>
+              <w:t>0.5568</w:t>
+            </w:r>
+          </w:p>
+        </w:tc>
+        <w:tc>
+          <w:tcPr>
+            <w:tcW w:type="dxa" w:w="1944"/>
+            <w:vAlign w:val="center"/>
+            <w:tcMar>
+              <w:top w:w="90" w:type="dxa"/>
+              <w:start w:w="100" w:type="dxa"/>
+              <w:bottom w:w="90" w:type="dxa"/>
+              <w:end w:w="100" w:type="dxa"/>
+            </w:tcMar>
+            <w:shd w:fill="FFFFFF"/>
+          </w:tcPr>
+          <w:p>
+            <w:pPr>
+              <w:keepNext w:val="0"/>
+              <w:widowControl/>
+              <w:spacing w:before="0" w:after="0" w:line="264" w:lineRule="auto"/>
+              <w:jc w:val="center"/>
+            </w:pPr>
+            <w:r/>
+            <w:r>
+              <w:rPr>
+                <w:rFonts w:ascii="Arial Unicode MS" w:hAnsi="Arial Unicode MS" w:eastAsia="Arial Unicode MS"/>
+                <w:b w:val="0"/>
+                <w:color w:val="000000"/>
+                <w:sz w:val="16"/>
               </w:rPr>
               <w:t>0.5763</w:t>
             </w:r>
@@ -5995,7 +6120,7 @@
       <w:tr>
         <w:tc>
           <w:tcPr>
-            <w:tcW w:type="dxa" w:w="1655"/>
+            <w:tcW w:type="dxa" w:w="1368"/>
             <w:vAlign w:val="center"/>
             <w:tcMar>
               <w:top w:w="90" w:type="dxa"/>
@@ -6018,7 +6143,7 @@
                 <w:rFonts w:ascii="Arial Unicode MS" w:hAnsi="Arial Unicode MS" w:eastAsia="Arial Unicode MS"/>
                 <w:b w:val="0"/>
                 <w:color w:val="000000"/>
-                <w:sz w:val="17"/>
+                <w:sz w:val="16"/>
               </w:rPr>
               <w:t>2026Q4</w:t>
             </w:r>
@@ -6049,15 +6174,15 @@
                 <w:rFonts w:ascii="Arial Unicode MS" w:hAnsi="Arial Unicode MS" w:eastAsia="Arial Unicode MS"/>
                 <w:b w:val="0"/>
                 <w:color w:val="000000"/>
-                <w:sz w:val="17"/>
+                <w:sz w:val="16"/>
               </w:rPr>
-              <w:t>8.936%</w:t>
+              <w:t>4.303%</w:t>
             </w:r>
           </w:p>
         </w:tc>
         <w:tc>
           <w:tcPr>
-            <w:tcW w:type="dxa" w:w="3096"/>
+            <w:tcW w:type="dxa" w:w="2088"/>
             <w:vAlign w:val="center"/>
             <w:tcMar>
               <w:top w:w="90" w:type="dxa"/>
@@ -6080,15 +6205,15 @@
                 <w:rFonts w:ascii="Arial Unicode MS" w:hAnsi="Arial Unicode MS" w:eastAsia="Arial Unicode MS"/>
                 <w:b w:val="0"/>
                 <w:color w:val="000000"/>
-                <w:sz w:val="17"/>
+                <w:sz w:val="16"/>
               </w:rPr>
-              <w:t>+0.6664</w:t>
+              <w:t>8.936%</w:t>
             </w:r>
           </w:p>
         </w:tc>
         <w:tc>
           <w:tcPr>
-            <w:tcW w:type="dxa" w:w="2664"/>
+            <w:tcW w:type="dxa" w:w="2304"/>
             <w:vAlign w:val="center"/>
             <w:tcMar>
               <w:top w:w="90" w:type="dxa"/>
@@ -6111,7 +6236,38 @@
                 <w:rFonts w:ascii="Arial Unicode MS" w:hAnsi="Arial Unicode MS" w:eastAsia="Arial Unicode MS"/>
                 <w:b w:val="0"/>
                 <w:color w:val="000000"/>
-                <w:sz w:val="17"/>
+                <w:sz w:val="16"/>
+              </w:rPr>
+              <w:t>0.5579</w:t>
+            </w:r>
+          </w:p>
+        </w:tc>
+        <w:tc>
+          <w:tcPr>
+            <w:tcW w:type="dxa" w:w="1944"/>
+            <w:vAlign w:val="center"/>
+            <w:tcMar>
+              <w:top w:w="90" w:type="dxa"/>
+              <w:start w:w="100" w:type="dxa"/>
+              <w:bottom w:w="90" w:type="dxa"/>
+              <w:end w:w="100" w:type="dxa"/>
+            </w:tcMar>
+            <w:shd w:fill="EAF2F8"/>
+          </w:tcPr>
+          <w:p>
+            <w:pPr>
+              <w:keepNext w:val="0"/>
+              <w:widowControl/>
+              <w:spacing w:before="0" w:after="0" w:line="264" w:lineRule="auto"/>
+              <w:jc w:val="center"/>
+            </w:pPr>
+            <w:r/>
+            <w:r>
+              <w:rPr>
+                <w:rFonts w:ascii="Arial Unicode MS" w:hAnsi="Arial Unicode MS" w:eastAsia="Arial Unicode MS"/>
+                <w:b w:val="0"/>
+                <w:color w:val="000000"/>
+                <w:sz w:val="16"/>
               </w:rPr>
               <w:t>0.5767</w:t>
             </w:r>
@@ -6121,7 +6277,7 @@
       <w:tr>
         <w:tc>
           <w:tcPr>
-            <w:tcW w:type="dxa" w:w="1655"/>
+            <w:tcW w:type="dxa" w:w="1368"/>
             <w:vAlign w:val="center"/>
             <w:tcMar>
               <w:top w:w="90" w:type="dxa"/>
@@ -6144,7 +6300,7 @@
                 <w:rFonts w:ascii="Arial Unicode MS" w:hAnsi="Arial Unicode MS" w:eastAsia="Arial Unicode MS"/>
                 <w:b w:val="0"/>
                 <w:color w:val="000000"/>
-                <w:sz w:val="17"/>
+                <w:sz w:val="16"/>
               </w:rPr>
               <w:t>2027Q1</w:t>
             </w:r>
@@ -6175,15 +6331,15 @@
                 <w:rFonts w:ascii="Arial Unicode MS" w:hAnsi="Arial Unicode MS" w:eastAsia="Arial Unicode MS"/>
                 <w:b w:val="0"/>
                 <w:color w:val="000000"/>
-                <w:sz w:val="17"/>
+                <w:sz w:val="16"/>
               </w:rPr>
-              <w:t>9.191%</w:t>
+              <w:t>4.513%</w:t>
             </w:r>
           </w:p>
         </w:tc>
         <w:tc>
           <w:tcPr>
-            <w:tcW w:type="dxa" w:w="3096"/>
+            <w:tcW w:type="dxa" w:w="2088"/>
             <w:vAlign w:val="center"/>
             <w:tcMar>
               <w:top w:w="90" w:type="dxa"/>
@@ -6206,15 +6362,15 @@
                 <w:rFonts w:ascii="Arial Unicode MS" w:hAnsi="Arial Unicode MS" w:eastAsia="Arial Unicode MS"/>
                 <w:b w:val="0"/>
                 <w:color w:val="000000"/>
-                <w:sz w:val="17"/>
+                <w:sz w:val="16"/>
               </w:rPr>
-              <w:t>+0.3700</w:t>
+              <w:t>9.191%</w:t>
             </w:r>
           </w:p>
         </w:tc>
         <w:tc>
           <w:tcPr>
-            <w:tcW w:type="dxa" w:w="2664"/>
+            <w:tcW w:type="dxa" w:w="2304"/>
             <w:vAlign w:val="center"/>
             <w:tcMar>
               <w:top w:w="90" w:type="dxa"/>
@@ -6237,7 +6393,38 @@
                 <w:rFonts w:ascii="Arial Unicode MS" w:hAnsi="Arial Unicode MS" w:eastAsia="Arial Unicode MS"/>
                 <w:b w:val="0"/>
                 <w:color w:val="000000"/>
-                <w:sz w:val="17"/>
+                <w:sz w:val="16"/>
+              </w:rPr>
+              <w:t>0.5601</w:t>
+            </w:r>
+          </w:p>
+        </w:tc>
+        <w:tc>
+          <w:tcPr>
+            <w:tcW w:type="dxa" w:w="1944"/>
+            <w:vAlign w:val="center"/>
+            <w:tcMar>
+              <w:top w:w="90" w:type="dxa"/>
+              <w:start w:w="100" w:type="dxa"/>
+              <w:bottom w:w="90" w:type="dxa"/>
+              <w:end w:w="100" w:type="dxa"/>
+            </w:tcMar>
+            <w:shd w:fill="FFFFFF"/>
+          </w:tcPr>
+          <w:p>
+            <w:pPr>
+              <w:keepNext w:val="0"/>
+              <w:widowControl/>
+              <w:spacing w:before="0" w:after="0" w:line="264" w:lineRule="auto"/>
+              <w:jc w:val="center"/>
+            </w:pPr>
+            <w:r/>
+            <w:r>
+              <w:rPr>
+                <w:rFonts w:ascii="Arial Unicode MS" w:hAnsi="Arial Unicode MS" w:eastAsia="Arial Unicode MS"/>
+                <w:b w:val="0"/>
+                <w:color w:val="000000"/>
+                <w:sz w:val="16"/>
               </w:rPr>
               <w:t>0.5751</w:t>
             </w:r>
@@ -6247,7 +6434,7 @@
       <w:tr>
         <w:tc>
           <w:tcPr>
-            <w:tcW w:type="dxa" w:w="1655"/>
+            <w:tcW w:type="dxa" w:w="1368"/>
             <w:vAlign w:val="center"/>
             <w:tcMar>
               <w:top w:w="90" w:type="dxa"/>
@@ -6270,7 +6457,7 @@
                 <w:rFonts w:ascii="Arial Unicode MS" w:hAnsi="Arial Unicode MS" w:eastAsia="Arial Unicode MS"/>
                 <w:b w:val="0"/>
                 <w:color w:val="000000"/>
-                <w:sz w:val="17"/>
+                <w:sz w:val="16"/>
               </w:rPr>
               <w:t>2027Q2</w:t>
             </w:r>
@@ -6301,15 +6488,15 @@
                 <w:rFonts w:ascii="Arial Unicode MS" w:hAnsi="Arial Unicode MS" w:eastAsia="Arial Unicode MS"/>
                 <w:b w:val="0"/>
                 <w:color w:val="000000"/>
-                <w:sz w:val="17"/>
+                <w:sz w:val="16"/>
               </w:rPr>
-              <w:t>9.359%</w:t>
+              <w:t>4.623%</w:t>
             </w:r>
           </w:p>
         </w:tc>
         <w:tc>
           <w:tcPr>
-            <w:tcW w:type="dxa" w:w="3096"/>
+            <w:tcW w:type="dxa" w:w="2088"/>
             <w:vAlign w:val="center"/>
             <w:tcMar>
               <w:top w:w="90" w:type="dxa"/>
@@ -6332,15 +6519,15 @@
                 <w:rFonts w:ascii="Arial Unicode MS" w:hAnsi="Arial Unicode MS" w:eastAsia="Arial Unicode MS"/>
                 <w:b w:val="0"/>
                 <w:color w:val="000000"/>
-                <w:sz w:val="17"/>
+                <w:sz w:val="16"/>
               </w:rPr>
-              <w:t>+0.2548</w:t>
+              <w:t>9.359%</w:t>
             </w:r>
           </w:p>
         </w:tc>
         <w:tc>
           <w:tcPr>
-            <w:tcW w:type="dxa" w:w="2664"/>
+            <w:tcW w:type="dxa" w:w="2304"/>
             <w:vAlign w:val="center"/>
             <w:tcMar>
               <w:top w:w="90" w:type="dxa"/>
@@ -6363,7 +6550,38 @@
                 <w:rFonts w:ascii="Arial Unicode MS" w:hAnsi="Arial Unicode MS" w:eastAsia="Arial Unicode MS"/>
                 <w:b w:val="0"/>
                 <w:color w:val="000000"/>
-                <w:sz w:val="17"/>
+                <w:sz w:val="16"/>
+              </w:rPr>
+              <w:t>0.5622</w:t>
+            </w:r>
+          </w:p>
+        </w:tc>
+        <w:tc>
+          <w:tcPr>
+            <w:tcW w:type="dxa" w:w="1944"/>
+            <w:vAlign w:val="center"/>
+            <w:tcMar>
+              <w:top w:w="90" w:type="dxa"/>
+              <w:start w:w="100" w:type="dxa"/>
+              <w:bottom w:w="90" w:type="dxa"/>
+              <w:end w:w="100" w:type="dxa"/>
+            </w:tcMar>
+            <w:shd w:fill="EAF2F8"/>
+          </w:tcPr>
+          <w:p>
+            <w:pPr>
+              <w:keepNext w:val="0"/>
+              <w:widowControl/>
+              <w:spacing w:before="0" w:after="0" w:line="264" w:lineRule="auto"/>
+              <w:jc w:val="center"/>
+            </w:pPr>
+            <w:r/>
+            <w:r>
+              <w:rPr>
+                <w:rFonts w:ascii="Arial Unicode MS" w:hAnsi="Arial Unicode MS" w:eastAsia="Arial Unicode MS"/>
+                <w:b w:val="0"/>
+                <w:color w:val="000000"/>
+                <w:sz w:val="16"/>
               </w:rPr>
               <w:t>0.5732</w:t>
             </w:r>
@@ -6373,7 +6591,7 @@
       <w:tr>
         <w:tc>
           <w:tcPr>
-            <w:tcW w:type="dxa" w:w="1655"/>
+            <w:tcW w:type="dxa" w:w="1368"/>
             <w:vAlign w:val="center"/>
             <w:tcMar>
               <w:top w:w="90" w:type="dxa"/>
@@ -6396,7 +6614,7 @@
                 <w:rFonts w:ascii="Arial Unicode MS" w:hAnsi="Arial Unicode MS" w:eastAsia="Arial Unicode MS"/>
                 <w:b w:val="0"/>
                 <w:color w:val="000000"/>
-                <w:sz w:val="17"/>
+                <w:sz w:val="16"/>
               </w:rPr>
               <w:t>2027Q3</w:t>
             </w:r>
@@ -6427,15 +6645,15 @@
                 <w:rFonts w:ascii="Arial Unicode MS" w:hAnsi="Arial Unicode MS" w:eastAsia="Arial Unicode MS"/>
                 <w:b w:val="0"/>
                 <w:color w:val="000000"/>
-                <w:sz w:val="17"/>
+                <w:sz w:val="16"/>
               </w:rPr>
-              <w:t>9.429%</w:t>
+              <w:t>4.703%</w:t>
             </w:r>
           </w:p>
         </w:tc>
         <w:tc>
           <w:tcPr>
-            <w:tcW w:type="dxa" w:w="3096"/>
+            <w:tcW w:type="dxa" w:w="2088"/>
             <w:vAlign w:val="center"/>
             <w:tcMar>
               <w:top w:w="90" w:type="dxa"/>
@@ -6458,15 +6676,15 @@
                 <w:rFonts w:ascii="Arial Unicode MS" w:hAnsi="Arial Unicode MS" w:eastAsia="Arial Unicode MS"/>
                 <w:b w:val="0"/>
                 <w:color w:val="000000"/>
-                <w:sz w:val="17"/>
+                <w:sz w:val="16"/>
               </w:rPr>
-              <w:t>+0.1674</w:t>
+              <w:t>9.429%</w:t>
             </w:r>
           </w:p>
         </w:tc>
         <w:tc>
           <w:tcPr>
-            <w:tcW w:type="dxa" w:w="2664"/>
+            <w:tcW w:type="dxa" w:w="2304"/>
             <w:vAlign w:val="center"/>
             <w:tcMar>
               <w:top w:w="90" w:type="dxa"/>
@@ -6489,7 +6707,38 @@
                 <w:rFonts w:ascii="Arial Unicode MS" w:hAnsi="Arial Unicode MS" w:eastAsia="Arial Unicode MS"/>
                 <w:b w:val="0"/>
                 <w:color w:val="000000"/>
-                <w:sz w:val="17"/>
+                <w:sz w:val="16"/>
+              </w:rPr>
+              <w:t>0.5631</w:t>
+            </w:r>
+          </w:p>
+        </w:tc>
+        <w:tc>
+          <w:tcPr>
+            <w:tcW w:type="dxa" w:w="1944"/>
+            <w:vAlign w:val="center"/>
+            <w:tcMar>
+              <w:top w:w="90" w:type="dxa"/>
+              <w:start w:w="100" w:type="dxa"/>
+              <w:bottom w:w="90" w:type="dxa"/>
+              <w:end w:w="100" w:type="dxa"/>
+            </w:tcMar>
+            <w:shd w:fill="FFFFFF"/>
+          </w:tcPr>
+          <w:p>
+            <w:pPr>
+              <w:keepNext w:val="0"/>
+              <w:widowControl/>
+              <w:spacing w:before="0" w:after="0" w:line="264" w:lineRule="auto"/>
+              <w:jc w:val="center"/>
+            </w:pPr>
+            <w:r/>
+            <w:r>
+              <w:rPr>
+                <w:rFonts w:ascii="Arial Unicode MS" w:hAnsi="Arial Unicode MS" w:eastAsia="Arial Unicode MS"/>
+                <w:b w:val="0"/>
+                <w:color w:val="000000"/>
+                <w:sz w:val="16"/>
               </w:rPr>
               <w:t>0.5713</w:t>
             </w:r>
@@ -6499,7 +6748,7 @@
       <w:tr>
         <w:tc>
           <w:tcPr>
-            <w:tcW w:type="dxa" w:w="1655"/>
+            <w:tcW w:type="dxa" w:w="1368"/>
             <w:vAlign w:val="center"/>
             <w:tcMar>
               <w:top w:w="90" w:type="dxa"/>
@@ -6522,7 +6771,7 @@
                 <w:rFonts w:ascii="Arial Unicode MS" w:hAnsi="Arial Unicode MS" w:eastAsia="Arial Unicode MS"/>
                 <w:b w:val="0"/>
                 <w:color w:val="000000"/>
-                <w:sz w:val="17"/>
+                <w:sz w:val="16"/>
               </w:rPr>
               <w:t>2027Q4</w:t>
             </w:r>
@@ -6553,15 +6802,15 @@
                 <w:rFonts w:ascii="Arial Unicode MS" w:hAnsi="Arial Unicode MS" w:eastAsia="Arial Unicode MS"/>
                 <w:b w:val="0"/>
                 <w:color w:val="000000"/>
-                <w:sz w:val="17"/>
+                <w:sz w:val="16"/>
               </w:rPr>
-              <w:t>9.456%</w:t>
+              <w:t>4.710%</w:t>
             </w:r>
           </w:p>
         </w:tc>
         <w:tc>
           <w:tcPr>
-            <w:tcW w:type="dxa" w:w="3096"/>
+            <w:tcW w:type="dxa" w:w="2088"/>
             <w:vAlign w:val="center"/>
             <w:tcMar>
               <w:top w:w="90" w:type="dxa"/>
@@ -6584,15 +6833,15 @@
                 <w:rFonts w:ascii="Arial Unicode MS" w:hAnsi="Arial Unicode MS" w:eastAsia="Arial Unicode MS"/>
                 <w:b w:val="0"/>
                 <w:color w:val="000000"/>
-                <w:sz w:val="17"/>
+                <w:sz w:val="16"/>
               </w:rPr>
-              <w:t>+0.0703</w:t>
+              <w:t>9.456%</w:t>
             </w:r>
           </w:p>
         </w:tc>
         <w:tc>
           <w:tcPr>
-            <w:tcW w:type="dxa" w:w="2664"/>
+            <w:tcW w:type="dxa" w:w="2304"/>
             <w:vAlign w:val="center"/>
             <w:tcMar>
               <w:top w:w="90" w:type="dxa"/>
@@ -6615,7 +6864,38 @@
                 <w:rFonts w:ascii="Arial Unicode MS" w:hAnsi="Arial Unicode MS" w:eastAsia="Arial Unicode MS"/>
                 <w:b w:val="0"/>
                 <w:color w:val="000000"/>
-                <w:sz w:val="17"/>
+                <w:sz w:val="16"/>
+              </w:rPr>
+              <w:t>0.5635</w:t>
+            </w:r>
+          </w:p>
+        </w:tc>
+        <w:tc>
+          <w:tcPr>
+            <w:tcW w:type="dxa" w:w="1944"/>
+            <w:vAlign w:val="center"/>
+            <w:tcMar>
+              <w:top w:w="90" w:type="dxa"/>
+              <w:start w:w="100" w:type="dxa"/>
+              <w:bottom w:w="90" w:type="dxa"/>
+              <w:end w:w="100" w:type="dxa"/>
+            </w:tcMar>
+            <w:shd w:fill="EAF2F8"/>
+          </w:tcPr>
+          <w:p>
+            <w:pPr>
+              <w:keepNext w:val="0"/>
+              <w:widowControl/>
+              <w:spacing w:before="0" w:after="0" w:line="264" w:lineRule="auto"/>
+              <w:jc w:val="center"/>
+            </w:pPr>
+            <w:r/>
+            <w:r>
+              <w:rPr>
+                <w:rFonts w:ascii="Arial Unicode MS" w:hAnsi="Arial Unicode MS" w:eastAsia="Arial Unicode MS"/>
+                <w:b w:val="0"/>
+                <w:color w:val="000000"/>
+                <w:sz w:val="16"/>
               </w:rPr>
               <w:t>0.5693</w:t>
             </w:r>
@@ -6625,7 +6905,7 @@
       <w:tr>
         <w:tc>
           <w:tcPr>
-            <w:tcW w:type="dxa" w:w="1655"/>
+            <w:tcW w:type="dxa" w:w="1368"/>
             <w:vAlign w:val="center"/>
             <w:tcMar>
               <w:top w:w="90" w:type="dxa"/>
@@ -6648,7 +6928,7 @@
                 <w:rFonts w:ascii="Arial Unicode MS" w:hAnsi="Arial Unicode MS" w:eastAsia="Arial Unicode MS"/>
                 <w:b w:val="0"/>
                 <w:color w:val="000000"/>
-                <w:sz w:val="17"/>
+                <w:sz w:val="16"/>
               </w:rPr>
               <w:t>2028Q1</w:t>
             </w:r>
@@ -6679,15 +6959,15 @@
                 <w:rFonts w:ascii="Arial Unicode MS" w:hAnsi="Arial Unicode MS" w:eastAsia="Arial Unicode MS"/>
                 <w:b w:val="0"/>
                 <w:color w:val="000000"/>
-                <w:sz w:val="17"/>
+                <w:sz w:val="16"/>
               </w:rPr>
-              <w:t>9.428%</w:t>
+              <w:t>4.680%</w:t>
             </w:r>
           </w:p>
         </w:tc>
         <w:tc>
           <w:tcPr>
-            <w:tcW w:type="dxa" w:w="3096"/>
+            <w:tcW w:type="dxa" w:w="2088"/>
             <w:vAlign w:val="center"/>
             <w:tcMar>
               <w:top w:w="90" w:type="dxa"/>
@@ -6710,15 +6990,15 @@
                 <w:rFonts w:ascii="Arial Unicode MS" w:hAnsi="Arial Unicode MS" w:eastAsia="Arial Unicode MS"/>
                 <w:b w:val="0"/>
                 <w:color w:val="000000"/>
-                <w:sz w:val="17"/>
+                <w:sz w:val="16"/>
               </w:rPr>
-              <w:t>+0.0271</w:t>
+              <w:t>9.428%</w:t>
             </w:r>
           </w:p>
         </w:tc>
         <w:tc>
           <w:tcPr>
-            <w:tcW w:type="dxa" w:w="2664"/>
+            <w:tcW w:type="dxa" w:w="2304"/>
             <w:vAlign w:val="center"/>
             <w:tcMar>
               <w:top w:w="90" w:type="dxa"/>
@@ -6741,7 +7021,38 @@
                 <w:rFonts w:ascii="Arial Unicode MS" w:hAnsi="Arial Unicode MS" w:eastAsia="Arial Unicode MS"/>
                 <w:b w:val="0"/>
                 <w:color w:val="000000"/>
-                <w:sz w:val="17"/>
+                <w:sz w:val="16"/>
+              </w:rPr>
+              <w:t>0.5633</w:t>
+            </w:r>
+          </w:p>
+        </w:tc>
+        <w:tc>
+          <w:tcPr>
+            <w:tcW w:type="dxa" w:w="1944"/>
+            <w:vAlign w:val="center"/>
+            <w:tcMar>
+              <w:top w:w="90" w:type="dxa"/>
+              <w:start w:w="100" w:type="dxa"/>
+              <w:bottom w:w="90" w:type="dxa"/>
+              <w:end w:w="100" w:type="dxa"/>
+            </w:tcMar>
+            <w:shd w:fill="FFFFFF"/>
+          </w:tcPr>
+          <w:p>
+            <w:pPr>
+              <w:keepNext w:val="0"/>
+              <w:widowControl/>
+              <w:spacing w:before="0" w:after="0" w:line="264" w:lineRule="auto"/>
+              <w:jc w:val="center"/>
+            </w:pPr>
+            <w:r/>
+            <w:r>
+              <w:rPr>
+                <w:rFonts w:ascii="Arial Unicode MS" w:hAnsi="Arial Unicode MS" w:eastAsia="Arial Unicode MS"/>
+                <w:b w:val="0"/>
+                <w:color w:val="000000"/>
+                <w:sz w:val="16"/>
               </w:rPr>
               <w:t>0.5676</w:t>
             </w:r>
@@ -6766,7 +7077,7 @@
         <w:drawing>
           <wp:inline xmlns:a="http://schemas.openxmlformats.org/drawingml/2006/main" xmlns:pic="http://schemas.openxmlformats.org/drawingml/2006/picture">
             <wp:extent cx="5897880" cy="2801493"/>
-            <wp:docPr id="4" name="Picture 4" title="ER forecast under S4" descr="Dynamic recursive ER forecasts from 2026Q1 through 2028Q1 using the final unemployment ARDL model and the S4 unemployment path."/>
+            <wp:docPr id="4" name="Picture 4" title="ER forecasts under Baseline and S4" descr="Dynamic recursive ER forecasts from 2026Q1 through 2028Q1 using the final unemployment ARDL model and the Baseline and S4 unemployment paths."/>
             <wp:cNvGraphicFramePr>
               <a:graphicFrameLocks noChangeAspect="1"/>
             </wp:cNvGraphicFramePr>
@@ -6774,7 +7085,7 @@
               <a:graphicData uri="http://schemas.openxmlformats.org/drawingml/2006/picture">
                 <pic:pic>
                   <pic:nvPicPr>
-                    <pic:cNvPr id="0" name="s4_er_forecast_en.png"/>
+                    <pic:cNvPr id="0" name="baseline_s4_er_forecast_en.png"/>
                     <pic:cNvPicPr/>
                   </pic:nvPicPr>
                   <pic:blipFill>
@@ -6811,7 +7122,7 @@
           <w:color w:val="666666"/>
           <w:sz w:val="18"/>
         </w:rPr>
-        <w:t>Figure 4  Recursive ER forecast under the S4 scenario</w:t>
+        <w:t>Figure 4  Recursive ER forecasts under the Baseline and S4 scenarios</w:t>
       </w:r>
     </w:p>
     <w:p>
@@ -6826,7 +7137,7 @@
           <w:color w:val="000000"/>
           <w:sz w:val="21"/>
         </w:rPr>
-        <w:t>Under S4, ER rises from 0.5530 in 2026Q1 to about 0.5767 in 2026Q4. It then declines gradually as increases in unemployment become smaller, reaching 0.5676 in 2028Q1. The average forecast across the nine quarters is 0.5702. ER is a ratio, so the simple sum of the nine quarterly forecasts does not have a direct economic total interpretation.</w:t>
+        <w:t>Both forecasts begin at 0.5530 in 2026Q1 because they use the same observed lagged unemployment change. Under Baseline, ER rises gradually to 0.5635 in 2027Q4 and ends at 0.5633 in 2028Q1; its nine quarter average is 0.5594. Under S4, ER rises to about 0.5767 in 2026Q4 and then declines as the unemployment increases become smaller, ending at 0.5676; its nine quarter average is 0.5702. The S4 forecast exceeds Baseline by 0.0043 in 2028Q1. ER is a ratio, so the simple sum of quarterly forecasts does not have a direct economic total interpretation.</w:t>
       </w:r>
     </w:p>
     <w:p>
@@ -7006,7 +7317,7 @@
           <w:color w:val="000000"/>
           <w:sz w:val="21"/>
         </w:rPr>
-        <w:t>S4 forecast path  Quarterly unemployment rates from 2026Q1 through 2028Q1.</w:t>
+        <w:t>Forecast paths  Baseline and S4 quarterly unemployment rates from 2026Q1 through 2028Q1.</w:t>
       </w:r>
     </w:p>
     <w:sectPr>

</xml_diff>

<commit_message>
Add unemployment forecast sensitivity test
</commit_message>
<xml_diff>
--- a/Bank_ER_ARDL_Analysis_Report_EN.docx
+++ b/Bank_ER_ARDL_Analysis_Report_EN.docx
@@ -117,6 +117,7 @@
       <w:tr>
         <w:trPr>
           <w:tblHeader w:val="true"/>
+          <w:cantSplit w:val="true"/>
         </w:trPr>
         <w:tc>
           <w:tcPr>
@@ -213,6 +214,9 @@
         </w:tc>
       </w:tr>
       <w:tr>
+        <w:trPr>
+          <w:cantSplit w:val="true"/>
+        </w:trPr>
         <w:tc>
           <w:tcPr>
             <w:tcW w:type="dxa" w:w="2232"/>
@@ -308,6 +312,9 @@
         </w:tc>
       </w:tr>
       <w:tr>
+        <w:trPr>
+          <w:cantSplit w:val="true"/>
+        </w:trPr>
         <w:tc>
           <w:tcPr>
             <w:tcW w:type="dxa" w:w="2232"/>
@@ -403,6 +410,9 @@
         </w:tc>
       </w:tr>
       <w:tr>
+        <w:trPr>
+          <w:cantSplit w:val="true"/>
+        </w:trPr>
         <w:tc>
           <w:tcPr>
             <w:tcW w:type="dxa" w:w="2232"/>
@@ -498,6 +508,9 @@
         </w:tc>
       </w:tr>
       <w:tr>
+        <w:trPr>
+          <w:cantSplit w:val="true"/>
+        </w:trPr>
         <w:tc>
           <w:tcPr>
             <w:tcW w:type="dxa" w:w="2232"/>
@@ -593,6 +606,9 @@
         </w:tc>
       </w:tr>
       <w:tr>
+        <w:trPr>
+          <w:cantSplit w:val="true"/>
+        </w:trPr>
         <w:tc>
           <w:tcPr>
             <w:tcW w:type="dxa" w:w="2232"/>
@@ -847,6 +863,7 @@
       <w:tr>
         <w:trPr>
           <w:tblHeader w:val="true"/>
+          <w:cantSplit w:val="true"/>
         </w:trPr>
         <w:tc>
           <w:tcPr>
@@ -943,6 +960,9 @@
         </w:tc>
       </w:tr>
       <w:tr>
+        <w:trPr>
+          <w:cantSplit w:val="true"/>
+        </w:trPr>
         <w:tc>
           <w:tcPr>
             <w:tcW w:type="dxa" w:w="2448"/>
@@ -1038,6 +1058,9 @@
         </w:tc>
       </w:tr>
       <w:tr>
+        <w:trPr>
+          <w:cantSplit w:val="true"/>
+        </w:trPr>
         <w:tc>
           <w:tcPr>
             <w:tcW w:type="dxa" w:w="2448"/>
@@ -1195,6 +1218,7 @@
       <w:tr>
         <w:trPr>
           <w:tblHeader w:val="true"/>
+          <w:cantSplit w:val="true"/>
         </w:trPr>
         <w:tc>
           <w:tcPr>
@@ -1291,6 +1315,9 @@
         </w:tc>
       </w:tr>
       <w:tr>
+        <w:trPr>
+          <w:cantSplit w:val="true"/>
+        </w:trPr>
         <w:tc>
           <w:tcPr>
             <w:tcW w:type="dxa" w:w="2592"/>
@@ -1386,6 +1413,9 @@
         </w:tc>
       </w:tr>
       <w:tr>
+        <w:trPr>
+          <w:cantSplit w:val="true"/>
+        </w:trPr>
         <w:tc>
           <w:tcPr>
             <w:tcW w:type="dxa" w:w="2592"/>
@@ -1737,6 +1767,7 @@
       <w:tr>
         <w:trPr>
           <w:tblHeader w:val="true"/>
+          <w:cantSplit w:val="true"/>
         </w:trPr>
         <w:tc>
           <w:tcPr>
@@ -1864,6 +1895,9 @@
         </w:tc>
       </w:tr>
       <w:tr>
+        <w:trPr>
+          <w:cantSplit w:val="true"/>
+        </w:trPr>
         <w:tc>
           <w:tcPr>
             <w:tcW w:type="dxa" w:w="2592"/>
@@ -1990,6 +2024,9 @@
         </w:tc>
       </w:tr>
       <w:tr>
+        <w:trPr>
+          <w:cantSplit w:val="true"/>
+        </w:trPr>
         <w:tc>
           <w:tcPr>
             <w:tcW w:type="dxa" w:w="2592"/>
@@ -2116,6 +2153,9 @@
         </w:tc>
       </w:tr>
       <w:tr>
+        <w:trPr>
+          <w:cantSplit w:val="true"/>
+        </w:trPr>
         <w:tc>
           <w:tcPr>
             <w:tcW w:type="dxa" w:w="2592"/>
@@ -2242,6 +2282,9 @@
         </w:tc>
       </w:tr>
       <w:tr>
+        <w:trPr>
+          <w:cantSplit w:val="true"/>
+        </w:trPr>
         <w:tc>
           <w:tcPr>
             <w:tcW w:type="dxa" w:w="2592"/>
@@ -2438,6 +2481,7 @@
       <w:tr>
         <w:trPr>
           <w:tblHeader w:val="true"/>
+          <w:cantSplit w:val="true"/>
         </w:trPr>
         <w:tc>
           <w:tcPr>
@@ -2627,6 +2671,9 @@
         </w:tc>
       </w:tr>
       <w:tr>
+        <w:trPr>
+          <w:cantSplit w:val="true"/>
+        </w:trPr>
         <w:tc>
           <w:tcPr>
             <w:tcW w:type="dxa" w:w="1944"/>
@@ -2815,6 +2862,9 @@
         </w:tc>
       </w:tr>
       <w:tr>
+        <w:trPr>
+          <w:cantSplit w:val="true"/>
+        </w:trPr>
         <w:tc>
           <w:tcPr>
             <w:tcW w:type="dxa" w:w="1944"/>
@@ -3003,6 +3053,9 @@
         </w:tc>
       </w:tr>
       <w:tr>
+        <w:trPr>
+          <w:cantSplit w:val="true"/>
+        </w:trPr>
         <w:tc>
           <w:tcPr>
             <w:tcW w:type="dxa" w:w="1944"/>
@@ -3466,6 +3519,7 @@
       <w:tr>
         <w:trPr>
           <w:tblHeader w:val="true"/>
+          <w:cantSplit w:val="true"/>
         </w:trPr>
         <w:tc>
           <w:tcPr>
@@ -3655,6 +3709,9 @@
         </w:tc>
       </w:tr>
       <w:tr>
+        <w:trPr>
+          <w:cantSplit w:val="true"/>
+        </w:trPr>
         <w:tc>
           <w:tcPr>
             <w:tcW w:type="dxa" w:w="1512"/>
@@ -3843,6 +3900,9 @@
         </w:tc>
       </w:tr>
       <w:tr>
+        <w:trPr>
+          <w:cantSplit w:val="true"/>
+        </w:trPr>
         <w:tc>
           <w:tcPr>
             <w:tcW w:type="dxa" w:w="1512"/>
@@ -4031,6 +4091,9 @@
         </w:tc>
       </w:tr>
       <w:tr>
+        <w:trPr>
+          <w:cantSplit w:val="true"/>
+        </w:trPr>
         <w:tc>
           <w:tcPr>
             <w:tcW w:type="dxa" w:w="1512"/>
@@ -4219,6 +4282,9 @@
         </w:tc>
       </w:tr>
       <w:tr>
+        <w:trPr>
+          <w:cantSplit w:val="true"/>
+        </w:trPr>
         <w:tc>
           <w:tcPr>
             <w:tcW w:type="dxa" w:w="1512"/>
@@ -4407,6 +4473,9 @@
         </w:tc>
       </w:tr>
       <w:tr>
+        <w:trPr>
+          <w:cantSplit w:val="true"/>
+        </w:trPr>
         <w:tc>
           <w:tcPr>
             <w:tcW w:type="dxa" w:w="1512"/>
@@ -4595,6 +4664,9 @@
         </w:tc>
       </w:tr>
       <w:tr>
+        <w:trPr>
+          <w:cantSplit w:val="true"/>
+        </w:trPr>
         <w:tc>
           <w:tcPr>
             <w:tcW w:type="dxa" w:w="1512"/>
@@ -4783,6 +4855,9 @@
         </w:tc>
       </w:tr>
       <w:tr>
+        <w:trPr>
+          <w:cantSplit w:val="true"/>
+        </w:trPr>
         <w:tc>
           <w:tcPr>
             <w:tcW w:type="dxa" w:w="1512"/>
@@ -4971,6 +5046,9 @@
         </w:tc>
       </w:tr>
       <w:tr>
+        <w:trPr>
+          <w:cantSplit w:val="true"/>
+        </w:trPr>
         <w:tc>
           <w:tcPr>
             <w:tcW w:type="dxa" w:w="1512"/>
@@ -5159,6 +5237,9 @@
         </w:tc>
       </w:tr>
       <w:tr>
+        <w:trPr>
+          <w:cantSplit w:val="true"/>
+        </w:trPr>
         <w:tc>
           <w:tcPr>
             <w:tcW w:type="dxa" w:w="1512"/>
@@ -5489,6 +5570,7 @@
       <w:tr>
         <w:trPr>
           <w:tblHeader w:val="true"/>
+          <w:cantSplit w:val="true"/>
         </w:trPr>
         <w:tc>
           <w:tcPr>
@@ -5647,6 +5729,9 @@
         </w:tc>
       </w:tr>
       <w:tr>
+        <w:trPr>
+          <w:cantSplit w:val="true"/>
+        </w:trPr>
         <w:tc>
           <w:tcPr>
             <w:tcW w:type="dxa" w:w="1368"/>
@@ -5804,6 +5889,9 @@
         </w:tc>
       </w:tr>
       <w:tr>
+        <w:trPr>
+          <w:cantSplit w:val="true"/>
+        </w:trPr>
         <w:tc>
           <w:tcPr>
             <w:tcW w:type="dxa" w:w="1368"/>
@@ -5961,6 +6049,9 @@
         </w:tc>
       </w:tr>
       <w:tr>
+        <w:trPr>
+          <w:cantSplit w:val="true"/>
+        </w:trPr>
         <w:tc>
           <w:tcPr>
             <w:tcW w:type="dxa" w:w="1368"/>
@@ -6118,6 +6209,9 @@
         </w:tc>
       </w:tr>
       <w:tr>
+        <w:trPr>
+          <w:cantSplit w:val="true"/>
+        </w:trPr>
         <w:tc>
           <w:tcPr>
             <w:tcW w:type="dxa" w:w="1368"/>
@@ -6275,6 +6369,9 @@
         </w:tc>
       </w:tr>
       <w:tr>
+        <w:trPr>
+          <w:cantSplit w:val="true"/>
+        </w:trPr>
         <w:tc>
           <w:tcPr>
             <w:tcW w:type="dxa" w:w="1368"/>
@@ -6432,6 +6529,9 @@
         </w:tc>
       </w:tr>
       <w:tr>
+        <w:trPr>
+          <w:cantSplit w:val="true"/>
+        </w:trPr>
         <w:tc>
           <w:tcPr>
             <w:tcW w:type="dxa" w:w="1368"/>
@@ -6589,6 +6689,9 @@
         </w:tc>
       </w:tr>
       <w:tr>
+        <w:trPr>
+          <w:cantSplit w:val="true"/>
+        </w:trPr>
         <w:tc>
           <w:tcPr>
             <w:tcW w:type="dxa" w:w="1368"/>
@@ -6746,6 +6849,9 @@
         </w:tc>
       </w:tr>
       <w:tr>
+        <w:trPr>
+          <w:cantSplit w:val="true"/>
+        </w:trPr>
         <w:tc>
           <w:tcPr>
             <w:tcW w:type="dxa" w:w="1368"/>
@@ -6903,6 +7009,9 @@
         </w:tc>
       </w:tr>
       <w:tr>
+        <w:trPr>
+          <w:cantSplit w:val="true"/>
+        </w:trPr>
         <w:tc>
           <w:tcPr>
             <w:tcW w:type="dxa" w:w="1368"/>
@@ -7138,6 +7247,1784 @@
           <w:sz w:val="21"/>
         </w:rPr>
         <w:t>Both forecasts begin at 0.5530 in 2026Q1 because they use the same observed lagged unemployment change. Under Baseline, ER rises gradually to 0.5635 in 2027Q4 and ends at 0.5633 in 2028Q1; its nine quarter average is 0.5594. Under S4, ER rises to about 0.5767 in 2026Q4 and then declines as the unemployment increases become smaller, ending at 0.5676; its nine quarter average is 0.5702. The S4 forecast exceeds Baseline by 0.0043 in 2028Q1. ER is a ratio, so the simple sum of quarterly forecasts does not have a direct economic total interpretation.</w:t>
+      </w:r>
+    </w:p>
+    <w:p>
+      <w:r>
+        <w:br w:type="page"/>
+      </w:r>
+    </w:p>
+    <w:p>
+      <w:pPr>
+        <w:pStyle w:val="Heading1"/>
+        <w:keepNext/>
+        <w:widowControl/>
+        <w:spacing w:before="220" w:after="100"/>
+      </w:pPr>
+      <w:r>
+        <w:rPr>
+          <w:rFonts w:ascii="Arial Unicode MS" w:hAnsi="Arial Unicode MS" w:eastAsia="Arial Unicode MS"/>
+          <w:b/>
+          <w:color w:val="000000"/>
+          <w:sz w:val="28"/>
+        </w:rPr>
+        <w:t>Unemployment Rate Sensitivity Test</w:t>
+      </w:r>
+    </w:p>
+    <w:p>
+      <w:pPr>
+        <w:keepNext w:val="0"/>
+        <w:widowControl/>
+        <w:spacing w:before="0" w:after="100" w:line="300" w:lineRule="auto"/>
+      </w:pPr>
+      <w:r>
+        <w:rPr>
+          <w:rFonts w:ascii="Arial Unicode MS" w:hAnsi="Arial Unicode MS" w:eastAsia="Arial Unicode MS"/>
+          <w:color w:val="000000"/>
+          <w:sz w:val="21"/>
+        </w:rPr>
+        <w:t>The sensitivity test applies a parallel one percentage point decrease and increase to the full Baseline unemployment path from 2026Q1 onward. This is a level sensitivity, not a 1 percent relative change and not an additional one percentage point shock in every quarter. The model coefficients, actual 2025Q4 ER starting value, recursive forecast method, and all other assumptions remain unchanged.</w:t>
+      </w:r>
+    </w:p>
+    <w:p>
+      <w:pPr>
+        <w:keepNext w:val="0"/>
+        <w:widowControl/>
+        <w:spacing w:before="0" w:after="100" w:line="300" w:lineRule="auto"/>
+      </w:pPr>
+      <w:r>
+        <w:rPr>
+          <w:rFonts w:ascii="Arial Unicode MS" w:hAnsi="Arial Unicode MS" w:eastAsia="Arial Unicode MS"/>
+          <w:color w:val="000000"/>
+          <w:sz w:val="21"/>
+        </w:rPr>
+        <w:t>Because the model uses the one quarter lag of the change in unemployment, all three 2026Q1 ER forecasts are identical. The shifted paths first affect ER in 2026Q2 through the transition from the actual 2025Q4 unemployment rate to the shifted 2026Q1 level. Quarterly unemployment changes are identical across the three paths after that transition, so the initial effect declines through the ER autoregressive term.</w:t>
+      </w:r>
+    </w:p>
+    <w:p>
+      <w:pPr>
+        <w:keepNext/>
+        <w:spacing w:before="80" w:after="40"/>
+        <w:jc w:val="center"/>
+      </w:pPr>
+      <w:r>
+        <w:drawing>
+          <wp:inline xmlns:a="http://schemas.openxmlformats.org/drawingml/2006/main" xmlns:pic="http://schemas.openxmlformats.org/drawingml/2006/picture">
+            <wp:extent cx="5669280" cy="2692908"/>
+            <wp:docPr id="5" name="Picture 5" title="ER sensitivity to Baseline unemployment shifts" descr="Recursive ER forecasts under the Baseline unemployment path and parallel one percentage point downward and upward shifts from 2026Q1 through 2028Q1."/>
+            <wp:cNvGraphicFramePr>
+              <a:graphicFrameLocks noChangeAspect="1"/>
+            </wp:cNvGraphicFramePr>
+            <a:graphic>
+              <a:graphicData uri="http://schemas.openxmlformats.org/drawingml/2006/picture">
+                <pic:pic>
+                  <pic:nvPicPr>
+                    <pic:cNvPr id="0" name="baseline_unemployment_sensitivity_en.png"/>
+                    <pic:cNvPicPr/>
+                  </pic:nvPicPr>
+                  <pic:blipFill>
+                    <a:blip r:embed="rId14"/>
+                    <a:stretch>
+                      <a:fillRect/>
+                    </a:stretch>
+                  </pic:blipFill>
+                  <pic:spPr>
+                    <a:xfrm>
+                      <a:off x="0" y="0"/>
+                      <a:ext cx="5669280" cy="2692908"/>
+                    </a:xfrm>
+                    <a:prstGeom prst="rect"/>
+                  </pic:spPr>
+                </pic:pic>
+              </a:graphicData>
+            </a:graphic>
+          </wp:inline>
+        </w:drawing>
+      </w:r>
+    </w:p>
+    <w:p>
+      <w:pPr>
+        <w:keepNext w:val="0"/>
+        <w:widowControl/>
+        <w:spacing w:before="0" w:after="160" w:line="252" w:lineRule="auto"/>
+        <w:jc w:val="center"/>
+      </w:pPr>
+      <w:r>
+        <w:rPr>
+          <w:rFonts w:ascii="Arial Unicode MS" w:hAnsi="Arial Unicode MS" w:eastAsia="Arial Unicode MS"/>
+          <w:i/>
+          <w:color w:val="666666"/>
+          <w:sz w:val="18"/>
+        </w:rPr>
+        <w:t>Figure 5  ER forecast sensitivity to a one percentage point shift in Baseline unemployment</w:t>
+      </w:r>
+    </w:p>
+    <w:p>
+      <w:r>
+        <w:br w:type="page"/>
+      </w:r>
+    </w:p>
+    <w:p>
+      <w:pPr>
+        <w:pStyle w:val="Heading2"/>
+        <w:keepNext/>
+        <w:widowControl/>
+        <w:spacing w:before="140" w:after="100"/>
+      </w:pPr>
+      <w:r>
+        <w:rPr>
+          <w:rFonts w:ascii="Arial Unicode MS" w:hAnsi="Arial Unicode MS" w:eastAsia="Arial Unicode MS"/>
+          <w:b/>
+          <w:color w:val="000000"/>
+          <w:sz w:val="23"/>
+        </w:rPr>
+        <w:t>Sensitivity Results</w:t>
+      </w:r>
+    </w:p>
+    <w:tbl>
+      <w:tblPr>
+        <w:tblW w:type="auto" w:w="0"/>
+        <w:jc w:val="center"/>
+        <w:tblLayout w:type="fixed"/>
+        <w:tblLook w:firstColumn="1" w:firstRow="1" w:lastColumn="0" w:lastRow="0" w:noHBand="0" w:noVBand="1" w:val="04A0"/>
+        <w:tblBorders>
+          <w:top w:val="single" w:sz="6" w:space="0" w:color="D9D9D9"/>
+          <w:left w:val="single" w:sz="6" w:space="0" w:color="D9D9D9"/>
+          <w:bottom w:val="single" w:sz="6" w:space="0" w:color="D9D9D9"/>
+          <w:right w:val="single" w:sz="6" w:space="0" w:color="D9D9D9"/>
+          <w:insideH w:val="single" w:sz="6" w:space="0" w:color="D9D9D9"/>
+          <w:insideV w:val="single" w:sz="6" w:space="0" w:color="D9D9D9"/>
+        </w:tblBorders>
+      </w:tblPr>
+      <w:tblGrid>
+        <w:gridCol w:w="1999"/>
+        <w:gridCol w:w="1999"/>
+        <w:gridCol w:w="1999"/>
+        <w:gridCol w:w="1999"/>
+        <w:gridCol w:w="1999"/>
+      </w:tblGrid>
+      <w:tr>
+        <w:trPr>
+          <w:tblHeader w:val="true"/>
+          <w:cantSplit w:val="true"/>
+        </w:trPr>
+        <w:tc>
+          <w:tcPr>
+            <w:tcW w:type="dxa" w:w="1440"/>
+            <w:vAlign w:val="center"/>
+            <w:tcMar>
+              <w:top w:w="90" w:type="dxa"/>
+              <w:start w:w="100" w:type="dxa"/>
+              <w:bottom w:w="90" w:type="dxa"/>
+              <w:end w:w="100" w:type="dxa"/>
+            </w:tcMar>
+            <w:shd w:fill="1F4E78"/>
+          </w:tcPr>
+          <w:p>
+            <w:pPr>
+              <w:keepNext w:val="0"/>
+              <w:widowControl/>
+              <w:spacing w:before="0" w:after="0" w:line="264" w:lineRule="auto"/>
+              <w:jc w:val="center"/>
+            </w:pPr>
+            <w:r/>
+            <w:r>
+              <w:rPr>
+                <w:rFonts w:ascii="Arial Unicode MS" w:hAnsi="Arial Unicode MS" w:eastAsia="Arial Unicode MS"/>
+                <w:b/>
+                <w:color w:val="FFFFFF"/>
+                <w:sz w:val="16"/>
+              </w:rPr>
+              <w:t>Quarter</w:t>
+            </w:r>
+          </w:p>
+        </w:tc>
+        <w:tc>
+          <w:tcPr>
+            <w:tcW w:type="dxa" w:w="2160"/>
+            <w:vAlign w:val="center"/>
+            <w:tcMar>
+              <w:top w:w="90" w:type="dxa"/>
+              <w:start w:w="100" w:type="dxa"/>
+              <w:bottom w:w="90" w:type="dxa"/>
+              <w:end w:w="100" w:type="dxa"/>
+            </w:tcMar>
+            <w:shd w:fill="1F4E78"/>
+          </w:tcPr>
+          <w:p>
+            <w:pPr>
+              <w:keepNext w:val="0"/>
+              <w:widowControl/>
+              <w:spacing w:before="0" w:after="0" w:line="264" w:lineRule="auto"/>
+              <w:jc w:val="center"/>
+            </w:pPr>
+            <w:r/>
+            <w:r>
+              <w:rPr>
+                <w:rFonts w:ascii="Arial Unicode MS" w:hAnsi="Arial Unicode MS" w:eastAsia="Arial Unicode MS"/>
+                <w:b/>
+                <w:color w:val="FFFFFF"/>
+                <w:sz w:val="16"/>
+              </w:rPr>
+              <w:t>ER at minus 1 pp</w:t>
+            </w:r>
+          </w:p>
+        </w:tc>
+        <w:tc>
+          <w:tcPr>
+            <w:tcW w:type="dxa" w:w="1800"/>
+            <w:vAlign w:val="center"/>
+            <w:tcMar>
+              <w:top w:w="90" w:type="dxa"/>
+              <w:start w:w="100" w:type="dxa"/>
+              <w:bottom w:w="90" w:type="dxa"/>
+              <w:end w:w="100" w:type="dxa"/>
+            </w:tcMar>
+            <w:shd w:fill="1F4E78"/>
+          </w:tcPr>
+          <w:p>
+            <w:pPr>
+              <w:keepNext w:val="0"/>
+              <w:widowControl/>
+              <w:spacing w:before="0" w:after="0" w:line="264" w:lineRule="auto"/>
+              <w:jc w:val="center"/>
+            </w:pPr>
+            <w:r/>
+            <w:r>
+              <w:rPr>
+                <w:rFonts w:ascii="Arial Unicode MS" w:hAnsi="Arial Unicode MS" w:eastAsia="Arial Unicode MS"/>
+                <w:b/>
+                <w:color w:val="FFFFFF"/>
+                <w:sz w:val="16"/>
+              </w:rPr>
+              <w:t>Baseline ER</w:t>
+            </w:r>
+          </w:p>
+        </w:tc>
+        <w:tc>
+          <w:tcPr>
+            <w:tcW w:type="dxa" w:w="2160"/>
+            <w:vAlign w:val="center"/>
+            <w:tcMar>
+              <w:top w:w="90" w:type="dxa"/>
+              <w:start w:w="100" w:type="dxa"/>
+              <w:bottom w:w="90" w:type="dxa"/>
+              <w:end w:w="100" w:type="dxa"/>
+            </w:tcMar>
+            <w:shd w:fill="1F4E78"/>
+          </w:tcPr>
+          <w:p>
+            <w:pPr>
+              <w:keepNext w:val="0"/>
+              <w:widowControl/>
+              <w:spacing w:before="0" w:after="0" w:line="264" w:lineRule="auto"/>
+              <w:jc w:val="center"/>
+            </w:pPr>
+            <w:r/>
+            <w:r>
+              <w:rPr>
+                <w:rFonts w:ascii="Arial Unicode MS" w:hAnsi="Arial Unicode MS" w:eastAsia="Arial Unicode MS"/>
+                <w:b/>
+                <w:color w:val="FFFFFF"/>
+                <w:sz w:val="16"/>
+              </w:rPr>
+              <w:t>ER at plus 1 pp</w:t>
+            </w:r>
+          </w:p>
+        </w:tc>
+        <w:tc>
+          <w:tcPr>
+            <w:tcW w:type="dxa" w:w="2232"/>
+            <w:vAlign w:val="center"/>
+            <w:tcMar>
+              <w:top w:w="90" w:type="dxa"/>
+              <w:start w:w="100" w:type="dxa"/>
+              <w:bottom w:w="90" w:type="dxa"/>
+              <w:end w:w="100" w:type="dxa"/>
+            </w:tcMar>
+            <w:shd w:fill="1F4E78"/>
+          </w:tcPr>
+          <w:p>
+            <w:pPr>
+              <w:keepNext w:val="0"/>
+              <w:widowControl/>
+              <w:spacing w:before="0" w:after="0" w:line="264" w:lineRule="auto"/>
+              <w:jc w:val="center"/>
+            </w:pPr>
+            <w:r/>
+            <w:r>
+              <w:rPr>
+                <w:rFonts w:ascii="Arial Unicode MS" w:hAnsi="Arial Unicode MS" w:eastAsia="Arial Unicode MS"/>
+                <w:b/>
+                <w:color w:val="FFFFFF"/>
+                <w:sz w:val="16"/>
+              </w:rPr>
+              <w:t>Plus 1 pp effect</w:t>
+            </w:r>
+          </w:p>
+        </w:tc>
+      </w:tr>
+      <w:tr>
+        <w:trPr>
+          <w:cantSplit w:val="true"/>
+        </w:trPr>
+        <w:tc>
+          <w:tcPr>
+            <w:tcW w:type="dxa" w:w="1440"/>
+            <w:vAlign w:val="center"/>
+            <w:tcMar>
+              <w:top w:w="90" w:type="dxa"/>
+              <w:start w:w="100" w:type="dxa"/>
+              <w:bottom w:w="90" w:type="dxa"/>
+              <w:end w:w="100" w:type="dxa"/>
+            </w:tcMar>
+            <w:shd w:fill="FFFFFF"/>
+          </w:tcPr>
+          <w:p>
+            <w:pPr>
+              <w:keepNext w:val="0"/>
+              <w:widowControl/>
+              <w:spacing w:before="0" w:after="0" w:line="264" w:lineRule="auto"/>
+              <w:jc w:val="center"/>
+            </w:pPr>
+            <w:r/>
+            <w:r>
+              <w:rPr>
+                <w:rFonts w:ascii="Arial Unicode MS" w:hAnsi="Arial Unicode MS" w:eastAsia="Arial Unicode MS"/>
+                <w:b w:val="0"/>
+                <w:color w:val="000000"/>
+                <w:sz w:val="16"/>
+              </w:rPr>
+              <w:t>2026Q1</w:t>
+            </w:r>
+          </w:p>
+        </w:tc>
+        <w:tc>
+          <w:tcPr>
+            <w:tcW w:type="dxa" w:w="2160"/>
+            <w:vAlign w:val="center"/>
+            <w:tcMar>
+              <w:top w:w="90" w:type="dxa"/>
+              <w:start w:w="100" w:type="dxa"/>
+              <w:bottom w:w="90" w:type="dxa"/>
+              <w:end w:w="100" w:type="dxa"/>
+            </w:tcMar>
+            <w:shd w:fill="FFFFFF"/>
+          </w:tcPr>
+          <w:p>
+            <w:pPr>
+              <w:keepNext w:val="0"/>
+              <w:widowControl/>
+              <w:spacing w:before="0" w:after="0" w:line="264" w:lineRule="auto"/>
+              <w:jc w:val="center"/>
+            </w:pPr>
+            <w:r/>
+            <w:r>
+              <w:rPr>
+                <w:rFonts w:ascii="Arial Unicode MS" w:hAnsi="Arial Unicode MS" w:eastAsia="Arial Unicode MS"/>
+                <w:b w:val="0"/>
+                <w:color w:val="000000"/>
+                <w:sz w:val="16"/>
+              </w:rPr>
+              <w:t>0.5530</w:t>
+            </w:r>
+          </w:p>
+        </w:tc>
+        <w:tc>
+          <w:tcPr>
+            <w:tcW w:type="dxa" w:w="1800"/>
+            <w:vAlign w:val="center"/>
+            <w:tcMar>
+              <w:top w:w="90" w:type="dxa"/>
+              <w:start w:w="100" w:type="dxa"/>
+              <w:bottom w:w="90" w:type="dxa"/>
+              <w:end w:w="100" w:type="dxa"/>
+            </w:tcMar>
+            <w:shd w:fill="FFFFFF"/>
+          </w:tcPr>
+          <w:p>
+            <w:pPr>
+              <w:keepNext w:val="0"/>
+              <w:widowControl/>
+              <w:spacing w:before="0" w:after="0" w:line="264" w:lineRule="auto"/>
+              <w:jc w:val="center"/>
+            </w:pPr>
+            <w:r/>
+            <w:r>
+              <w:rPr>
+                <w:rFonts w:ascii="Arial Unicode MS" w:hAnsi="Arial Unicode MS" w:eastAsia="Arial Unicode MS"/>
+                <w:b w:val="0"/>
+                <w:color w:val="000000"/>
+                <w:sz w:val="16"/>
+              </w:rPr>
+              <w:t>0.5530</w:t>
+            </w:r>
+          </w:p>
+        </w:tc>
+        <w:tc>
+          <w:tcPr>
+            <w:tcW w:type="dxa" w:w="2160"/>
+            <w:vAlign w:val="center"/>
+            <w:tcMar>
+              <w:top w:w="90" w:type="dxa"/>
+              <w:start w:w="100" w:type="dxa"/>
+              <w:bottom w:w="90" w:type="dxa"/>
+              <w:end w:w="100" w:type="dxa"/>
+            </w:tcMar>
+            <w:shd w:fill="FFFFFF"/>
+          </w:tcPr>
+          <w:p>
+            <w:pPr>
+              <w:keepNext w:val="0"/>
+              <w:widowControl/>
+              <w:spacing w:before="0" w:after="0" w:line="264" w:lineRule="auto"/>
+              <w:jc w:val="center"/>
+            </w:pPr>
+            <w:r/>
+            <w:r>
+              <w:rPr>
+                <w:rFonts w:ascii="Arial Unicode MS" w:hAnsi="Arial Unicode MS" w:eastAsia="Arial Unicode MS"/>
+                <w:b w:val="0"/>
+                <w:color w:val="000000"/>
+                <w:sz w:val="16"/>
+              </w:rPr>
+              <w:t>0.5530</w:t>
+            </w:r>
+          </w:p>
+        </w:tc>
+        <w:tc>
+          <w:tcPr>
+            <w:tcW w:type="dxa" w:w="2232"/>
+            <w:vAlign w:val="center"/>
+            <w:tcMar>
+              <w:top w:w="90" w:type="dxa"/>
+              <w:start w:w="100" w:type="dxa"/>
+              <w:bottom w:w="90" w:type="dxa"/>
+              <w:end w:w="100" w:type="dxa"/>
+            </w:tcMar>
+            <w:shd w:fill="FFFFFF"/>
+          </w:tcPr>
+          <w:p>
+            <w:pPr>
+              <w:keepNext w:val="0"/>
+              <w:widowControl/>
+              <w:spacing w:before="0" w:after="0" w:line="264" w:lineRule="auto"/>
+              <w:jc w:val="center"/>
+            </w:pPr>
+            <w:r/>
+            <w:r>
+              <w:rPr>
+                <w:rFonts w:ascii="Arial Unicode MS" w:hAnsi="Arial Unicode MS" w:eastAsia="Arial Unicode MS"/>
+                <w:b w:val="0"/>
+                <w:color w:val="000000"/>
+                <w:sz w:val="16"/>
+              </w:rPr>
+              <w:t>+0.0000</w:t>
+            </w:r>
+          </w:p>
+        </w:tc>
+      </w:tr>
+      <w:tr>
+        <w:trPr>
+          <w:cantSplit w:val="true"/>
+        </w:trPr>
+        <w:tc>
+          <w:tcPr>
+            <w:tcW w:type="dxa" w:w="1440"/>
+            <w:vAlign w:val="center"/>
+            <w:tcMar>
+              <w:top w:w="90" w:type="dxa"/>
+              <w:start w:w="100" w:type="dxa"/>
+              <w:bottom w:w="90" w:type="dxa"/>
+              <w:end w:w="100" w:type="dxa"/>
+            </w:tcMar>
+            <w:shd w:fill="EAF2F8"/>
+          </w:tcPr>
+          <w:p>
+            <w:pPr>
+              <w:keepNext w:val="0"/>
+              <w:widowControl/>
+              <w:spacing w:before="0" w:after="0" w:line="264" w:lineRule="auto"/>
+              <w:jc w:val="center"/>
+            </w:pPr>
+            <w:r/>
+            <w:r>
+              <w:rPr>
+                <w:rFonts w:ascii="Arial Unicode MS" w:hAnsi="Arial Unicode MS" w:eastAsia="Arial Unicode MS"/>
+                <w:b w:val="0"/>
+                <w:color w:val="000000"/>
+                <w:sz w:val="16"/>
+              </w:rPr>
+              <w:t>2026Q2</w:t>
+            </w:r>
+          </w:p>
+        </w:tc>
+        <w:tc>
+          <w:tcPr>
+            <w:tcW w:type="dxa" w:w="2160"/>
+            <w:vAlign w:val="center"/>
+            <w:tcMar>
+              <w:top w:w="90" w:type="dxa"/>
+              <w:start w:w="100" w:type="dxa"/>
+              <w:bottom w:w="90" w:type="dxa"/>
+              <w:end w:w="100" w:type="dxa"/>
+            </w:tcMar>
+            <w:shd w:fill="EAF2F8"/>
+          </w:tcPr>
+          <w:p>
+            <w:pPr>
+              <w:keepNext w:val="0"/>
+              <w:widowControl/>
+              <w:spacing w:before="0" w:after="0" w:line="264" w:lineRule="auto"/>
+              <w:jc w:val="center"/>
+            </w:pPr>
+            <w:r/>
+            <w:r>
+              <w:rPr>
+                <w:rFonts w:ascii="Arial Unicode MS" w:hAnsi="Arial Unicode MS" w:eastAsia="Arial Unicode MS"/>
+                <w:b w:val="0"/>
+                <w:color w:val="000000"/>
+                <w:sz w:val="16"/>
+              </w:rPr>
+              <w:t>0.5485</w:t>
+            </w:r>
+          </w:p>
+        </w:tc>
+        <w:tc>
+          <w:tcPr>
+            <w:tcW w:type="dxa" w:w="1800"/>
+            <w:vAlign w:val="center"/>
+            <w:tcMar>
+              <w:top w:w="90" w:type="dxa"/>
+              <w:start w:w="100" w:type="dxa"/>
+              <w:bottom w:w="90" w:type="dxa"/>
+              <w:end w:w="100" w:type="dxa"/>
+            </w:tcMar>
+            <w:shd w:fill="EAF2F8"/>
+          </w:tcPr>
+          <w:p>
+            <w:pPr>
+              <w:keepNext w:val="0"/>
+              <w:widowControl/>
+              <w:spacing w:before="0" w:after="0" w:line="264" w:lineRule="auto"/>
+              <w:jc w:val="center"/>
+            </w:pPr>
+            <w:r/>
+            <w:r>
+              <w:rPr>
+                <w:rFonts w:ascii="Arial Unicode MS" w:hAnsi="Arial Unicode MS" w:eastAsia="Arial Unicode MS"/>
+                <w:b w:val="0"/>
+                <w:color w:val="000000"/>
+                <w:sz w:val="16"/>
+              </w:rPr>
+              <w:t>0.5550</w:t>
+            </w:r>
+          </w:p>
+        </w:tc>
+        <w:tc>
+          <w:tcPr>
+            <w:tcW w:type="dxa" w:w="2160"/>
+            <w:vAlign w:val="center"/>
+            <w:tcMar>
+              <w:top w:w="90" w:type="dxa"/>
+              <w:start w:w="100" w:type="dxa"/>
+              <w:bottom w:w="90" w:type="dxa"/>
+              <w:end w:w="100" w:type="dxa"/>
+            </w:tcMar>
+            <w:shd w:fill="EAF2F8"/>
+          </w:tcPr>
+          <w:p>
+            <w:pPr>
+              <w:keepNext w:val="0"/>
+              <w:widowControl/>
+              <w:spacing w:before="0" w:after="0" w:line="264" w:lineRule="auto"/>
+              <w:jc w:val="center"/>
+            </w:pPr>
+            <w:r/>
+            <w:r>
+              <w:rPr>
+                <w:rFonts w:ascii="Arial Unicode MS" w:hAnsi="Arial Unicode MS" w:eastAsia="Arial Unicode MS"/>
+                <w:b w:val="0"/>
+                <w:color w:val="000000"/>
+                <w:sz w:val="16"/>
+              </w:rPr>
+              <w:t>0.5615</w:t>
+            </w:r>
+          </w:p>
+        </w:tc>
+        <w:tc>
+          <w:tcPr>
+            <w:tcW w:type="dxa" w:w="2232"/>
+            <w:vAlign w:val="center"/>
+            <w:tcMar>
+              <w:top w:w="90" w:type="dxa"/>
+              <w:start w:w="100" w:type="dxa"/>
+              <w:bottom w:w="90" w:type="dxa"/>
+              <w:end w:w="100" w:type="dxa"/>
+            </w:tcMar>
+            <w:shd w:fill="EAF2F8"/>
+          </w:tcPr>
+          <w:p>
+            <w:pPr>
+              <w:keepNext w:val="0"/>
+              <w:widowControl/>
+              <w:spacing w:before="0" w:after="0" w:line="264" w:lineRule="auto"/>
+              <w:jc w:val="center"/>
+            </w:pPr>
+            <w:r/>
+            <w:r>
+              <w:rPr>
+                <w:rFonts w:ascii="Arial Unicode MS" w:hAnsi="Arial Unicode MS" w:eastAsia="Arial Unicode MS"/>
+                <w:b w:val="0"/>
+                <w:color w:val="000000"/>
+                <w:sz w:val="16"/>
+              </w:rPr>
+              <w:t>+0.0065</w:t>
+            </w:r>
+          </w:p>
+        </w:tc>
+      </w:tr>
+      <w:tr>
+        <w:trPr>
+          <w:cantSplit w:val="true"/>
+        </w:trPr>
+        <w:tc>
+          <w:tcPr>
+            <w:tcW w:type="dxa" w:w="1440"/>
+            <w:vAlign w:val="center"/>
+            <w:tcMar>
+              <w:top w:w="90" w:type="dxa"/>
+              <w:start w:w="100" w:type="dxa"/>
+              <w:bottom w:w="90" w:type="dxa"/>
+              <w:end w:w="100" w:type="dxa"/>
+            </w:tcMar>
+            <w:shd w:fill="FFFFFF"/>
+          </w:tcPr>
+          <w:p>
+            <w:pPr>
+              <w:keepNext w:val="0"/>
+              <w:widowControl/>
+              <w:spacing w:before="0" w:after="0" w:line="264" w:lineRule="auto"/>
+              <w:jc w:val="center"/>
+            </w:pPr>
+            <w:r/>
+            <w:r>
+              <w:rPr>
+                <w:rFonts w:ascii="Arial Unicode MS" w:hAnsi="Arial Unicode MS" w:eastAsia="Arial Unicode MS"/>
+                <w:b w:val="0"/>
+                <w:color w:val="000000"/>
+                <w:sz w:val="16"/>
+              </w:rPr>
+              <w:t>2026Q3</w:t>
+            </w:r>
+          </w:p>
+        </w:tc>
+        <w:tc>
+          <w:tcPr>
+            <w:tcW w:type="dxa" w:w="2160"/>
+            <w:vAlign w:val="center"/>
+            <w:tcMar>
+              <w:top w:w="90" w:type="dxa"/>
+              <w:start w:w="100" w:type="dxa"/>
+              <w:bottom w:w="90" w:type="dxa"/>
+              <w:end w:w="100" w:type="dxa"/>
+            </w:tcMar>
+            <w:shd w:fill="FFFFFF"/>
+          </w:tcPr>
+          <w:p>
+            <w:pPr>
+              <w:keepNext w:val="0"/>
+              <w:widowControl/>
+              <w:spacing w:before="0" w:after="0" w:line="264" w:lineRule="auto"/>
+              <w:jc w:val="center"/>
+            </w:pPr>
+            <w:r/>
+            <w:r>
+              <w:rPr>
+                <w:rFonts w:ascii="Arial Unicode MS" w:hAnsi="Arial Unicode MS" w:eastAsia="Arial Unicode MS"/>
+                <w:b w:val="0"/>
+                <w:color w:val="000000"/>
+                <w:sz w:val="16"/>
+              </w:rPr>
+              <w:t>0.5522</w:t>
+            </w:r>
+          </w:p>
+        </w:tc>
+        <w:tc>
+          <w:tcPr>
+            <w:tcW w:type="dxa" w:w="1800"/>
+            <w:vAlign w:val="center"/>
+            <w:tcMar>
+              <w:top w:w="90" w:type="dxa"/>
+              <w:start w:w="100" w:type="dxa"/>
+              <w:bottom w:w="90" w:type="dxa"/>
+              <w:end w:w="100" w:type="dxa"/>
+            </w:tcMar>
+            <w:shd w:fill="FFFFFF"/>
+          </w:tcPr>
+          <w:p>
+            <w:pPr>
+              <w:keepNext w:val="0"/>
+              <w:widowControl/>
+              <w:spacing w:before="0" w:after="0" w:line="264" w:lineRule="auto"/>
+              <w:jc w:val="center"/>
+            </w:pPr>
+            <w:r/>
+            <w:r>
+              <w:rPr>
+                <w:rFonts w:ascii="Arial Unicode MS" w:hAnsi="Arial Unicode MS" w:eastAsia="Arial Unicode MS"/>
+                <w:b w:val="0"/>
+                <w:color w:val="000000"/>
+                <w:sz w:val="16"/>
+              </w:rPr>
+              <w:t>0.5568</w:t>
+            </w:r>
+          </w:p>
+        </w:tc>
+        <w:tc>
+          <w:tcPr>
+            <w:tcW w:type="dxa" w:w="2160"/>
+            <w:vAlign w:val="center"/>
+            <w:tcMar>
+              <w:top w:w="90" w:type="dxa"/>
+              <w:start w:w="100" w:type="dxa"/>
+              <w:bottom w:w="90" w:type="dxa"/>
+              <w:end w:w="100" w:type="dxa"/>
+            </w:tcMar>
+            <w:shd w:fill="FFFFFF"/>
+          </w:tcPr>
+          <w:p>
+            <w:pPr>
+              <w:keepNext w:val="0"/>
+              <w:widowControl/>
+              <w:spacing w:before="0" w:after="0" w:line="264" w:lineRule="auto"/>
+              <w:jc w:val="center"/>
+            </w:pPr>
+            <w:r/>
+            <w:r>
+              <w:rPr>
+                <w:rFonts w:ascii="Arial Unicode MS" w:hAnsi="Arial Unicode MS" w:eastAsia="Arial Unicode MS"/>
+                <w:b w:val="0"/>
+                <w:color w:val="000000"/>
+                <w:sz w:val="16"/>
+              </w:rPr>
+              <w:t>0.5614</w:t>
+            </w:r>
+          </w:p>
+        </w:tc>
+        <w:tc>
+          <w:tcPr>
+            <w:tcW w:type="dxa" w:w="2232"/>
+            <w:vAlign w:val="center"/>
+            <w:tcMar>
+              <w:top w:w="90" w:type="dxa"/>
+              <w:start w:w="100" w:type="dxa"/>
+              <w:bottom w:w="90" w:type="dxa"/>
+              <w:end w:w="100" w:type="dxa"/>
+            </w:tcMar>
+            <w:shd w:fill="FFFFFF"/>
+          </w:tcPr>
+          <w:p>
+            <w:pPr>
+              <w:keepNext w:val="0"/>
+              <w:widowControl/>
+              <w:spacing w:before="0" w:after="0" w:line="264" w:lineRule="auto"/>
+              <w:jc w:val="center"/>
+            </w:pPr>
+            <w:r/>
+            <w:r>
+              <w:rPr>
+                <w:rFonts w:ascii="Arial Unicode MS" w:hAnsi="Arial Unicode MS" w:eastAsia="Arial Unicode MS"/>
+                <w:b w:val="0"/>
+                <w:color w:val="000000"/>
+                <w:sz w:val="16"/>
+              </w:rPr>
+              <w:t>+0.0046</w:t>
+            </w:r>
+          </w:p>
+        </w:tc>
+      </w:tr>
+      <w:tr>
+        <w:trPr>
+          <w:cantSplit w:val="true"/>
+        </w:trPr>
+        <w:tc>
+          <w:tcPr>
+            <w:tcW w:type="dxa" w:w="1440"/>
+            <w:vAlign w:val="center"/>
+            <w:tcMar>
+              <w:top w:w="90" w:type="dxa"/>
+              <w:start w:w="100" w:type="dxa"/>
+              <w:bottom w:w="90" w:type="dxa"/>
+              <w:end w:w="100" w:type="dxa"/>
+            </w:tcMar>
+            <w:shd w:fill="EAF2F8"/>
+          </w:tcPr>
+          <w:p>
+            <w:pPr>
+              <w:keepNext w:val="0"/>
+              <w:widowControl/>
+              <w:spacing w:before="0" w:after="0" w:line="264" w:lineRule="auto"/>
+              <w:jc w:val="center"/>
+            </w:pPr>
+            <w:r/>
+            <w:r>
+              <w:rPr>
+                <w:rFonts w:ascii="Arial Unicode MS" w:hAnsi="Arial Unicode MS" w:eastAsia="Arial Unicode MS"/>
+                <w:b w:val="0"/>
+                <w:color w:val="000000"/>
+                <w:sz w:val="16"/>
+              </w:rPr>
+              <w:t>2026Q4</w:t>
+            </w:r>
+          </w:p>
+        </w:tc>
+        <w:tc>
+          <w:tcPr>
+            <w:tcW w:type="dxa" w:w="2160"/>
+            <w:vAlign w:val="center"/>
+            <w:tcMar>
+              <w:top w:w="90" w:type="dxa"/>
+              <w:start w:w="100" w:type="dxa"/>
+              <w:bottom w:w="90" w:type="dxa"/>
+              <w:end w:w="100" w:type="dxa"/>
+            </w:tcMar>
+            <w:shd w:fill="EAF2F8"/>
+          </w:tcPr>
+          <w:p>
+            <w:pPr>
+              <w:keepNext w:val="0"/>
+              <w:widowControl/>
+              <w:spacing w:before="0" w:after="0" w:line="264" w:lineRule="auto"/>
+              <w:jc w:val="center"/>
+            </w:pPr>
+            <w:r/>
+            <w:r>
+              <w:rPr>
+                <w:rFonts w:ascii="Arial Unicode MS" w:hAnsi="Arial Unicode MS" w:eastAsia="Arial Unicode MS"/>
+                <w:b w:val="0"/>
+                <w:color w:val="000000"/>
+                <w:sz w:val="16"/>
+              </w:rPr>
+              <w:t>0.5546</w:t>
+            </w:r>
+          </w:p>
+        </w:tc>
+        <w:tc>
+          <w:tcPr>
+            <w:tcW w:type="dxa" w:w="1800"/>
+            <w:vAlign w:val="center"/>
+            <w:tcMar>
+              <w:top w:w="90" w:type="dxa"/>
+              <w:start w:w="100" w:type="dxa"/>
+              <w:bottom w:w="90" w:type="dxa"/>
+              <w:end w:w="100" w:type="dxa"/>
+            </w:tcMar>
+            <w:shd w:fill="EAF2F8"/>
+          </w:tcPr>
+          <w:p>
+            <w:pPr>
+              <w:keepNext w:val="0"/>
+              <w:widowControl/>
+              <w:spacing w:before="0" w:after="0" w:line="264" w:lineRule="auto"/>
+              <w:jc w:val="center"/>
+            </w:pPr>
+            <w:r/>
+            <w:r>
+              <w:rPr>
+                <w:rFonts w:ascii="Arial Unicode MS" w:hAnsi="Arial Unicode MS" w:eastAsia="Arial Unicode MS"/>
+                <w:b w:val="0"/>
+                <w:color w:val="000000"/>
+                <w:sz w:val="16"/>
+              </w:rPr>
+              <w:t>0.5579</w:t>
+            </w:r>
+          </w:p>
+        </w:tc>
+        <w:tc>
+          <w:tcPr>
+            <w:tcW w:type="dxa" w:w="2160"/>
+            <w:vAlign w:val="center"/>
+            <w:tcMar>
+              <w:top w:w="90" w:type="dxa"/>
+              <w:start w:w="100" w:type="dxa"/>
+              <w:bottom w:w="90" w:type="dxa"/>
+              <w:end w:w="100" w:type="dxa"/>
+            </w:tcMar>
+            <w:shd w:fill="EAF2F8"/>
+          </w:tcPr>
+          <w:p>
+            <w:pPr>
+              <w:keepNext w:val="0"/>
+              <w:widowControl/>
+              <w:spacing w:before="0" w:after="0" w:line="264" w:lineRule="auto"/>
+              <w:jc w:val="center"/>
+            </w:pPr>
+            <w:r/>
+            <w:r>
+              <w:rPr>
+                <w:rFonts w:ascii="Arial Unicode MS" w:hAnsi="Arial Unicode MS" w:eastAsia="Arial Unicode MS"/>
+                <w:b w:val="0"/>
+                <w:color w:val="000000"/>
+                <w:sz w:val="16"/>
+              </w:rPr>
+              <w:t>0.5612</w:t>
+            </w:r>
+          </w:p>
+        </w:tc>
+        <w:tc>
+          <w:tcPr>
+            <w:tcW w:type="dxa" w:w="2232"/>
+            <w:vAlign w:val="center"/>
+            <w:tcMar>
+              <w:top w:w="90" w:type="dxa"/>
+              <w:start w:w="100" w:type="dxa"/>
+              <w:bottom w:w="90" w:type="dxa"/>
+              <w:end w:w="100" w:type="dxa"/>
+            </w:tcMar>
+            <w:shd w:fill="EAF2F8"/>
+          </w:tcPr>
+          <w:p>
+            <w:pPr>
+              <w:keepNext w:val="0"/>
+              <w:widowControl/>
+              <w:spacing w:before="0" w:after="0" w:line="264" w:lineRule="auto"/>
+              <w:jc w:val="center"/>
+            </w:pPr>
+            <w:r/>
+            <w:r>
+              <w:rPr>
+                <w:rFonts w:ascii="Arial Unicode MS" w:hAnsi="Arial Unicode MS" w:eastAsia="Arial Unicode MS"/>
+                <w:b w:val="0"/>
+                <w:color w:val="000000"/>
+                <w:sz w:val="16"/>
+              </w:rPr>
+              <w:t>+0.0033</w:t>
+            </w:r>
+          </w:p>
+        </w:tc>
+      </w:tr>
+      <w:tr>
+        <w:trPr>
+          <w:cantSplit w:val="true"/>
+        </w:trPr>
+        <w:tc>
+          <w:tcPr>
+            <w:tcW w:type="dxa" w:w="1440"/>
+            <w:vAlign w:val="center"/>
+            <w:tcMar>
+              <w:top w:w="90" w:type="dxa"/>
+              <w:start w:w="100" w:type="dxa"/>
+              <w:bottom w:w="90" w:type="dxa"/>
+              <w:end w:w="100" w:type="dxa"/>
+            </w:tcMar>
+            <w:shd w:fill="FFFFFF"/>
+          </w:tcPr>
+          <w:p>
+            <w:pPr>
+              <w:keepNext w:val="0"/>
+              <w:widowControl/>
+              <w:spacing w:before="0" w:after="0" w:line="264" w:lineRule="auto"/>
+              <w:jc w:val="center"/>
+            </w:pPr>
+            <w:r/>
+            <w:r>
+              <w:rPr>
+                <w:rFonts w:ascii="Arial Unicode MS" w:hAnsi="Arial Unicode MS" w:eastAsia="Arial Unicode MS"/>
+                <w:b w:val="0"/>
+                <w:color w:val="000000"/>
+                <w:sz w:val="16"/>
+              </w:rPr>
+              <w:t>2027Q1</w:t>
+            </w:r>
+          </w:p>
+        </w:tc>
+        <w:tc>
+          <w:tcPr>
+            <w:tcW w:type="dxa" w:w="2160"/>
+            <w:vAlign w:val="center"/>
+            <w:tcMar>
+              <w:top w:w="90" w:type="dxa"/>
+              <w:start w:w="100" w:type="dxa"/>
+              <w:bottom w:w="90" w:type="dxa"/>
+              <w:end w:w="100" w:type="dxa"/>
+            </w:tcMar>
+            <w:shd w:fill="FFFFFF"/>
+          </w:tcPr>
+          <w:p>
+            <w:pPr>
+              <w:keepNext w:val="0"/>
+              <w:widowControl/>
+              <w:spacing w:before="0" w:after="0" w:line="264" w:lineRule="auto"/>
+              <w:jc w:val="center"/>
+            </w:pPr>
+            <w:r/>
+            <w:r>
+              <w:rPr>
+                <w:rFonts w:ascii="Arial Unicode MS" w:hAnsi="Arial Unicode MS" w:eastAsia="Arial Unicode MS"/>
+                <w:b w:val="0"/>
+                <w:color w:val="000000"/>
+                <w:sz w:val="16"/>
+              </w:rPr>
+              <w:t>0.5578</w:t>
+            </w:r>
+          </w:p>
+        </w:tc>
+        <w:tc>
+          <w:tcPr>
+            <w:tcW w:type="dxa" w:w="1800"/>
+            <w:vAlign w:val="center"/>
+            <w:tcMar>
+              <w:top w:w="90" w:type="dxa"/>
+              <w:start w:w="100" w:type="dxa"/>
+              <w:bottom w:w="90" w:type="dxa"/>
+              <w:end w:w="100" w:type="dxa"/>
+            </w:tcMar>
+            <w:shd w:fill="FFFFFF"/>
+          </w:tcPr>
+          <w:p>
+            <w:pPr>
+              <w:keepNext w:val="0"/>
+              <w:widowControl/>
+              <w:spacing w:before="0" w:after="0" w:line="264" w:lineRule="auto"/>
+              <w:jc w:val="center"/>
+            </w:pPr>
+            <w:r/>
+            <w:r>
+              <w:rPr>
+                <w:rFonts w:ascii="Arial Unicode MS" w:hAnsi="Arial Unicode MS" w:eastAsia="Arial Unicode MS"/>
+                <w:b w:val="0"/>
+                <w:color w:val="000000"/>
+                <w:sz w:val="16"/>
+              </w:rPr>
+              <w:t>0.5601</w:t>
+            </w:r>
+          </w:p>
+        </w:tc>
+        <w:tc>
+          <w:tcPr>
+            <w:tcW w:type="dxa" w:w="2160"/>
+            <w:vAlign w:val="center"/>
+            <w:tcMar>
+              <w:top w:w="90" w:type="dxa"/>
+              <w:start w:w="100" w:type="dxa"/>
+              <w:bottom w:w="90" w:type="dxa"/>
+              <w:end w:w="100" w:type="dxa"/>
+            </w:tcMar>
+            <w:shd w:fill="FFFFFF"/>
+          </w:tcPr>
+          <w:p>
+            <w:pPr>
+              <w:keepNext w:val="0"/>
+              <w:widowControl/>
+              <w:spacing w:before="0" w:after="0" w:line="264" w:lineRule="auto"/>
+              <w:jc w:val="center"/>
+            </w:pPr>
+            <w:r/>
+            <w:r>
+              <w:rPr>
+                <w:rFonts w:ascii="Arial Unicode MS" w:hAnsi="Arial Unicode MS" w:eastAsia="Arial Unicode MS"/>
+                <w:b w:val="0"/>
+                <w:color w:val="000000"/>
+                <w:sz w:val="16"/>
+              </w:rPr>
+              <w:t>0.5625</w:t>
+            </w:r>
+          </w:p>
+        </w:tc>
+        <w:tc>
+          <w:tcPr>
+            <w:tcW w:type="dxa" w:w="2232"/>
+            <w:vAlign w:val="center"/>
+            <w:tcMar>
+              <w:top w:w="90" w:type="dxa"/>
+              <w:start w:w="100" w:type="dxa"/>
+              <w:bottom w:w="90" w:type="dxa"/>
+              <w:end w:w="100" w:type="dxa"/>
+            </w:tcMar>
+            <w:shd w:fill="FFFFFF"/>
+          </w:tcPr>
+          <w:p>
+            <w:pPr>
+              <w:keepNext w:val="0"/>
+              <w:widowControl/>
+              <w:spacing w:before="0" w:after="0" w:line="264" w:lineRule="auto"/>
+              <w:jc w:val="center"/>
+            </w:pPr>
+            <w:r/>
+            <w:r>
+              <w:rPr>
+                <w:rFonts w:ascii="Arial Unicode MS" w:hAnsi="Arial Unicode MS" w:eastAsia="Arial Unicode MS"/>
+                <w:b w:val="0"/>
+                <w:color w:val="000000"/>
+                <w:sz w:val="16"/>
+              </w:rPr>
+              <w:t>+0.0024</w:t>
+            </w:r>
+          </w:p>
+        </w:tc>
+      </w:tr>
+      <w:tr>
+        <w:trPr>
+          <w:cantSplit w:val="true"/>
+        </w:trPr>
+        <w:tc>
+          <w:tcPr>
+            <w:tcW w:type="dxa" w:w="1440"/>
+            <w:vAlign w:val="center"/>
+            <w:tcMar>
+              <w:top w:w="90" w:type="dxa"/>
+              <w:start w:w="100" w:type="dxa"/>
+              <w:bottom w:w="90" w:type="dxa"/>
+              <w:end w:w="100" w:type="dxa"/>
+            </w:tcMar>
+            <w:shd w:fill="EAF2F8"/>
+          </w:tcPr>
+          <w:p>
+            <w:pPr>
+              <w:keepNext w:val="0"/>
+              <w:widowControl/>
+              <w:spacing w:before="0" w:after="0" w:line="264" w:lineRule="auto"/>
+              <w:jc w:val="center"/>
+            </w:pPr>
+            <w:r/>
+            <w:r>
+              <w:rPr>
+                <w:rFonts w:ascii="Arial Unicode MS" w:hAnsi="Arial Unicode MS" w:eastAsia="Arial Unicode MS"/>
+                <w:b w:val="0"/>
+                <w:color w:val="000000"/>
+                <w:sz w:val="16"/>
+              </w:rPr>
+              <w:t>2027Q2</w:t>
+            </w:r>
+          </w:p>
+        </w:tc>
+        <w:tc>
+          <w:tcPr>
+            <w:tcW w:type="dxa" w:w="2160"/>
+            <w:vAlign w:val="center"/>
+            <w:tcMar>
+              <w:top w:w="90" w:type="dxa"/>
+              <w:start w:w="100" w:type="dxa"/>
+              <w:bottom w:w="90" w:type="dxa"/>
+              <w:end w:w="100" w:type="dxa"/>
+            </w:tcMar>
+            <w:shd w:fill="EAF2F8"/>
+          </w:tcPr>
+          <w:p>
+            <w:pPr>
+              <w:keepNext w:val="0"/>
+              <w:widowControl/>
+              <w:spacing w:before="0" w:after="0" w:line="264" w:lineRule="auto"/>
+              <w:jc w:val="center"/>
+            </w:pPr>
+            <w:r/>
+            <w:r>
+              <w:rPr>
+                <w:rFonts w:ascii="Arial Unicode MS" w:hAnsi="Arial Unicode MS" w:eastAsia="Arial Unicode MS"/>
+                <w:b w:val="0"/>
+                <w:color w:val="000000"/>
+                <w:sz w:val="16"/>
+              </w:rPr>
+              <w:t>0.5606</w:t>
+            </w:r>
+          </w:p>
+        </w:tc>
+        <w:tc>
+          <w:tcPr>
+            <w:tcW w:type="dxa" w:w="1800"/>
+            <w:vAlign w:val="center"/>
+            <w:tcMar>
+              <w:top w:w="90" w:type="dxa"/>
+              <w:start w:w="100" w:type="dxa"/>
+              <w:bottom w:w="90" w:type="dxa"/>
+              <w:end w:w="100" w:type="dxa"/>
+            </w:tcMar>
+            <w:shd w:fill="EAF2F8"/>
+          </w:tcPr>
+          <w:p>
+            <w:pPr>
+              <w:keepNext w:val="0"/>
+              <w:widowControl/>
+              <w:spacing w:before="0" w:after="0" w:line="264" w:lineRule="auto"/>
+              <w:jc w:val="center"/>
+            </w:pPr>
+            <w:r/>
+            <w:r>
+              <w:rPr>
+                <w:rFonts w:ascii="Arial Unicode MS" w:hAnsi="Arial Unicode MS" w:eastAsia="Arial Unicode MS"/>
+                <w:b w:val="0"/>
+                <w:color w:val="000000"/>
+                <w:sz w:val="16"/>
+              </w:rPr>
+              <w:t>0.5622</w:t>
+            </w:r>
+          </w:p>
+        </w:tc>
+        <w:tc>
+          <w:tcPr>
+            <w:tcW w:type="dxa" w:w="2160"/>
+            <w:vAlign w:val="center"/>
+            <w:tcMar>
+              <w:top w:w="90" w:type="dxa"/>
+              <w:start w:w="100" w:type="dxa"/>
+              <w:bottom w:w="90" w:type="dxa"/>
+              <w:end w:w="100" w:type="dxa"/>
+            </w:tcMar>
+            <w:shd w:fill="EAF2F8"/>
+          </w:tcPr>
+          <w:p>
+            <w:pPr>
+              <w:keepNext w:val="0"/>
+              <w:widowControl/>
+              <w:spacing w:before="0" w:after="0" w:line="264" w:lineRule="auto"/>
+              <w:jc w:val="center"/>
+            </w:pPr>
+            <w:r/>
+            <w:r>
+              <w:rPr>
+                <w:rFonts w:ascii="Arial Unicode MS" w:hAnsi="Arial Unicode MS" w:eastAsia="Arial Unicode MS"/>
+                <w:b w:val="0"/>
+                <w:color w:val="000000"/>
+                <w:sz w:val="16"/>
+              </w:rPr>
+              <w:t>0.5639</w:t>
+            </w:r>
+          </w:p>
+        </w:tc>
+        <w:tc>
+          <w:tcPr>
+            <w:tcW w:type="dxa" w:w="2232"/>
+            <w:vAlign w:val="center"/>
+            <w:tcMar>
+              <w:top w:w="90" w:type="dxa"/>
+              <w:start w:w="100" w:type="dxa"/>
+              <w:bottom w:w="90" w:type="dxa"/>
+              <w:end w:w="100" w:type="dxa"/>
+            </w:tcMar>
+            <w:shd w:fill="EAF2F8"/>
+          </w:tcPr>
+          <w:p>
+            <w:pPr>
+              <w:keepNext w:val="0"/>
+              <w:widowControl/>
+              <w:spacing w:before="0" w:after="0" w:line="264" w:lineRule="auto"/>
+              <w:jc w:val="center"/>
+            </w:pPr>
+            <w:r/>
+            <w:r>
+              <w:rPr>
+                <w:rFonts w:ascii="Arial Unicode MS" w:hAnsi="Arial Unicode MS" w:eastAsia="Arial Unicode MS"/>
+                <w:b w:val="0"/>
+                <w:color w:val="000000"/>
+                <w:sz w:val="16"/>
+              </w:rPr>
+              <w:t>+0.0017</w:t>
+            </w:r>
+          </w:p>
+        </w:tc>
+      </w:tr>
+      <w:tr>
+        <w:trPr>
+          <w:cantSplit w:val="true"/>
+        </w:trPr>
+        <w:tc>
+          <w:tcPr>
+            <w:tcW w:type="dxa" w:w="1440"/>
+            <w:vAlign w:val="center"/>
+            <w:tcMar>
+              <w:top w:w="90" w:type="dxa"/>
+              <w:start w:w="100" w:type="dxa"/>
+              <w:bottom w:w="90" w:type="dxa"/>
+              <w:end w:w="100" w:type="dxa"/>
+            </w:tcMar>
+            <w:shd w:fill="FFFFFF"/>
+          </w:tcPr>
+          <w:p>
+            <w:pPr>
+              <w:keepNext w:val="0"/>
+              <w:widowControl/>
+              <w:spacing w:before="0" w:after="0" w:line="264" w:lineRule="auto"/>
+              <w:jc w:val="center"/>
+            </w:pPr>
+            <w:r/>
+            <w:r>
+              <w:rPr>
+                <w:rFonts w:ascii="Arial Unicode MS" w:hAnsi="Arial Unicode MS" w:eastAsia="Arial Unicode MS"/>
+                <w:b w:val="0"/>
+                <w:color w:val="000000"/>
+                <w:sz w:val="16"/>
+              </w:rPr>
+              <w:t>2027Q3</w:t>
+            </w:r>
+          </w:p>
+        </w:tc>
+        <w:tc>
+          <w:tcPr>
+            <w:tcW w:type="dxa" w:w="2160"/>
+            <w:vAlign w:val="center"/>
+            <w:tcMar>
+              <w:top w:w="90" w:type="dxa"/>
+              <w:start w:w="100" w:type="dxa"/>
+              <w:bottom w:w="90" w:type="dxa"/>
+              <w:end w:w="100" w:type="dxa"/>
+            </w:tcMar>
+            <w:shd w:fill="FFFFFF"/>
+          </w:tcPr>
+          <w:p>
+            <w:pPr>
+              <w:keepNext w:val="0"/>
+              <w:widowControl/>
+              <w:spacing w:before="0" w:after="0" w:line="264" w:lineRule="auto"/>
+              <w:jc w:val="center"/>
+            </w:pPr>
+            <w:r/>
+            <w:r>
+              <w:rPr>
+                <w:rFonts w:ascii="Arial Unicode MS" w:hAnsi="Arial Unicode MS" w:eastAsia="Arial Unicode MS"/>
+                <w:b w:val="0"/>
+                <w:color w:val="000000"/>
+                <w:sz w:val="16"/>
+              </w:rPr>
+              <w:t>0.5619</w:t>
+            </w:r>
+          </w:p>
+        </w:tc>
+        <w:tc>
+          <w:tcPr>
+            <w:tcW w:type="dxa" w:w="1800"/>
+            <w:vAlign w:val="center"/>
+            <w:tcMar>
+              <w:top w:w="90" w:type="dxa"/>
+              <w:start w:w="100" w:type="dxa"/>
+              <w:bottom w:w="90" w:type="dxa"/>
+              <w:end w:w="100" w:type="dxa"/>
+            </w:tcMar>
+            <w:shd w:fill="FFFFFF"/>
+          </w:tcPr>
+          <w:p>
+            <w:pPr>
+              <w:keepNext w:val="0"/>
+              <w:widowControl/>
+              <w:spacing w:before="0" w:after="0" w:line="264" w:lineRule="auto"/>
+              <w:jc w:val="center"/>
+            </w:pPr>
+            <w:r/>
+            <w:r>
+              <w:rPr>
+                <w:rFonts w:ascii="Arial Unicode MS" w:hAnsi="Arial Unicode MS" w:eastAsia="Arial Unicode MS"/>
+                <w:b w:val="0"/>
+                <w:color w:val="000000"/>
+                <w:sz w:val="16"/>
+              </w:rPr>
+              <w:t>0.5631</w:t>
+            </w:r>
+          </w:p>
+        </w:tc>
+        <w:tc>
+          <w:tcPr>
+            <w:tcW w:type="dxa" w:w="2160"/>
+            <w:vAlign w:val="center"/>
+            <w:tcMar>
+              <w:top w:w="90" w:type="dxa"/>
+              <w:start w:w="100" w:type="dxa"/>
+              <w:bottom w:w="90" w:type="dxa"/>
+              <w:end w:w="100" w:type="dxa"/>
+            </w:tcMar>
+            <w:shd w:fill="FFFFFF"/>
+          </w:tcPr>
+          <w:p>
+            <w:pPr>
+              <w:keepNext w:val="0"/>
+              <w:widowControl/>
+              <w:spacing w:before="0" w:after="0" w:line="264" w:lineRule="auto"/>
+              <w:jc w:val="center"/>
+            </w:pPr>
+            <w:r/>
+            <w:r>
+              <w:rPr>
+                <w:rFonts w:ascii="Arial Unicode MS" w:hAnsi="Arial Unicode MS" w:eastAsia="Arial Unicode MS"/>
+                <w:b w:val="0"/>
+                <w:color w:val="000000"/>
+                <w:sz w:val="16"/>
+              </w:rPr>
+              <w:t>0.5643</w:t>
+            </w:r>
+          </w:p>
+        </w:tc>
+        <w:tc>
+          <w:tcPr>
+            <w:tcW w:type="dxa" w:w="2232"/>
+            <w:vAlign w:val="center"/>
+            <w:tcMar>
+              <w:top w:w="90" w:type="dxa"/>
+              <w:start w:w="100" w:type="dxa"/>
+              <w:bottom w:w="90" w:type="dxa"/>
+              <w:end w:w="100" w:type="dxa"/>
+            </w:tcMar>
+            <w:shd w:fill="FFFFFF"/>
+          </w:tcPr>
+          <w:p>
+            <w:pPr>
+              <w:keepNext w:val="0"/>
+              <w:widowControl/>
+              <w:spacing w:before="0" w:after="0" w:line="264" w:lineRule="auto"/>
+              <w:jc w:val="center"/>
+            </w:pPr>
+            <w:r/>
+            <w:r>
+              <w:rPr>
+                <w:rFonts w:ascii="Arial Unicode MS" w:hAnsi="Arial Unicode MS" w:eastAsia="Arial Unicode MS"/>
+                <w:b w:val="0"/>
+                <w:color w:val="000000"/>
+                <w:sz w:val="16"/>
+              </w:rPr>
+              <w:t>+0.0012</w:t>
+            </w:r>
+          </w:p>
+        </w:tc>
+      </w:tr>
+      <w:tr>
+        <w:trPr>
+          <w:cantSplit w:val="true"/>
+        </w:trPr>
+        <w:tc>
+          <w:tcPr>
+            <w:tcW w:type="dxa" w:w="1440"/>
+            <w:vAlign w:val="center"/>
+            <w:tcMar>
+              <w:top w:w="90" w:type="dxa"/>
+              <w:start w:w="100" w:type="dxa"/>
+              <w:bottom w:w="90" w:type="dxa"/>
+              <w:end w:w="100" w:type="dxa"/>
+            </w:tcMar>
+            <w:shd w:fill="EAF2F8"/>
+          </w:tcPr>
+          <w:p>
+            <w:pPr>
+              <w:keepNext w:val="0"/>
+              <w:widowControl/>
+              <w:spacing w:before="0" w:after="0" w:line="264" w:lineRule="auto"/>
+              <w:jc w:val="center"/>
+            </w:pPr>
+            <w:r/>
+            <w:r>
+              <w:rPr>
+                <w:rFonts w:ascii="Arial Unicode MS" w:hAnsi="Arial Unicode MS" w:eastAsia="Arial Unicode MS"/>
+                <w:b w:val="0"/>
+                <w:color w:val="000000"/>
+                <w:sz w:val="16"/>
+              </w:rPr>
+              <w:t>2027Q4</w:t>
+            </w:r>
+          </w:p>
+        </w:tc>
+        <w:tc>
+          <w:tcPr>
+            <w:tcW w:type="dxa" w:w="2160"/>
+            <w:vAlign w:val="center"/>
+            <w:tcMar>
+              <w:top w:w="90" w:type="dxa"/>
+              <w:start w:w="100" w:type="dxa"/>
+              <w:bottom w:w="90" w:type="dxa"/>
+              <w:end w:w="100" w:type="dxa"/>
+            </w:tcMar>
+            <w:shd w:fill="EAF2F8"/>
+          </w:tcPr>
+          <w:p>
+            <w:pPr>
+              <w:keepNext w:val="0"/>
+              <w:widowControl/>
+              <w:spacing w:before="0" w:after="0" w:line="264" w:lineRule="auto"/>
+              <w:jc w:val="center"/>
+            </w:pPr>
+            <w:r/>
+            <w:r>
+              <w:rPr>
+                <w:rFonts w:ascii="Arial Unicode MS" w:hAnsi="Arial Unicode MS" w:eastAsia="Arial Unicode MS"/>
+                <w:b w:val="0"/>
+                <w:color w:val="000000"/>
+                <w:sz w:val="16"/>
+              </w:rPr>
+              <w:t>0.5627</w:t>
+            </w:r>
+          </w:p>
+        </w:tc>
+        <w:tc>
+          <w:tcPr>
+            <w:tcW w:type="dxa" w:w="1800"/>
+            <w:vAlign w:val="center"/>
+            <w:tcMar>
+              <w:top w:w="90" w:type="dxa"/>
+              <w:start w:w="100" w:type="dxa"/>
+              <w:bottom w:w="90" w:type="dxa"/>
+              <w:end w:w="100" w:type="dxa"/>
+            </w:tcMar>
+            <w:shd w:fill="EAF2F8"/>
+          </w:tcPr>
+          <w:p>
+            <w:pPr>
+              <w:keepNext w:val="0"/>
+              <w:widowControl/>
+              <w:spacing w:before="0" w:after="0" w:line="264" w:lineRule="auto"/>
+              <w:jc w:val="center"/>
+            </w:pPr>
+            <w:r/>
+            <w:r>
+              <w:rPr>
+                <w:rFonts w:ascii="Arial Unicode MS" w:hAnsi="Arial Unicode MS" w:eastAsia="Arial Unicode MS"/>
+                <w:b w:val="0"/>
+                <w:color w:val="000000"/>
+                <w:sz w:val="16"/>
+              </w:rPr>
+              <w:t>0.5635</w:t>
+            </w:r>
+          </w:p>
+        </w:tc>
+        <w:tc>
+          <w:tcPr>
+            <w:tcW w:type="dxa" w:w="2160"/>
+            <w:vAlign w:val="center"/>
+            <w:tcMar>
+              <w:top w:w="90" w:type="dxa"/>
+              <w:start w:w="100" w:type="dxa"/>
+              <w:bottom w:w="90" w:type="dxa"/>
+              <w:end w:w="100" w:type="dxa"/>
+            </w:tcMar>
+            <w:shd w:fill="EAF2F8"/>
+          </w:tcPr>
+          <w:p>
+            <w:pPr>
+              <w:keepNext w:val="0"/>
+              <w:widowControl/>
+              <w:spacing w:before="0" w:after="0" w:line="264" w:lineRule="auto"/>
+              <w:jc w:val="center"/>
+            </w:pPr>
+            <w:r/>
+            <w:r>
+              <w:rPr>
+                <w:rFonts w:ascii="Arial Unicode MS" w:hAnsi="Arial Unicode MS" w:eastAsia="Arial Unicode MS"/>
+                <w:b w:val="0"/>
+                <w:color w:val="000000"/>
+                <w:sz w:val="16"/>
+              </w:rPr>
+              <w:t>0.5644</w:t>
+            </w:r>
+          </w:p>
+        </w:tc>
+        <w:tc>
+          <w:tcPr>
+            <w:tcW w:type="dxa" w:w="2232"/>
+            <w:vAlign w:val="center"/>
+            <w:tcMar>
+              <w:top w:w="90" w:type="dxa"/>
+              <w:start w:w="100" w:type="dxa"/>
+              <w:bottom w:w="90" w:type="dxa"/>
+              <w:end w:w="100" w:type="dxa"/>
+            </w:tcMar>
+            <w:shd w:fill="EAF2F8"/>
+          </w:tcPr>
+          <w:p>
+            <w:pPr>
+              <w:keepNext w:val="0"/>
+              <w:widowControl/>
+              <w:spacing w:before="0" w:after="0" w:line="264" w:lineRule="auto"/>
+              <w:jc w:val="center"/>
+            </w:pPr>
+            <w:r/>
+            <w:r>
+              <w:rPr>
+                <w:rFonts w:ascii="Arial Unicode MS" w:hAnsi="Arial Unicode MS" w:eastAsia="Arial Unicode MS"/>
+                <w:b w:val="0"/>
+                <w:color w:val="000000"/>
+                <w:sz w:val="16"/>
+              </w:rPr>
+              <w:t>+0.0009</w:t>
+            </w:r>
+          </w:p>
+        </w:tc>
+      </w:tr>
+      <w:tr>
+        <w:trPr>
+          <w:cantSplit w:val="true"/>
+        </w:trPr>
+        <w:tc>
+          <w:tcPr>
+            <w:tcW w:type="dxa" w:w="1440"/>
+            <w:vAlign w:val="center"/>
+            <w:tcMar>
+              <w:top w:w="90" w:type="dxa"/>
+              <w:start w:w="100" w:type="dxa"/>
+              <w:bottom w:w="90" w:type="dxa"/>
+              <w:end w:w="100" w:type="dxa"/>
+            </w:tcMar>
+            <w:shd w:fill="FFFFFF"/>
+          </w:tcPr>
+          <w:p>
+            <w:pPr>
+              <w:keepNext w:val="0"/>
+              <w:widowControl/>
+              <w:spacing w:before="0" w:after="0" w:line="264" w:lineRule="auto"/>
+              <w:jc w:val="center"/>
+            </w:pPr>
+            <w:r/>
+            <w:r>
+              <w:rPr>
+                <w:rFonts w:ascii="Arial Unicode MS" w:hAnsi="Arial Unicode MS" w:eastAsia="Arial Unicode MS"/>
+                <w:b w:val="0"/>
+                <w:color w:val="000000"/>
+                <w:sz w:val="16"/>
+              </w:rPr>
+              <w:t>2028Q1</w:t>
+            </w:r>
+          </w:p>
+        </w:tc>
+        <w:tc>
+          <w:tcPr>
+            <w:tcW w:type="dxa" w:w="2160"/>
+            <w:vAlign w:val="center"/>
+            <w:tcMar>
+              <w:top w:w="90" w:type="dxa"/>
+              <w:start w:w="100" w:type="dxa"/>
+              <w:bottom w:w="90" w:type="dxa"/>
+              <w:end w:w="100" w:type="dxa"/>
+            </w:tcMar>
+            <w:shd w:fill="FFFFFF"/>
+          </w:tcPr>
+          <w:p>
+            <w:pPr>
+              <w:keepNext w:val="0"/>
+              <w:widowControl/>
+              <w:spacing w:before="0" w:after="0" w:line="264" w:lineRule="auto"/>
+              <w:jc w:val="center"/>
+            </w:pPr>
+            <w:r/>
+            <w:r>
+              <w:rPr>
+                <w:rFonts w:ascii="Arial Unicode MS" w:hAnsi="Arial Unicode MS" w:eastAsia="Arial Unicode MS"/>
+                <w:b w:val="0"/>
+                <w:color w:val="000000"/>
+                <w:sz w:val="16"/>
+              </w:rPr>
+              <w:t>0.5627</w:t>
+            </w:r>
+          </w:p>
+        </w:tc>
+        <w:tc>
+          <w:tcPr>
+            <w:tcW w:type="dxa" w:w="1800"/>
+            <w:vAlign w:val="center"/>
+            <w:tcMar>
+              <w:top w:w="90" w:type="dxa"/>
+              <w:start w:w="100" w:type="dxa"/>
+              <w:bottom w:w="90" w:type="dxa"/>
+              <w:end w:w="100" w:type="dxa"/>
+            </w:tcMar>
+            <w:shd w:fill="FFFFFF"/>
+          </w:tcPr>
+          <w:p>
+            <w:pPr>
+              <w:keepNext w:val="0"/>
+              <w:widowControl/>
+              <w:spacing w:before="0" w:after="0" w:line="264" w:lineRule="auto"/>
+              <w:jc w:val="center"/>
+            </w:pPr>
+            <w:r/>
+            <w:r>
+              <w:rPr>
+                <w:rFonts w:ascii="Arial Unicode MS" w:hAnsi="Arial Unicode MS" w:eastAsia="Arial Unicode MS"/>
+                <w:b w:val="0"/>
+                <w:color w:val="000000"/>
+                <w:sz w:val="16"/>
+              </w:rPr>
+              <w:t>0.5633</w:t>
+            </w:r>
+          </w:p>
+        </w:tc>
+        <w:tc>
+          <w:tcPr>
+            <w:tcW w:type="dxa" w:w="2160"/>
+            <w:vAlign w:val="center"/>
+            <w:tcMar>
+              <w:top w:w="90" w:type="dxa"/>
+              <w:start w:w="100" w:type="dxa"/>
+              <w:bottom w:w="90" w:type="dxa"/>
+              <w:end w:w="100" w:type="dxa"/>
+            </w:tcMar>
+            <w:shd w:fill="FFFFFF"/>
+          </w:tcPr>
+          <w:p>
+            <w:pPr>
+              <w:keepNext w:val="0"/>
+              <w:widowControl/>
+              <w:spacing w:before="0" w:after="0" w:line="264" w:lineRule="auto"/>
+              <w:jc w:val="center"/>
+            </w:pPr>
+            <w:r/>
+            <w:r>
+              <w:rPr>
+                <w:rFonts w:ascii="Arial Unicode MS" w:hAnsi="Arial Unicode MS" w:eastAsia="Arial Unicode MS"/>
+                <w:b w:val="0"/>
+                <w:color w:val="000000"/>
+                <w:sz w:val="16"/>
+              </w:rPr>
+              <w:t>0.5640</w:t>
+            </w:r>
+          </w:p>
+        </w:tc>
+        <w:tc>
+          <w:tcPr>
+            <w:tcW w:type="dxa" w:w="2232"/>
+            <w:vAlign w:val="center"/>
+            <w:tcMar>
+              <w:top w:w="90" w:type="dxa"/>
+              <w:start w:w="100" w:type="dxa"/>
+              <w:bottom w:w="90" w:type="dxa"/>
+              <w:end w:w="100" w:type="dxa"/>
+            </w:tcMar>
+            <w:shd w:fill="FFFFFF"/>
+          </w:tcPr>
+          <w:p>
+            <w:pPr>
+              <w:keepNext w:val="0"/>
+              <w:widowControl/>
+              <w:spacing w:before="0" w:after="0" w:line="264" w:lineRule="auto"/>
+              <w:jc w:val="center"/>
+            </w:pPr>
+            <w:r/>
+            <w:r>
+              <w:rPr>
+                <w:rFonts w:ascii="Arial Unicode MS" w:hAnsi="Arial Unicode MS" w:eastAsia="Arial Unicode MS"/>
+                <w:b w:val="0"/>
+                <w:color w:val="000000"/>
+                <w:sz w:val="16"/>
+              </w:rPr>
+              <w:t>+0.0006</w:t>
+            </w:r>
+          </w:p>
+        </w:tc>
+      </w:tr>
+    </w:tbl>
+    <w:p>
+      <w:pPr>
+        <w:keepNext w:val="0"/>
+        <w:widowControl/>
+        <w:spacing w:before="0" w:after="60" w:line="240" w:lineRule="auto"/>
+      </w:pPr>
+    </w:p>
+    <w:p>
+      <w:pPr>
+        <w:keepNext w:val="0"/>
+        <w:widowControl/>
+        <w:spacing w:before="0" w:after="100" w:line="300" w:lineRule="auto"/>
+      </w:pPr>
+      <w:r>
+        <w:rPr>
+          <w:rFonts w:ascii="Arial Unicode MS" w:hAnsi="Arial Unicode MS" w:eastAsia="Arial Unicode MS"/>
+          <w:color w:val="000000"/>
+          <w:sz w:val="21"/>
+        </w:rPr>
+        <w:t>The largest effect occurs in 2026Q2. ER is 0.5485 under the lower path, 0.5550 under Baseline, and 0.5615 under the upper path, a symmetric change of 0.0065 around Baseline. By 2028Q1, the effect has declined to about 0.0006 in either direction. The nine quarter average ER forecasts are 0.5571, 0.5594, and 0.5618, respectively. Because the model is linear, the same parallel shifts around S4 would produce the same quarter by quarter deviations from the S4 center forecast.</w:t>
       </w:r>
     </w:p>
     <w:p>

</xml_diff>